<commit_message>
POP: esquemas de referencia na etapa 9 (quatro vistas e montagem do local)
- Figura 1: anterior, posterior, lateral direita e lateral esquerda, com linha de prumo e pontos de referencia
- Figura 2: camera no tripe na altura do quadril, marcas de fita no chao, mesma distancia em todas as sessoes
- Esquemas desenhados, sem fotos de pessoas; podem ser trocados por fotos de referencia da clinica
- POP continua v1.0, agora com 9 paginas

Co-Authored-By: Claude Sonnet 5.5 <noreply@anthropic.com>
</commit_message>
<xml_diff>
--- a/POP-Uso-da-Avaliacao-Integrada.docx
+++ b/POP-Uso-da-Avaliacao-Integrada.docx
@@ -3045,6 +3045,152 @@
           <w:szCs w:val="22"/>
         </w:rPr>
         <w:t xml:space="preserve">Nas reavaliações use exatamente a mesma distância, altura da câmera e posição: sem isso a comparação não vale.</w:t>
+      </w:r>
+    </w:p>
+    <w:p>
+      <w:pPr>
+        <w:pStyle w:val="Heading2"/>
+        <w:keepNext/>
+        <w:spacing w:after="80" w:before="200"/>
+      </w:pPr>
+      <w:r>
+        <w:rPr>
+          <w:rFonts w:ascii="Calibri" w:cs="Calibri" w:eastAsia="Calibri" w:hAnsi="Calibri"/>
+          <w:b/>
+          <w:bCs/>
+          <w:color w:val="1F2937"/>
+          <w:sz w:val="24"/>
+          <w:szCs w:val="24"/>
+        </w:rPr>
+        <w:t xml:space="preserve">Fotos de referência (esquemas)</w:t>
+      </w:r>
+    </w:p>
+    <w:p>
+      <w:pPr>
+        <w:keepNext/>
+        <w:spacing w:after="40" w:before="120"/>
+        <w:jc w:val="center"/>
+      </w:pPr>
+      <w:r>
+        <w:drawing>
+          <wp:inline distT="0" distB="0" distL="0" distR="0">
+            <wp:extent cx="6096000" cy="2847975"/>
+            <wp:effectExtent t="0" r="0" b="0" l="0"/>
+            <wp:docPr id="2" name="vistas.png" descr="Esquema das quatro vistas" title="Esquema das quatro vistas"/>
+            <wp:cNvGraphicFramePr>
+              <a:graphicFrameLocks xmlns:a="http://schemas.openxmlformats.org/drawingml/2006/main" noChangeAspect="1"/>
+            </wp:cNvGraphicFramePr>
+            <a:graphic xmlns:a="http://schemas.openxmlformats.org/drawingml/2006/main">
+              <a:graphicData uri="http://schemas.openxmlformats.org/drawingml/2006/picture">
+                <pic:pic xmlns:pic="http://schemas.openxmlformats.org/drawingml/2006/picture">
+                  <pic:nvPicPr>
+                    <pic:cNvPr id="0" name="" descr=""/>
+                    <pic:cNvPicPr>
+                      <a:picLocks noChangeAspect="1" noChangeArrowheads="1"/>
+                    </pic:cNvPicPr>
+                  </pic:nvPicPr>
+                  <pic:blipFill>
+                    <a:blip r:embed="rId12" cstate="none"/>
+                    <a:srcRect/>
+                    <a:stretch>
+                      <a:fillRect/>
+                    </a:stretch>
+                  </pic:blipFill>
+                  <pic:spPr bwMode="auto">
+                    <a:xfrm>
+                      <a:off x="0" y="0"/>
+                      <a:ext cx="6096000" cy="2847975"/>
+                    </a:xfrm>
+                    <a:prstGeom prst="rect">
+                      <a:avLst/>
+                    </a:prstGeom>
+                  </pic:spPr>
+                </pic:pic>
+              </a:graphicData>
+            </a:graphic>
+          </wp:inline>
+        </w:drawing>
+      </w:r>
+    </w:p>
+    <w:p>
+      <w:pPr>
+        <w:spacing w:after="160"/>
+        <w:jc w:val="center"/>
+      </w:pPr>
+      <w:r>
+        <w:rPr>
+          <w:rFonts w:ascii="Calibri" w:cs="Calibri" w:eastAsia="Calibri" w:hAnsi="Calibri"/>
+          <w:i/>
+          <w:iCs/>
+          <w:color w:val="5B6472"/>
+          <w:sz w:val="18"/>
+          <w:szCs w:val="18"/>
+        </w:rPr>
+        <w:t xml:space="preserve">Figura 1 - As quatro vistas padronizadas: anterior, posterior, lateral direita e lateral esquerda. Esquema ilustrativo.</w:t>
+      </w:r>
+    </w:p>
+    <w:p>
+      <w:pPr>
+        <w:keepNext/>
+        <w:spacing w:after="40" w:before="120"/>
+        <w:jc w:val="center"/>
+      </w:pPr>
+      <w:r>
+        <w:drawing>
+          <wp:inline distT="0" distB="0" distL="0" distR="0">
+            <wp:extent cx="6096000" cy="2571750"/>
+            <wp:effectExtent t="0" r="0" b="0" l="0"/>
+            <wp:docPr id="3" name="montagem.png" descr="Montagem do local para as fotos" title="Montagem do local para as fotos"/>
+            <wp:cNvGraphicFramePr>
+              <a:graphicFrameLocks xmlns:a="http://schemas.openxmlformats.org/drawingml/2006/main" noChangeAspect="1"/>
+            </wp:cNvGraphicFramePr>
+            <a:graphic xmlns:a="http://schemas.openxmlformats.org/drawingml/2006/main">
+              <a:graphicData uri="http://schemas.openxmlformats.org/drawingml/2006/picture">
+                <pic:pic xmlns:pic="http://schemas.openxmlformats.org/drawingml/2006/picture">
+                  <pic:nvPicPr>
+                    <pic:cNvPr id="0" name="" descr=""/>
+                    <pic:cNvPicPr>
+                      <a:picLocks noChangeAspect="1" noChangeArrowheads="1"/>
+                    </pic:cNvPicPr>
+                  </pic:nvPicPr>
+                  <pic:blipFill>
+                    <a:blip r:embed="rId13" cstate="none"/>
+                    <a:srcRect/>
+                    <a:stretch>
+                      <a:fillRect/>
+                    </a:stretch>
+                  </pic:blipFill>
+                  <pic:spPr bwMode="auto">
+                    <a:xfrm>
+                      <a:off x="0" y="0"/>
+                      <a:ext cx="6096000" cy="2571750"/>
+                    </a:xfrm>
+                    <a:prstGeom prst="rect">
+                      <a:avLst/>
+                    </a:prstGeom>
+                  </pic:spPr>
+                </pic:pic>
+              </a:graphicData>
+            </a:graphic>
+          </wp:inline>
+        </w:drawing>
+      </w:r>
+    </w:p>
+    <w:p>
+      <w:pPr>
+        <w:spacing w:after="160"/>
+        <w:jc w:val="center"/>
+      </w:pPr>
+      <w:r>
+        <w:rPr>
+          <w:rFonts w:ascii="Calibri" w:cs="Calibri" w:eastAsia="Calibri" w:hAnsi="Calibri"/>
+          <w:i/>
+          <w:iCs/>
+          <w:color w:val="5B6472"/>
+          <w:sz w:val="18"/>
+          <w:szCs w:val="18"/>
+        </w:rPr>
+        <w:t xml:space="preserve">Figura 2 - Montagem do local, vista de lado: câmera no tripé na altura do quadril, marca no chão para o paciente e para o tripé, mesma distância em todas as sessões.</w:t>
       </w:r>
     </w:p>
     <w:p>

</xml_diff>

<commit_message>
Guia de filmagem dos movimentos (agachamento, elevacao dos bracos, extensao e inclinacao lateral) no POP e em imagem
- Desenhos de inicio e ponto maximo, de lado e de frente ou de costas, com a posicao da camera, para os videos que faltam na P2
- POP etapa 9 ganha as figuras 3 a 6; arquivo Guia-de-filmagem-dos-movimentos.png na raiz; POP com 10 paginas

Co-Authored-By: Claude Sonnet 5.5 <noreply@anthropic.com>
</commit_message>
<xml_diff>
--- a/POP-Uso-da-Avaliacao-Integrada.docx
+++ b/POP-Uso-da-Avaliacao-Integrada.docx
@@ -3191,6 +3191,295 @@
           <w:szCs w:val="18"/>
         </w:rPr>
         <w:t xml:space="preserve">Figura 2 - Montagem do local, vista de lado: câmera no tripé na altura do quadril, marca no chão para o paciente e para o tripé, mesma distância em todas as sessões.</w:t>
+      </w:r>
+    </w:p>
+    <w:p>
+      <w:pPr>
+        <w:pStyle w:val="Heading2"/>
+        <w:keepNext/>
+        <w:spacing w:after="80" w:before="200"/>
+      </w:pPr>
+      <w:r>
+        <w:rPr>
+          <w:rFonts w:ascii="Calibri" w:cs="Calibri" w:eastAsia="Calibri" w:hAnsi="Calibri"/>
+          <w:b/>
+          <w:bCs/>
+          <w:color w:val="1F2937"/>
+          <w:sz w:val="24"/>
+          <w:szCs w:val="24"/>
+        </w:rPr>
+        <w:t xml:space="preserve">Como filmar os movimentos (esquemas)</w:t>
+      </w:r>
+    </w:p>
+    <w:p>
+      <w:pPr>
+        <w:keepNext/>
+        <w:spacing w:after="80"/>
+      </w:pPr>
+      <w:r>
+        <w:rPr>
+          <w:rFonts w:ascii="Calibri" w:cs="Calibri" w:eastAsia="Calibri" w:hAnsi="Calibri"/>
+          <w:color w:val="1F2937"/>
+          <w:sz w:val="20"/>
+          <w:szCs w:val="20"/>
+        </w:rPr>
+        <w:t xml:space="preserve">Vídeo de 5 a 30 segundos com o movimento inteiro: posição inicial, ponto máximo e retorno. Filme de lado e de frente (ou de costas, na elevação dos braços), com a câmera parada e o paciente dos pés à cabeça no quadro. Peça para ir só até onde conseguir manter o controle e sem dor.</w:t>
+      </w:r>
+    </w:p>
+    <w:p>
+      <w:pPr>
+        <w:keepNext/>
+        <w:spacing w:after="40" w:before="120"/>
+        <w:jc w:val="center"/>
+      </w:pPr>
+      <w:r>
+        <w:drawing>
+          <wp:inline distT="0" distB="0" distL="0" distR="0">
+            <wp:extent cx="5715000" cy="2286000"/>
+            <wp:effectExtent t="0" r="0" b="0" l="0"/>
+            <wp:docPr id="4" name="mov1.png" descr="Agachamento" title="Agachamento"/>
+            <wp:cNvGraphicFramePr>
+              <a:graphicFrameLocks xmlns:a="http://schemas.openxmlformats.org/drawingml/2006/main" noChangeAspect="1"/>
+            </wp:cNvGraphicFramePr>
+            <a:graphic xmlns:a="http://schemas.openxmlformats.org/drawingml/2006/main">
+              <a:graphicData uri="http://schemas.openxmlformats.org/drawingml/2006/picture">
+                <pic:pic xmlns:pic="http://schemas.openxmlformats.org/drawingml/2006/picture">
+                  <pic:nvPicPr>
+                    <pic:cNvPr id="0" name="" descr=""/>
+                    <pic:cNvPicPr>
+                      <a:picLocks noChangeAspect="1" noChangeArrowheads="1"/>
+                    </pic:cNvPicPr>
+                  </pic:nvPicPr>
+                  <pic:blipFill>
+                    <a:blip r:embed="rId14" cstate="none"/>
+                    <a:srcRect/>
+                    <a:stretch>
+                      <a:fillRect/>
+                    </a:stretch>
+                  </pic:blipFill>
+                  <pic:spPr bwMode="auto">
+                    <a:xfrm>
+                      <a:off x="0" y="0"/>
+                      <a:ext cx="5715000" cy="2286000"/>
+                    </a:xfrm>
+                    <a:prstGeom prst="rect">
+                      <a:avLst/>
+                    </a:prstGeom>
+                  </pic:spPr>
+                </pic:pic>
+              </a:graphicData>
+            </a:graphic>
+          </wp:inline>
+        </w:drawing>
+      </w:r>
+    </w:p>
+    <w:p>
+      <w:pPr>
+        <w:spacing w:after="160"/>
+        <w:jc w:val="center"/>
+      </w:pPr>
+      <w:r>
+        <w:rPr>
+          <w:rFonts w:ascii="Calibri" w:cs="Calibri" w:eastAsia="Calibri" w:hAnsi="Calibri"/>
+          <w:i/>
+          <w:iCs/>
+          <w:color w:val="5B6472"/>
+          <w:sz w:val="18"/>
+          <w:szCs w:val="18"/>
+        </w:rPr>
+        <w:t xml:space="preserve">Figura 3 - Agachamento: início e ponto máximo, de lado e de frente. Esquema ilustrativo.</w:t>
+      </w:r>
+    </w:p>
+    <w:p>
+      <w:pPr>
+        <w:keepNext/>
+        <w:spacing w:after="40" w:before="120"/>
+        <w:jc w:val="center"/>
+      </w:pPr>
+      <w:r>
+        <w:drawing>
+          <wp:inline distT="0" distB="0" distL="0" distR="0">
+            <wp:extent cx="5715000" cy="2286000"/>
+            <wp:effectExtent t="0" r="0" b="0" l="0"/>
+            <wp:docPr id="5" name="mov2.png" descr="Elevação dos braços" title="Elevação dos braços"/>
+            <wp:cNvGraphicFramePr>
+              <a:graphicFrameLocks xmlns:a="http://schemas.openxmlformats.org/drawingml/2006/main" noChangeAspect="1"/>
+            </wp:cNvGraphicFramePr>
+            <a:graphic xmlns:a="http://schemas.openxmlformats.org/drawingml/2006/main">
+              <a:graphicData uri="http://schemas.openxmlformats.org/drawingml/2006/picture">
+                <pic:pic xmlns:pic="http://schemas.openxmlformats.org/drawingml/2006/picture">
+                  <pic:nvPicPr>
+                    <pic:cNvPr id="0" name="" descr=""/>
+                    <pic:cNvPicPr>
+                      <a:picLocks noChangeAspect="1" noChangeArrowheads="1"/>
+                    </pic:cNvPicPr>
+                  </pic:nvPicPr>
+                  <pic:blipFill>
+                    <a:blip r:embed="rId15" cstate="none"/>
+                    <a:srcRect/>
+                    <a:stretch>
+                      <a:fillRect/>
+                    </a:stretch>
+                  </pic:blipFill>
+                  <pic:spPr bwMode="auto">
+                    <a:xfrm>
+                      <a:off x="0" y="0"/>
+                      <a:ext cx="5715000" cy="2286000"/>
+                    </a:xfrm>
+                    <a:prstGeom prst="rect">
+                      <a:avLst/>
+                    </a:prstGeom>
+                  </pic:spPr>
+                </pic:pic>
+              </a:graphicData>
+            </a:graphic>
+          </wp:inline>
+        </w:drawing>
+      </w:r>
+    </w:p>
+    <w:p>
+      <w:pPr>
+        <w:spacing w:after="160"/>
+        <w:jc w:val="center"/>
+      </w:pPr>
+      <w:r>
+        <w:rPr>
+          <w:rFonts w:ascii="Calibri" w:cs="Calibri" w:eastAsia="Calibri" w:hAnsi="Calibri"/>
+          <w:i/>
+          <w:iCs/>
+          <w:color w:val="5B6472"/>
+          <w:sz w:val="18"/>
+          <w:szCs w:val="18"/>
+        </w:rPr>
+        <w:t xml:space="preserve">Figura 4 - Elevação dos braços: início e ponto máximo, de lado e de frente. Esquema ilustrativo.</w:t>
+      </w:r>
+    </w:p>
+    <w:p>
+      <w:pPr>
+        <w:keepNext/>
+        <w:spacing w:after="40" w:before="120"/>
+        <w:jc w:val="center"/>
+      </w:pPr>
+      <w:r>
+        <w:drawing>
+          <wp:inline distT="0" distB="0" distL="0" distR="0">
+            <wp:extent cx="5715000" cy="2286000"/>
+            <wp:effectExtent t="0" r="0" b="0" l="0"/>
+            <wp:docPr id="6" name="mov3.png" descr="Extensão de tronco" title="Extensão de tronco"/>
+            <wp:cNvGraphicFramePr>
+              <a:graphicFrameLocks xmlns:a="http://schemas.openxmlformats.org/drawingml/2006/main" noChangeAspect="1"/>
+            </wp:cNvGraphicFramePr>
+            <a:graphic xmlns:a="http://schemas.openxmlformats.org/drawingml/2006/main">
+              <a:graphicData uri="http://schemas.openxmlformats.org/drawingml/2006/picture">
+                <pic:pic xmlns:pic="http://schemas.openxmlformats.org/drawingml/2006/picture">
+                  <pic:nvPicPr>
+                    <pic:cNvPr id="0" name="" descr=""/>
+                    <pic:cNvPicPr>
+                      <a:picLocks noChangeAspect="1" noChangeArrowheads="1"/>
+                    </pic:cNvPicPr>
+                  </pic:nvPicPr>
+                  <pic:blipFill>
+                    <a:blip r:embed="rId16" cstate="none"/>
+                    <a:srcRect/>
+                    <a:stretch>
+                      <a:fillRect/>
+                    </a:stretch>
+                  </pic:blipFill>
+                  <pic:spPr bwMode="auto">
+                    <a:xfrm>
+                      <a:off x="0" y="0"/>
+                      <a:ext cx="5715000" cy="2286000"/>
+                    </a:xfrm>
+                    <a:prstGeom prst="rect">
+                      <a:avLst/>
+                    </a:prstGeom>
+                  </pic:spPr>
+                </pic:pic>
+              </a:graphicData>
+            </a:graphic>
+          </wp:inline>
+        </w:drawing>
+      </w:r>
+    </w:p>
+    <w:p>
+      <w:pPr>
+        <w:spacing w:after="160"/>
+        <w:jc w:val="center"/>
+      </w:pPr>
+      <w:r>
+        <w:rPr>
+          <w:rFonts w:ascii="Calibri" w:cs="Calibri" w:eastAsia="Calibri" w:hAnsi="Calibri"/>
+          <w:i/>
+          <w:iCs/>
+          <w:color w:val="5B6472"/>
+          <w:sz w:val="18"/>
+          <w:szCs w:val="18"/>
+        </w:rPr>
+        <w:t xml:space="preserve">Figura 5 - Extensão de tronco: início e ponto máximo, de lado e de frente. Esquema ilustrativo.</w:t>
+      </w:r>
+    </w:p>
+    <w:p>
+      <w:pPr>
+        <w:keepNext/>
+        <w:spacing w:after="40" w:before="120"/>
+        <w:jc w:val="center"/>
+      </w:pPr>
+      <w:r>
+        <w:drawing>
+          <wp:inline distT="0" distB="0" distL="0" distR="0">
+            <wp:extent cx="5715000" cy="2286000"/>
+            <wp:effectExtent t="0" r="0" b="0" l="0"/>
+            <wp:docPr id="7" name="mov4.png" descr="Inclinação lateral" title="Inclinação lateral"/>
+            <wp:cNvGraphicFramePr>
+              <a:graphicFrameLocks xmlns:a="http://schemas.openxmlformats.org/drawingml/2006/main" noChangeAspect="1"/>
+            </wp:cNvGraphicFramePr>
+            <a:graphic xmlns:a="http://schemas.openxmlformats.org/drawingml/2006/main">
+              <a:graphicData uri="http://schemas.openxmlformats.org/drawingml/2006/picture">
+                <pic:pic xmlns:pic="http://schemas.openxmlformats.org/drawingml/2006/picture">
+                  <pic:nvPicPr>
+                    <pic:cNvPr id="0" name="" descr=""/>
+                    <pic:cNvPicPr>
+                      <a:picLocks noChangeAspect="1" noChangeArrowheads="1"/>
+                    </pic:cNvPicPr>
+                  </pic:nvPicPr>
+                  <pic:blipFill>
+                    <a:blip r:embed="rId17" cstate="none"/>
+                    <a:srcRect/>
+                    <a:stretch>
+                      <a:fillRect/>
+                    </a:stretch>
+                  </pic:blipFill>
+                  <pic:spPr bwMode="auto">
+                    <a:xfrm>
+                      <a:off x="0" y="0"/>
+                      <a:ext cx="5715000" cy="2286000"/>
+                    </a:xfrm>
+                    <a:prstGeom prst="rect">
+                      <a:avLst/>
+                    </a:prstGeom>
+                  </pic:spPr>
+                </pic:pic>
+              </a:graphicData>
+            </a:graphic>
+          </wp:inline>
+        </w:drawing>
+      </w:r>
+    </w:p>
+    <w:p>
+      <w:pPr>
+        <w:spacing w:after="160"/>
+        <w:jc w:val="center"/>
+      </w:pPr>
+      <w:r>
+        <w:rPr>
+          <w:rFonts w:ascii="Calibri" w:cs="Calibri" w:eastAsia="Calibri" w:hAnsi="Calibri"/>
+          <w:i/>
+          <w:iCs/>
+          <w:color w:val="5B6472"/>
+          <w:sz w:val="18"/>
+          <w:szCs w:val="18"/>
+        </w:rPr>
+        <w:t xml:space="preserve">Figura 6 - Inclinação lateral: início e ponto máximo, de lado e de frente. Esquema ilustrativo.</w:t>
       </w:r>
     </w:p>
     <w:p>

</xml_diff>

<commit_message>
Quadro "Para o treino" ao abrir a ficha; paleta azul-marinho, dourado e branco; POP v1.1
- Resumo da anamnese para a prescricao no alto da ficha (objetivo, seguranca e saude, dor, experiencia de treino, rotina, recuperacao) e bloco "Perguntar agora" com o que falta; so organiza as respostas, nao prescreve; avisa para confirmar condicoes citadas quando a liberacao do PAR-Q+ diz pode seguir; funcao pura com 18 verificacoes; conferido na tela com ficha ficticia
- Paleta azul-marinho (marca), dourado (destaque) e branco; verde discreto so para ok e adequado; cabecalho do avaliador marinho com filete dourado; aba ativa dourada; paginas de entrada e slides ajustados
- POP-AVI-001 versao 1.1: leitura do quadro nas etapas 4 e 13, linha em situacoes especiais, organograma atualizado e cores da nova marca
- docs 00 e 01 atualizados; todos os testes OK; tsc e build OK

Co-Authored-By: Claude Sonnet 5.5 <noreply@anthropic.com>
</commit_message>
<xml_diff>
--- a/POP-Uso-da-Avaliacao-Integrada.docx
+++ b/POP-Uso-da-Avaliacao-Integrada.docx
@@ -74,7 +74,7 @@
           <w:rFonts w:ascii="Calibri" w:cs="Calibri" w:eastAsia="Calibri" w:hAnsi="Calibri"/>
           <w:b/>
           <w:bCs/>
-          <w:color w:val="0F4C5C"/>
+          <w:color w:val="16325C"/>
           <w:sz w:val="40"/>
           <w:szCs w:val="40"/>
         </w:rPr>
@@ -84,7 +84,7 @@
     <w:p>
       <w:pPr>
         <w:pBdr>
-          <w:bottom w:val="single" w:color="0F4C5C" w:sz="12" w:space="6"/>
+          <w:bottom w:val="single" w:color="C9A24D" w:sz="12" w:space="6"/>
         </w:pBdr>
         <w:spacing w:after="220"/>
       </w:pPr>
@@ -243,7 +243,7 @@
                 <w:sz w:val="20"/>
                 <w:szCs w:val="20"/>
               </w:rPr>
-              <w:t xml:space="preserve">1.0</w:t>
+              <w:t xml:space="preserve">1.1</w:t>
             </w:r>
           </w:p>
         </w:tc>
@@ -310,7 +310,7 @@
                 <w:sz w:val="20"/>
                 <w:szCs w:val="20"/>
               </w:rPr>
-              <w:t xml:space="preserve">24/10/2026</w:t>
+              <w:t xml:space="preserve">25/10/2026</w:t>
             </w:r>
           </w:p>
         </w:tc>
@@ -375,7 +375,7 @@
                 <w:sz w:val="20"/>
                 <w:szCs w:val="20"/>
               </w:rPr>
-              <w:t xml:space="preserve">24/10/2027 ou antes, se o sistema mudar</w:t>
+              <w:t xml:space="preserve">25/10/2027 ou antes, se o sistema mudar</w:t>
             </w:r>
           </w:p>
         </w:tc>
@@ -460,7 +460,7 @@
           <w:rFonts w:ascii="Calibri" w:cs="Calibri" w:eastAsia="Calibri" w:hAnsi="Calibri"/>
           <w:b/>
           <w:bCs/>
-          <w:color w:val="0F4C5C"/>
+          <w:color w:val="16325C"/>
           <w:sz w:val="28"/>
           <w:szCs w:val="28"/>
         </w:rPr>
@@ -492,7 +492,7 @@
           <w:rFonts w:ascii="Calibri" w:cs="Calibri" w:eastAsia="Calibri" w:hAnsi="Calibri"/>
           <w:b/>
           <w:bCs/>
-          <w:color w:val="0F4C5C"/>
+          <w:color w:val="16325C"/>
           <w:sz w:val="28"/>
           <w:szCs w:val="28"/>
         </w:rPr>
@@ -524,7 +524,7 @@
           <w:rFonts w:ascii="Calibri" w:cs="Calibri" w:eastAsia="Calibri" w:hAnsi="Calibri"/>
           <w:b/>
           <w:bCs/>
-          <w:color w:val="0F4C5C"/>
+          <w:color w:val="16325C"/>
           <w:sz w:val="28"/>
           <w:szCs w:val="28"/>
         </w:rPr>
@@ -561,7 +561,7 @@
               <w:bottom w:val="single" w:color="BFC5CE" w:sz="4"/>
               <w:right w:val="single" w:color="BFC5CE" w:sz="4"/>
             </w:tcBorders>
-            <w:shd w:fill="0F4C5C" w:color="auto" w:val="clear"/>
+            <w:shd w:fill="0B1F40" w:color="auto" w:val="clear"/>
             <w:tcMar>
               <w:top w:type="dxa" w:w="70"/>
               <w:left w:type="dxa" w:w="110"/>
@@ -596,7 +596,7 @@
               <w:bottom w:val="single" w:color="BFC5CE" w:sz="4"/>
               <w:right w:val="single" w:color="BFC5CE" w:sz="4"/>
             </w:tcBorders>
-            <w:shd w:fill="0F4C5C" w:color="auto" w:val="clear"/>
+            <w:shd w:fill="0B1F40" w:color="auto" w:val="clear"/>
             <w:tcMar>
               <w:top w:type="dxa" w:w="70"/>
               <w:left w:type="dxa" w:w="110"/>
@@ -839,7 +839,7 @@
           <w:rFonts w:ascii="Calibri" w:cs="Calibri" w:eastAsia="Calibri" w:hAnsi="Calibri"/>
           <w:b/>
           <w:bCs/>
-          <w:color w:val="0F4C5C"/>
+          <w:color w:val="16325C"/>
           <w:sz w:val="28"/>
           <w:szCs w:val="28"/>
         </w:rPr>
@@ -876,7 +876,7 @@
               <w:bottom w:val="single" w:color="BFC5CE" w:sz="4"/>
               <w:right w:val="single" w:color="BFC5CE" w:sz="4"/>
             </w:tcBorders>
-            <w:shd w:fill="0F4C5C" w:color="auto" w:val="clear"/>
+            <w:shd w:fill="0B1F40" w:color="auto" w:val="clear"/>
             <w:tcMar>
               <w:top w:type="dxa" w:w="70"/>
               <w:left w:type="dxa" w:w="110"/>
@@ -911,7 +911,7 @@
               <w:bottom w:val="single" w:color="BFC5CE" w:sz="4"/>
               <w:right w:val="single" w:color="BFC5CE" w:sz="4"/>
             </w:tcBorders>
-            <w:shd w:fill="0F4C5C" w:color="auto" w:val="clear"/>
+            <w:shd w:fill="0B1F40" w:color="auto" w:val="clear"/>
             <w:tcMar>
               <w:top w:type="dxa" w:w="70"/>
               <w:left w:type="dxa" w:w="110"/>
@@ -1630,7 +1630,7 @@
           <w:rFonts w:ascii="Calibri" w:cs="Calibri" w:eastAsia="Calibri" w:hAnsi="Calibri"/>
           <w:b/>
           <w:bCs/>
-          <w:color w:val="0F4C5C"/>
+          <w:color w:val="16325C"/>
           <w:sz w:val="28"/>
           <w:szCs w:val="28"/>
         </w:rPr>
@@ -1850,7 +1850,7 @@
           <w:rFonts w:ascii="Calibri" w:cs="Calibri" w:eastAsia="Calibri" w:hAnsi="Calibri"/>
           <w:b/>
           <w:bCs/>
-          <w:color w:val="0F4C5C"/>
+          <w:color w:val="16325C"/>
           <w:sz w:val="28"/>
           <w:szCs w:val="28"/>
         </w:rPr>
@@ -2078,7 +2078,7 @@
           <w:rFonts w:ascii="Calibri" w:cs="Calibri" w:eastAsia="Calibri" w:hAnsi="Calibri"/>
           <w:b/>
           <w:bCs/>
-          <w:color w:val="0F4C5C"/>
+          <w:color w:val="16325C"/>
           <w:sz w:val="28"/>
           <w:szCs w:val="28"/>
         </w:rPr>
@@ -2426,6 +2426,44 @@
           <w:szCs w:val="20"/>
         </w:rPr>
         <w:t xml:space="preserve">Automática; sua leitura ≈ 2 min</w:t>
+      </w:r>
+    </w:p>
+    <w:p>
+      <w:pPr>
+        <w:pStyle w:val="ListParagraph"/>
+        <w:numPr>
+          <w:ilvl w:val="0"/>
+          <w:numId w:val="2"/>
+        </w:numPr>
+        <w:spacing w:after="60" w:line="264"/>
+      </w:pPr>
+      <w:r>
+        <w:rPr>
+          <w:rFonts w:ascii="Calibri" w:cs="Calibri" w:eastAsia="Calibri" w:hAnsi="Calibri"/>
+          <w:color w:val="1F2937"/>
+          <w:sz w:val="22"/>
+          <w:szCs w:val="22"/>
+        </w:rPr>
+        <w:t xml:space="preserve">Ao abrir a ficha do aluno, leia o quadro "Para o treino: o que foi dito na anamnese", logo abaixo dos alertas. Ele reúne o que ajuda a prescrever: objetivo e motivação; segurança e saúde (PAR-Q+, liberação para esforço, condições citadas, medicamentos, cirurgias, lesões, quedas); dor por região, com intensidade e o que piora; experiência de treino; rotina, tempo disponível e o que atrapalha; sono, estresse e hábitos. Só aparece o que foi respondido, e o que merece cuidado vem em laranja ou vermelho.</w:t>
+      </w:r>
+    </w:p>
+    <w:p>
+      <w:pPr>
+        <w:pStyle w:val="ListParagraph"/>
+        <w:numPr>
+          <w:ilvl w:val="0"/>
+          <w:numId w:val="2"/>
+        </w:numPr>
+        <w:spacing w:after="60" w:line="264"/>
+      </w:pPr>
+      <w:r>
+        <w:rPr>
+          <w:rFonts w:ascii="Calibri" w:cs="Calibri" w:eastAsia="Calibri" w:hAnsi="Calibri"/>
+          <w:color w:val="1F2937"/>
+          <w:sz w:val="22"/>
+          <w:szCs w:val="22"/>
+        </w:rPr>
+        <w:t xml:space="preserve">No fim do quadro, o bloco dourado "Perguntar agora" lista o que falta na anamnese e muda o treino (objetivo, tempo disponível, treino atual, dor, lesões, medicamentos). Pergunte ao aluno na hora.</w:t>
       </w:r>
     </w:p>
     <w:p>
@@ -3940,51 +3978,7 @@
           <w:sz w:val="22"/>
           <w:szCs w:val="22"/>
         </w:rPr>
-        <w:t xml:space="preserve">Só o que você aprovou entra nos documentos do paciente.</w:t>
-      </w:r>
-    </w:p>
-    <w:p>
-      <w:pPr>
-        <w:pStyle w:val="Heading2"/>
-        <w:keepNext/>
-        <w:spacing w:after="80" w:before="200"/>
-      </w:pPr>
-      <w:r>
-        <w:rPr>
-          <w:rFonts w:ascii="Calibri" w:cs="Calibri" w:eastAsia="Calibri" w:hAnsi="Calibri"/>
-          <w:b/>
-          <w:bCs/>
-          <w:color w:val="1F2937"/>
-          <w:sz w:val="24"/>
-          <w:szCs w:val="24"/>
-        </w:rPr>
-        <w:t xml:space="preserve">Etapa 14 - Relatórios e devolutiva (Clara)</w:t>
-      </w:r>
-    </w:p>
-    <w:p>
-      <w:pPr>
-        <w:keepNext/>
-        <w:spacing w:after="60"/>
-      </w:pPr>
-      <w:r>
-        <w:rPr>
-          <w:rFonts w:ascii="Calibri" w:cs="Calibri" w:eastAsia="Calibri" w:hAnsi="Calibri"/>
-          <w:b/>
-          <w:bCs/>
-          <w:color w:val="5B6472"/>
-          <w:sz w:val="20"/>
-          <w:szCs w:val="20"/>
-        </w:rPr>
-        <w:t xml:space="preserve">Tempo médio estimado: </w:t>
-      </w:r>
-      <w:r>
-        <w:rPr>
-          <w:rFonts w:ascii="Calibri" w:cs="Calibri" w:eastAsia="Calibri" w:hAnsi="Calibri"/>
-          <w:color w:val="5B6472"/>
-          <w:sz w:val="20"/>
-          <w:szCs w:val="20"/>
-        </w:rPr>
-        <w:t xml:space="preserve">15 a 20 min com o paciente</w:t>
+        <w:t xml:space="preserve">Antes de aprovar, releia o quadro "Para o treino": o plano precisa caber no tempo disponível, considerar o que atrapalha o aluno, a dor e as lesões, e partir da experiência de treino que ele já tem.</w:t>
       </w:r>
     </w:p>
     <w:p>
@@ -4003,7 +3997,51 @@
           <w:sz w:val="22"/>
           <w:szCs w:val="22"/>
         </w:rPr>
-        <w:t xml:space="preserve">Na ficha, use "Ver relatório técnico" (para o profissional ou para outro profissional), "Ver versão para o paciente" (linguagem simples) e "Apresentar ao paciente (slides)".</w:t>
+        <w:t xml:space="preserve">Só o que você aprovou entra nos documentos do paciente.</w:t>
+      </w:r>
+    </w:p>
+    <w:p>
+      <w:pPr>
+        <w:pStyle w:val="Heading2"/>
+        <w:keepNext/>
+        <w:spacing w:after="80" w:before="200"/>
+      </w:pPr>
+      <w:r>
+        <w:rPr>
+          <w:rFonts w:ascii="Calibri" w:cs="Calibri" w:eastAsia="Calibri" w:hAnsi="Calibri"/>
+          <w:b/>
+          <w:bCs/>
+          <w:color w:val="1F2937"/>
+          <w:sz w:val="24"/>
+          <w:szCs w:val="24"/>
+        </w:rPr>
+        <w:t xml:space="preserve">Etapa 14 - Relatórios e devolutiva (Clara)</w:t>
+      </w:r>
+    </w:p>
+    <w:p>
+      <w:pPr>
+        <w:keepNext/>
+        <w:spacing w:after="60"/>
+      </w:pPr>
+      <w:r>
+        <w:rPr>
+          <w:rFonts w:ascii="Calibri" w:cs="Calibri" w:eastAsia="Calibri" w:hAnsi="Calibri"/>
+          <w:b/>
+          <w:bCs/>
+          <w:color w:val="5B6472"/>
+          <w:sz w:val="20"/>
+          <w:szCs w:val="20"/>
+        </w:rPr>
+        <w:t xml:space="preserve">Tempo médio estimado: </w:t>
+      </w:r>
+      <w:r>
+        <w:rPr>
+          <w:rFonts w:ascii="Calibri" w:cs="Calibri" w:eastAsia="Calibri" w:hAnsi="Calibri"/>
+          <w:color w:val="5B6472"/>
+          <w:sz w:val="20"/>
+          <w:szCs w:val="20"/>
+        </w:rPr>
+        <w:t xml:space="preserve">15 a 20 min com o paciente</w:t>
       </w:r>
     </w:p>
     <w:p>
@@ -4022,7 +4060,7 @@
           <w:sz w:val="22"/>
           <w:szCs w:val="22"/>
         </w:rPr>
-        <w:t xml:space="preserve">Para gerar o PDF, abra o documento e clique em "Imprimir / Salvar PDF". Todos saem com a sua logo e a assinatura "Leandro Lopes - Doutorado em Ciências da Saúde".</w:t>
+        <w:t xml:space="preserve">Na ficha, use "Ver relatório técnico" (para o profissional ou para outro profissional), "Ver versão para o paciente" (linguagem simples) e "Apresentar ao paciente (slides)".</w:t>
       </w:r>
     </w:p>
     <w:p>
@@ -4041,7 +4079,7 @@
           <w:sz w:val="22"/>
           <w:szCs w:val="22"/>
         </w:rPr>
-        <w:t xml:space="preserve">Para o WhatsApp, use o campo de envio na própria tela: confira o número, leia a mensagem e aperte enviar no WhatsApp. O link leva só texto; anexe o PDF à conversa.</w:t>
+        <w:t xml:space="preserve">Para gerar o PDF, abra o documento e clique em "Imprimir / Salvar PDF". Todos saem com a sua logo e a assinatura "Leandro Lopes - Doutorado em Ciências da Saúde".</w:t>
       </w:r>
     </w:p>
     <w:p>
@@ -4060,51 +4098,7 @@
           <w:sz w:val="22"/>
           <w:szCs w:val="22"/>
         </w:rPr>
-        <w:t xml:space="preserve">Faça a devolutiva conversando: como a pessoa está hoje, o que vamos fazer e o próximo passo. Combine a data de início.</w:t>
-      </w:r>
-    </w:p>
-    <w:p>
-      <w:pPr>
-        <w:pStyle w:val="Heading2"/>
-        <w:keepNext/>
-        <w:spacing w:after="80" w:before="200"/>
-      </w:pPr>
-      <w:r>
-        <w:rPr>
-          <w:rFonts w:ascii="Calibri" w:cs="Calibri" w:eastAsia="Calibri" w:hAnsi="Calibri"/>
-          <w:b/>
-          <w:bCs/>
-          <w:color w:val="1F2937"/>
-          <w:sz w:val="24"/>
-          <w:szCs w:val="24"/>
-        </w:rPr>
-        <w:t xml:space="preserve">Etapa 15 - Reavaliação</w:t>
-      </w:r>
-    </w:p>
-    <w:p>
-      <w:pPr>
-        <w:keepNext/>
-        <w:spacing w:after="60"/>
-      </w:pPr>
-      <w:r>
-        <w:rPr>
-          <w:rFonts w:ascii="Calibri" w:cs="Calibri" w:eastAsia="Calibri" w:hAnsi="Calibri"/>
-          <w:b/>
-          <w:bCs/>
-          <w:color w:val="5B6472"/>
-          <w:sz w:val="20"/>
-          <w:szCs w:val="20"/>
-        </w:rPr>
-        <w:t xml:space="preserve">Tempo médio estimado: </w:t>
-      </w:r>
-      <w:r>
-        <w:rPr>
-          <w:rFonts w:ascii="Calibri" w:cs="Calibri" w:eastAsia="Calibri" w:hAnsi="Calibri"/>
-          <w:color w:val="5B6472"/>
-          <w:sz w:val="20"/>
-          <w:szCs w:val="20"/>
-        </w:rPr>
-        <w:t xml:space="preserve">Igual ao tempo de cada etapa</w:t>
+        <w:t xml:space="preserve">Para o WhatsApp, use o campo de envio na própria tela: confira o número, leia a mensagem e aperte enviar no WhatsApp. O link leva só texto; anexe o PDF à conversa.</w:t>
       </w:r>
     </w:p>
     <w:p>
@@ -4123,7 +4117,51 @@
           <w:sz w:val="22"/>
           <w:szCs w:val="22"/>
         </w:rPr>
-        <w:t xml:space="preserve">Repita as medidas e os testes nas mesmas condições (mesmo horário aproximado, mesmo protocolo, mesmos pontos, mesma câmera). Na aba Reavaliação veja antes, atual e meta por indicador.</w:t>
+        <w:t xml:space="preserve">Faça a devolutiva conversando: como a pessoa está hoje, o que vamos fazer e o próximo passo. Combine a data de início.</w:t>
+      </w:r>
+    </w:p>
+    <w:p>
+      <w:pPr>
+        <w:pStyle w:val="Heading2"/>
+        <w:keepNext/>
+        <w:spacing w:after="80" w:before="200"/>
+      </w:pPr>
+      <w:r>
+        <w:rPr>
+          <w:rFonts w:ascii="Calibri" w:cs="Calibri" w:eastAsia="Calibri" w:hAnsi="Calibri"/>
+          <w:b/>
+          <w:bCs/>
+          <w:color w:val="1F2937"/>
+          <w:sz w:val="24"/>
+          <w:szCs w:val="24"/>
+        </w:rPr>
+        <w:t xml:space="preserve">Etapa 15 - Reavaliação</w:t>
+      </w:r>
+    </w:p>
+    <w:p>
+      <w:pPr>
+        <w:keepNext/>
+        <w:spacing w:after="60"/>
+      </w:pPr>
+      <w:r>
+        <w:rPr>
+          <w:rFonts w:ascii="Calibri" w:cs="Calibri" w:eastAsia="Calibri" w:hAnsi="Calibri"/>
+          <w:b/>
+          <w:bCs/>
+          <w:color w:val="5B6472"/>
+          <w:sz w:val="20"/>
+          <w:szCs w:val="20"/>
+        </w:rPr>
+        <w:t xml:space="preserve">Tempo médio estimado: </w:t>
+      </w:r>
+      <w:r>
+        <w:rPr>
+          <w:rFonts w:ascii="Calibri" w:cs="Calibri" w:eastAsia="Calibri" w:hAnsi="Calibri"/>
+          <w:color w:val="5B6472"/>
+          <w:sz w:val="20"/>
+          <w:szCs w:val="20"/>
+        </w:rPr>
+        <w:t xml:space="preserve">Igual ao tempo de cada etapa</w:t>
       </w:r>
     </w:p>
     <w:p>
@@ -4142,6 +4180,25 @@
           <w:sz w:val="22"/>
           <w:szCs w:val="22"/>
         </w:rPr>
+        <w:t xml:space="preserve">Repita as medidas e os testes nas mesmas condições (mesmo horário aproximado, mesmo protocolo, mesmos pontos, mesma câmera). Na aba Reavaliação veja antes, atual e meta por indicador.</w:t>
+      </w:r>
+    </w:p>
+    <w:p>
+      <w:pPr>
+        <w:pStyle w:val="ListParagraph"/>
+        <w:numPr>
+          <w:ilvl w:val="0"/>
+          <w:numId w:val="2"/>
+        </w:numPr>
+        <w:spacing w:after="60" w:line="264"/>
+      </w:pPr>
+      <w:r>
+        <w:rPr>
+          <w:rFonts w:ascii="Calibri" w:cs="Calibri" w:eastAsia="Calibri" w:hAnsi="Calibri"/>
+          <w:color w:val="1F2937"/>
+          <w:sz w:val="22"/>
+          <w:szCs w:val="22"/>
+        </w:rPr>
         <w:t xml:space="preserve">Use "Salvar" ao fim de cada área: o que você digita é guardado como rascunho, mas só o botão Salvar registra a avaliação no histórico usado na comparação.</w:t>
       </w:r>
     </w:p>
@@ -4156,7 +4213,7 @@
           <w:rFonts w:ascii="Calibri" w:cs="Calibri" w:eastAsia="Calibri" w:hAnsi="Calibri"/>
           <w:b/>
           <w:bCs/>
-          <w:color w:val="0F4C5C"/>
+          <w:color w:val="16325C"/>
           <w:sz w:val="28"/>
           <w:szCs w:val="28"/>
         </w:rPr>
@@ -4193,7 +4250,7 @@
               <w:bottom w:val="single" w:color="BFC5CE" w:sz="4"/>
               <w:right w:val="single" w:color="BFC5CE" w:sz="4"/>
             </w:tcBorders>
-            <w:shd w:fill="0F4C5C" w:color="auto" w:val="clear"/>
+            <w:shd w:fill="0B1F40" w:color="auto" w:val="clear"/>
             <w:tcMar>
               <w:top w:type="dxa" w:w="70"/>
               <w:left w:type="dxa" w:w="110"/>
@@ -4228,7 +4285,7 @@
               <w:bottom w:val="single" w:color="BFC5CE" w:sz="4"/>
               <w:right w:val="single" w:color="BFC5CE" w:sz="4"/>
             </w:tcBorders>
-            <w:shd w:fill="0F4C5C" w:color="auto" w:val="clear"/>
+            <w:shd w:fill="0B1F40" w:color="auto" w:val="clear"/>
             <w:tcMar>
               <w:top w:type="dxa" w:w="70"/>
               <w:left w:type="dxa" w:w="110"/>
@@ -4423,7 +4480,7 @@
                 <w:sz w:val="20"/>
                 <w:szCs w:val="20"/>
               </w:rPr>
-              <w:t xml:space="preserve">Paciente não terminou a anamnese</w:t>
+              <w:t xml:space="preserve">Quadro "Para o treino" com "Perguntar agora"</w:t>
             </w:r>
           </w:p>
         </w:tc>
@@ -4454,7 +4511,7 @@
                 <w:sz w:val="20"/>
                 <w:szCs w:val="20"/>
               </w:rPr>
-              <w:t xml:space="preserve">A coluna "Avaliação" mostra "aguarda anamnese". Reenvie o link ou conclua na clínica com o botão "Continuar a anamnese".</w:t>
+              <w:t xml:space="preserve">A anamnese não traz algo que muda o treino. Pergunte ao aluno na hora e registre com o botão "Continuar a anamnese", na aba Anamnese: a resposta passa a aparecer no quadro.</w:t>
             </w:r>
           </w:p>
         </w:tc>
@@ -4491,7 +4548,7 @@
                 <w:sz w:val="20"/>
                 <w:szCs w:val="20"/>
               </w:rPr>
-              <w:t xml:space="preserve">Confiança do perfil baixa</w:t>
+              <w:t xml:space="preserve">Paciente não terminou a anamnese</w:t>
             </w:r>
           </w:p>
         </w:tc>
@@ -4522,7 +4579,7 @@
                 <w:sz w:val="20"/>
                 <w:szCs w:val="20"/>
               </w:rPr>
-              <w:t xml:space="preserve">Faltam dados em 6 ou mais domínios. Abra o quadro na aba Perfil Integrado e complete o que ele lista. Não é sinal de que a pessoa está mal.</w:t>
+              <w:t xml:space="preserve">A coluna "Avaliação" mostra "aguarda anamnese". Reenvie o link ou conclua na clínica com o botão "Continuar a anamnese".</w:t>
             </w:r>
           </w:p>
         </w:tc>
@@ -4559,7 +4616,7 @@
                 <w:sz w:val="20"/>
                 <w:szCs w:val="20"/>
               </w:rPr>
-              <w:t xml:space="preserve">Instrumento que a clínica não tem</w:t>
+              <w:t xml:space="preserve">Confiança do perfil baixa</w:t>
             </w:r>
           </w:p>
         </w:tc>
@@ -4590,7 +4647,7 @@
                 <w:sz w:val="20"/>
                 <w:szCs w:val="20"/>
               </w:rPr>
-              <w:t xml:space="preserve">Use a alternativa prevista (por exemplo, fita na parede no lugar do estadiômetro; dobras no lugar da bioimpedância) e registre a limitação.</w:t>
+              <w:t xml:space="preserve">Faltam dados em 6 ou mais domínios. Abra o quadro na aba Perfil Integrado e complete o que ele lista. Não é sinal de que a pessoa está mal.</w:t>
             </w:r>
           </w:p>
         </w:tc>
@@ -4627,7 +4684,7 @@
                 <w:sz w:val="20"/>
                 <w:szCs w:val="20"/>
               </w:rPr>
-              <w:t xml:space="preserve">Vídeo de movimento inadequado</w:t>
+              <w:t xml:space="preserve">Instrumento que a clínica não tem</w:t>
             </w:r>
           </w:p>
         </w:tc>
@@ -4658,7 +4715,7 @@
                 <w:sz w:val="20"/>
                 <w:szCs w:val="20"/>
               </w:rPr>
-              <w:t xml:space="preserve">O sistema indica o porquê (luz, enquadramento, corpo cortado). Refaça com o mesmo enquadramento e anote a margem de erro.</w:t>
+              <w:t xml:space="preserve">Use a alternativa prevista (por exemplo, fita na parede no lugar do estadiômetro; dobras no lugar da bioimpedância) e registre a limitação.</w:t>
             </w:r>
           </w:p>
         </w:tc>
@@ -4695,7 +4752,7 @@
                 <w:sz w:val="20"/>
                 <w:szCs w:val="20"/>
               </w:rPr>
-              <w:t xml:space="preserve">Valores muito diferentes do esperado</w:t>
+              <w:t xml:space="preserve">Vídeo de movimento inadequado</w:t>
             </w:r>
           </w:p>
         </w:tc>
@@ -4726,7 +4783,7 @@
                 <w:sz w:val="20"/>
                 <w:szCs w:val="20"/>
               </w:rPr>
-              <w:t xml:space="preserve">Repita a medida. Um teste isolado não decide conduta: cruze com os outros e com a anamnese.</w:t>
+              <w:t xml:space="preserve">O sistema indica o porquê (luz, enquadramento, corpo cortado). Refaça com o mesmo enquadramento e anote a margem de erro.</w:t>
             </w:r>
           </w:p>
         </w:tc>
@@ -4763,7 +4820,7 @@
                 <w:sz w:val="20"/>
                 <w:szCs w:val="20"/>
               </w:rPr>
-              <w:t xml:space="preserve">Erro ou dúvida no sistema</w:t>
+              <w:t xml:space="preserve">Valores muito diferentes do esperado</w:t>
             </w:r>
           </w:p>
         </w:tc>
@@ -4794,6 +4851,74 @@
                 <w:sz w:val="20"/>
                 <w:szCs w:val="20"/>
               </w:rPr>
+              <w:t xml:space="preserve">Repita a medida. Um teste isolado não decide conduta: cruze com os outros e com a anamnese.</w:t>
+            </w:r>
+          </w:p>
+        </w:tc>
+      </w:tr>
+      <w:tr>
+        <w:trPr>
+          <w:cantSplit/>
+          <w:tblHeader w:val="off"/>
+        </w:trPr>
+        <w:tc>
+          <w:tcPr>
+            <w:tcW w:type="dxa" w:w="3200"/>
+            <w:tcBorders>
+              <w:top w:val="single" w:color="BFC5CE" w:sz="4"/>
+              <w:left w:val="single" w:color="BFC5CE" w:sz="4"/>
+              <w:bottom w:val="single" w:color="BFC5CE" w:sz="4"/>
+              <w:right w:val="single" w:color="BFC5CE" w:sz="4"/>
+            </w:tcBorders>
+            <w:tcMar>
+              <w:top w:type="dxa" w:w="70"/>
+              <w:left w:type="dxa" w:w="110"/>
+              <w:bottom w:type="dxa" w:w="70"/>
+              <w:right w:type="dxa" w:w="110"/>
+            </w:tcMar>
+            <w:vAlign w:val="top"/>
+          </w:tcPr>
+          <w:p>
+            <w:pPr>
+              <w:spacing w:after="40" w:line="252"/>
+            </w:pPr>
+            <w:r>
+              <w:rPr>
+                <w:rFonts w:ascii="Calibri" w:cs="Calibri" w:eastAsia="Calibri" w:hAnsi="Calibri"/>
+                <w:sz w:val="20"/>
+                <w:szCs w:val="20"/>
+              </w:rPr>
+              <w:t xml:space="preserve">Erro ou dúvida no sistema</w:t>
+            </w:r>
+          </w:p>
+        </w:tc>
+        <w:tc>
+          <w:tcPr>
+            <w:tcW w:type="dxa" w:w="6438"/>
+            <w:tcBorders>
+              <w:top w:val="single" w:color="BFC5CE" w:sz="4"/>
+              <w:left w:val="single" w:color="BFC5CE" w:sz="4"/>
+              <w:bottom w:val="single" w:color="BFC5CE" w:sz="4"/>
+              <w:right w:val="single" w:color="BFC5CE" w:sz="4"/>
+            </w:tcBorders>
+            <w:tcMar>
+              <w:top w:type="dxa" w:w="70"/>
+              <w:left w:type="dxa" w:w="110"/>
+              <w:bottom w:type="dxa" w:w="70"/>
+              <w:right w:type="dxa" w:w="110"/>
+            </w:tcMar>
+            <w:vAlign w:val="top"/>
+          </w:tcPr>
+          <w:p>
+            <w:pPr>
+              <w:spacing w:after="40" w:line="252"/>
+            </w:pPr>
+            <w:r>
+              <w:rPr>
+                <w:rFonts w:ascii="Calibri" w:cs="Calibri" w:eastAsia="Calibri" w:hAnsi="Calibri"/>
+                <w:sz w:val="20"/>
+                <w:szCs w:val="20"/>
+              </w:rPr>
               <w:t xml:space="preserve">Não improvise dados. Anote o que ocorreu e avise quem mantém o sistema; o rascunho fica guardado.</w:t>
             </w:r>
           </w:p>
@@ -4811,7 +4936,7 @@
           <w:rFonts w:ascii="Calibri" w:cs="Calibri" w:eastAsia="Calibri" w:hAnsi="Calibri"/>
           <w:b/>
           <w:bCs/>
-          <w:color w:val="0F4C5C"/>
+          <w:color w:val="16325C"/>
           <w:sz w:val="28"/>
           <w:szCs w:val="28"/>
         </w:rPr>
@@ -4905,7 +5030,7 @@
           <w:rFonts w:ascii="Calibri" w:cs="Calibri" w:eastAsia="Calibri" w:hAnsi="Calibri"/>
           <w:b/>
           <w:bCs/>
-          <w:color w:val="0F4C5C"/>
+          <w:color w:val="16325C"/>
           <w:sz w:val="28"/>
           <w:szCs w:val="28"/>
         </w:rPr>
@@ -4937,7 +5062,7 @@
           <w:rFonts w:ascii="Calibri" w:cs="Calibri" w:eastAsia="Calibri" w:hAnsi="Calibri"/>
           <w:b/>
           <w:bCs/>
-          <w:color w:val="0F4C5C"/>
+          <w:color w:val="16325C"/>
           <w:sz w:val="28"/>
           <w:szCs w:val="28"/>
         </w:rPr>
@@ -5012,7 +5137,7 @@
           <w:rFonts w:ascii="Calibri" w:cs="Calibri" w:eastAsia="Calibri" w:hAnsi="Calibri"/>
           <w:b/>
           <w:bCs/>
-          <w:color w:val="0F4C5C"/>
+          <w:color w:val="16325C"/>
           <w:sz w:val="28"/>
           <w:szCs w:val="28"/>
         </w:rPr>
@@ -5050,7 +5175,7 @@
               <w:bottom w:val="single" w:color="BFC5CE" w:sz="4"/>
               <w:right w:val="single" w:color="BFC5CE" w:sz="4"/>
             </w:tcBorders>
-            <w:shd w:fill="0F4C5C" w:color="auto" w:val="clear"/>
+            <w:shd w:fill="0B1F40" w:color="auto" w:val="clear"/>
             <w:tcMar>
               <w:top w:type="dxa" w:w="70"/>
               <w:left w:type="dxa" w:w="110"/>
@@ -5085,7 +5210,7 @@
               <w:bottom w:val="single" w:color="BFC5CE" w:sz="4"/>
               <w:right w:val="single" w:color="BFC5CE" w:sz="4"/>
             </w:tcBorders>
-            <w:shd w:fill="0F4C5C" w:color="auto" w:val="clear"/>
+            <w:shd w:fill="0B1F40" w:color="auto" w:val="clear"/>
             <w:tcMar>
               <w:top w:type="dxa" w:w="70"/>
               <w:left w:type="dxa" w:w="110"/>
@@ -5120,7 +5245,7 @@
               <w:bottom w:val="single" w:color="BFC5CE" w:sz="4"/>
               <w:right w:val="single" w:color="BFC5CE" w:sz="4"/>
             </w:tcBorders>
-            <w:shd w:fill="0F4C5C" w:color="auto" w:val="clear"/>
+            <w:shd w:fill="0B1F40" w:color="auto" w:val="clear"/>
             <w:tcMar>
               <w:top w:type="dxa" w:w="70"/>
               <w:left w:type="dxa" w:w="110"/>
@@ -5242,6 +5367,105 @@
                 <w:szCs w:val="20"/>
               </w:rPr>
               <w:t xml:space="preserve">Emissão inicial. Tempos por etapa são estimativas a confirmar.</w:t>
+            </w:r>
+          </w:p>
+        </w:tc>
+      </w:tr>
+      <w:tr>
+        <w:trPr>
+          <w:cantSplit/>
+          <w:tblHeader w:val="off"/>
+        </w:trPr>
+        <w:tc>
+          <w:tcPr>
+            <w:tcW w:type="dxa" w:w="1300"/>
+            <w:tcBorders>
+              <w:top w:val="single" w:color="BFC5CE" w:sz="4"/>
+              <w:left w:val="single" w:color="BFC5CE" w:sz="4"/>
+              <w:bottom w:val="single" w:color="BFC5CE" w:sz="4"/>
+              <w:right w:val="single" w:color="BFC5CE" w:sz="4"/>
+            </w:tcBorders>
+            <w:tcMar>
+              <w:top w:type="dxa" w:w="70"/>
+              <w:left w:type="dxa" w:w="110"/>
+              <w:bottom w:type="dxa" w:w="70"/>
+              <w:right w:type="dxa" w:w="110"/>
+            </w:tcMar>
+            <w:vAlign w:val="top"/>
+          </w:tcPr>
+          <w:p>
+            <w:pPr>
+              <w:spacing w:after="40" w:line="252"/>
+            </w:pPr>
+            <w:r>
+              <w:rPr>
+                <w:rFonts w:ascii="Calibri" w:cs="Calibri" w:eastAsia="Calibri" w:hAnsi="Calibri"/>
+                <w:sz w:val="20"/>
+                <w:szCs w:val="20"/>
+              </w:rPr>
+              <w:t xml:space="preserve">1.1</w:t>
+            </w:r>
+          </w:p>
+        </w:tc>
+        <w:tc>
+          <w:tcPr>
+            <w:tcW w:type="dxa" w:w="2000"/>
+            <w:tcBorders>
+              <w:top w:val="single" w:color="BFC5CE" w:sz="4"/>
+              <w:left w:val="single" w:color="BFC5CE" w:sz="4"/>
+              <w:bottom w:val="single" w:color="BFC5CE" w:sz="4"/>
+              <w:right w:val="single" w:color="BFC5CE" w:sz="4"/>
+            </w:tcBorders>
+            <w:tcMar>
+              <w:top w:type="dxa" w:w="70"/>
+              <w:left w:type="dxa" w:w="110"/>
+              <w:bottom w:type="dxa" w:w="70"/>
+              <w:right w:type="dxa" w:w="110"/>
+            </w:tcMar>
+            <w:vAlign w:val="top"/>
+          </w:tcPr>
+          <w:p>
+            <w:pPr>
+              <w:spacing w:after="40" w:line="252"/>
+            </w:pPr>
+            <w:r>
+              <w:rPr>
+                <w:rFonts w:ascii="Calibri" w:cs="Calibri" w:eastAsia="Calibri" w:hAnsi="Calibri"/>
+                <w:sz w:val="20"/>
+                <w:szCs w:val="20"/>
+              </w:rPr>
+              <w:t xml:space="preserve">25/10/2026</w:t>
+            </w:r>
+          </w:p>
+        </w:tc>
+        <w:tc>
+          <w:tcPr>
+            <w:tcW w:type="dxa" w:w="6338"/>
+            <w:tcBorders>
+              <w:top w:val="single" w:color="BFC5CE" w:sz="4"/>
+              <w:left w:val="single" w:color="BFC5CE" w:sz="4"/>
+              <w:bottom w:val="single" w:color="BFC5CE" w:sz="4"/>
+              <w:right w:val="single" w:color="BFC5CE" w:sz="4"/>
+            </w:tcBorders>
+            <w:tcMar>
+              <w:top w:type="dxa" w:w="70"/>
+              <w:left w:type="dxa" w:w="110"/>
+              <w:bottom w:type="dxa" w:w="70"/>
+              <w:right w:type="dxa" w:w="110"/>
+            </w:tcMar>
+            <w:vAlign w:val="top"/>
+          </w:tcPr>
+          <w:p>
+            <w:pPr>
+              <w:spacing w:after="40" w:line="252"/>
+            </w:pPr>
+            <w:r>
+              <w:rPr>
+                <w:rFonts w:ascii="Calibri" w:cs="Calibri" w:eastAsia="Calibri" w:hAnsi="Calibri"/>
+                <w:sz w:val="20"/>
+                <w:szCs w:val="20"/>
+              </w:rPr>
+              <w:t xml:space="preserve">Quadro "Para o treino" (resumo da anamnese ao abrir a ficha); guia de filmagem dos movimentos; nova identidade visual em azul-marinho e dourado.</w:t>
             </w:r>
           </w:p>
         </w:tc>
@@ -5269,7 +5493,7 @@
           <w:rFonts w:ascii="Calibri" w:cs="Calibri" w:eastAsia="Calibri" w:hAnsi="Calibri"/>
           <w:b/>
           <w:bCs/>
-          <w:color w:val="0F4C5C"/>
+          <w:color w:val="16325C"/>
           <w:sz w:val="28"/>
           <w:szCs w:val="28"/>
         </w:rPr>
@@ -5313,12 +5537,12 @@
           <w:tcPr>
             <w:tcW w:type="dxa" w:w="2409"/>
             <w:tcBorders>
-              <w:top w:val="single" w:color="0F6E56" w:sz="4"/>
-              <w:left w:val="single" w:color="0F6E56" w:sz="4"/>
-              <w:bottom w:val="single" w:color="0F6E56" w:sz="4"/>
-              <w:right w:val="single" w:color="0F6E56" w:sz="4"/>
-            </w:tcBorders>
-            <w:shd w:fill="E1F5EE" w:color="auto" w:val="clear"/>
+              <w:top w:val="single" w:color="16325C" w:sz="4"/>
+              <w:left w:val="single" w:color="16325C" w:sz="4"/>
+              <w:bottom w:val="single" w:color="16325C" w:sz="4"/>
+              <w:right w:val="single" w:color="16325C" w:sz="4"/>
+            </w:tcBorders>
+            <w:shd w:fill="E8EDF6" w:color="auto" w:val="clear"/>
             <w:tcMar>
               <w:top w:type="dxa" w:w="40"/>
               <w:left w:type="dxa" w:w="80"/>
@@ -5348,12 +5572,12 @@
           <w:tcPr>
             <w:tcW w:type="dxa" w:w="2410"/>
             <w:tcBorders>
-              <w:top w:val="single" w:color="534AB7" w:sz="4"/>
-              <w:left w:val="single" w:color="534AB7" w:sz="4"/>
-              <w:bottom w:val="single" w:color="534AB7" w:sz="4"/>
-              <w:right w:val="single" w:color="534AB7" w:sz="4"/>
-            </w:tcBorders>
-            <w:shd w:fill="EEEDFE" w:color="auto" w:val="clear"/>
+              <w:top w:val="single" w:color="C9A24D" w:sz="4"/>
+              <w:left w:val="single" w:color="C9A24D" w:sz="4"/>
+              <w:bottom w:val="single" w:color="C9A24D" w:sz="4"/>
+              <w:right w:val="single" w:color="C9A24D" w:sz="4"/>
+            </w:tcBorders>
+            <w:shd w:fill="FBF4E3" w:color="auto" w:val="clear"/>
             <w:tcMar>
               <w:top w:type="dxa" w:w="40"/>
               <w:left w:type="dxa" w:w="80"/>
@@ -5383,12 +5607,12 @@
           <w:tcPr>
             <w:tcW w:type="dxa" w:w="2409"/>
             <w:tcBorders>
-              <w:top w:val="single" w:color="854F0B" w:sz="4"/>
-              <w:left w:val="single" w:color="854F0B" w:sz="4"/>
-              <w:bottom w:val="single" w:color="854F0B" w:sz="4"/>
-              <w:right w:val="single" w:color="854F0B" w:sz="4"/>
-            </w:tcBorders>
-            <w:shd w:fill="FAEEDA" w:color="auto" w:val="clear"/>
+              <w:top w:val="single" w:color="A04F00" w:sz="4"/>
+              <w:left w:val="single" w:color="A04F00" w:sz="4"/>
+              <w:bottom w:val="single" w:color="A04F00" w:sz="4"/>
+              <w:right w:val="single" w:color="A04F00" w:sz="4"/>
+            </w:tcBorders>
+            <w:shd w:fill="FDECDD" w:color="auto" w:val="clear"/>
             <w:tcMar>
               <w:top w:type="dxa" w:w="40"/>
               <w:left w:type="dxa" w:w="80"/>
@@ -5872,12 +6096,12 @@
           <w:tcPr>
             <w:tcW w:type="dxa" w:w="560"/>
             <w:tcBorders>
-              <w:top w:val="single" w:color="534AB7" w:sz="6"/>
-              <w:left w:val="single" w:color="534AB7" w:sz="6"/>
-              <w:bottom w:val="single" w:color="534AB7" w:sz="6"/>
-              <w:right w:val="single" w:color="534AB7" w:sz="6"/>
-            </w:tcBorders>
-            <w:shd w:fill="EEEDFE" w:color="auto" w:val="clear"/>
+              <w:top w:val="single" w:color="C9A24D" w:sz="6"/>
+              <w:left w:val="single" w:color="C9A24D" w:sz="6"/>
+              <w:bottom w:val="single" w:color="C9A24D" w:sz="6"/>
+              <w:right w:val="single" w:color="C9A24D" w:sz="6"/>
+            </w:tcBorders>
+            <w:shd w:fill="FBF4E3" w:color="auto" w:val="clear"/>
             <w:tcMar>
               <w:top w:type="dxa" w:w="50"/>
               <w:left w:type="dxa" w:w="90"/>
@@ -5907,12 +6131,12 @@
           <w:tcPr>
             <w:tcW w:type="dxa" w:w="3000"/>
             <w:tcBorders>
-              <w:top w:val="single" w:color="534AB7" w:sz="6"/>
-              <w:left w:val="single" w:color="534AB7" w:sz="6"/>
-              <w:bottom w:val="single" w:color="534AB7" w:sz="6"/>
-              <w:right w:val="single" w:color="534AB7" w:sz="6"/>
-            </w:tcBorders>
-            <w:shd w:fill="EEEDFE" w:color="auto" w:val="clear"/>
+              <w:top w:val="single" w:color="C9A24D" w:sz="6"/>
+              <w:left w:val="single" w:color="C9A24D" w:sz="6"/>
+              <w:bottom w:val="single" w:color="C9A24D" w:sz="6"/>
+              <w:right w:val="single" w:color="C9A24D" w:sz="6"/>
+            </w:tcBorders>
+            <w:shd w:fill="FBF4E3" w:color="auto" w:val="clear"/>
             <w:tcMar>
               <w:top w:type="dxa" w:w="50"/>
               <w:left w:type="dxa" w:w="90"/>
@@ -5955,12 +6179,12 @@
           <w:tcPr>
             <w:tcW w:type="dxa" w:w="4278"/>
             <w:tcBorders>
-              <w:top w:val="single" w:color="534AB7" w:sz="6"/>
-              <w:left w:val="single" w:color="534AB7" w:sz="6"/>
-              <w:bottom w:val="single" w:color="534AB7" w:sz="6"/>
-              <w:right w:val="single" w:color="534AB7" w:sz="6"/>
-            </w:tcBorders>
-            <w:shd w:fill="EEEDFE" w:color="auto" w:val="clear"/>
+              <w:top w:val="single" w:color="C9A24D" w:sz="6"/>
+              <w:left w:val="single" w:color="C9A24D" w:sz="6"/>
+              <w:bottom w:val="single" w:color="C9A24D" w:sz="6"/>
+              <w:right w:val="single" w:color="C9A24D" w:sz="6"/>
+            </w:tcBorders>
+            <w:shd w:fill="FBF4E3" w:color="auto" w:val="clear"/>
             <w:tcMar>
               <w:top w:type="dxa" w:w="50"/>
               <w:left w:type="dxa" w:w="90"/>
@@ -5987,12 +6211,12 @@
           <w:tcPr>
             <w:tcW w:type="dxa" w:w="1800"/>
             <w:tcBorders>
-              <w:top w:val="single" w:color="534AB7" w:sz="6"/>
-              <w:left w:val="single" w:color="534AB7" w:sz="6"/>
-              <w:bottom w:val="single" w:color="534AB7" w:sz="6"/>
-              <w:right w:val="single" w:color="534AB7" w:sz="6"/>
-            </w:tcBorders>
-            <w:shd w:fill="EEEDFE" w:color="auto" w:val="clear"/>
+              <w:top w:val="single" w:color="C9A24D" w:sz="6"/>
+              <w:left w:val="single" w:color="C9A24D" w:sz="6"/>
+              <w:bottom w:val="single" w:color="C9A24D" w:sz="6"/>
+              <w:right w:val="single" w:color="C9A24D" w:sz="6"/>
+            </w:tcBorders>
+            <w:shd w:fill="FBF4E3" w:color="auto" w:val="clear"/>
             <w:tcMar>
               <w:top w:type="dxa" w:w="50"/>
               <w:left w:type="dxa" w:w="90"/>
@@ -6067,12 +6291,12 @@
           <w:tcPr>
             <w:tcW w:type="dxa" w:w="560"/>
             <w:tcBorders>
-              <w:top w:val="single" w:color="854F0B" w:sz="6"/>
-              <w:left w:val="single" w:color="854F0B" w:sz="6"/>
-              <w:bottom w:val="single" w:color="854F0B" w:sz="6"/>
-              <w:right w:val="single" w:color="854F0B" w:sz="6"/>
-            </w:tcBorders>
-            <w:shd w:fill="FAEEDA" w:color="auto" w:val="clear"/>
+              <w:top w:val="single" w:color="A04F00" w:sz="6"/>
+              <w:left w:val="single" w:color="A04F00" w:sz="6"/>
+              <w:bottom w:val="single" w:color="A04F00" w:sz="6"/>
+              <w:right w:val="single" w:color="A04F00" w:sz="6"/>
+            </w:tcBorders>
+            <w:shd w:fill="FDECDD" w:color="auto" w:val="clear"/>
             <w:tcMar>
               <w:top w:type="dxa" w:w="50"/>
               <w:left w:type="dxa" w:w="90"/>
@@ -6102,12 +6326,12 @@
           <w:tcPr>
             <w:tcW w:type="dxa" w:w="3000"/>
             <w:tcBorders>
-              <w:top w:val="single" w:color="854F0B" w:sz="6"/>
-              <w:left w:val="single" w:color="854F0B" w:sz="6"/>
-              <w:bottom w:val="single" w:color="854F0B" w:sz="6"/>
-              <w:right w:val="single" w:color="854F0B" w:sz="6"/>
-            </w:tcBorders>
-            <w:shd w:fill="FAEEDA" w:color="auto" w:val="clear"/>
+              <w:top w:val="single" w:color="A04F00" w:sz="6"/>
+              <w:left w:val="single" w:color="A04F00" w:sz="6"/>
+              <w:bottom w:val="single" w:color="A04F00" w:sz="6"/>
+              <w:right w:val="single" w:color="A04F00" w:sz="6"/>
+            </w:tcBorders>
+            <w:shd w:fill="FDECDD" w:color="auto" w:val="clear"/>
             <w:tcMar>
               <w:top w:type="dxa" w:w="50"/>
               <w:left w:type="dxa" w:w="90"/>
@@ -6150,12 +6374,12 @@
           <w:tcPr>
             <w:tcW w:type="dxa" w:w="4278"/>
             <w:tcBorders>
-              <w:top w:val="single" w:color="854F0B" w:sz="6"/>
-              <w:left w:val="single" w:color="854F0B" w:sz="6"/>
-              <w:bottom w:val="single" w:color="854F0B" w:sz="6"/>
-              <w:right w:val="single" w:color="854F0B" w:sz="6"/>
-            </w:tcBorders>
-            <w:shd w:fill="FAEEDA" w:color="auto" w:val="clear"/>
+              <w:top w:val="single" w:color="A04F00" w:sz="6"/>
+              <w:left w:val="single" w:color="A04F00" w:sz="6"/>
+              <w:bottom w:val="single" w:color="A04F00" w:sz="6"/>
+              <w:right w:val="single" w:color="A04F00" w:sz="6"/>
+            </w:tcBorders>
+            <w:shd w:fill="FDECDD" w:color="auto" w:val="clear"/>
             <w:tcMar>
               <w:top w:type="dxa" w:w="50"/>
               <w:left w:type="dxa" w:w="90"/>
@@ -6174,7 +6398,7 @@
                 <w:sz w:val="19"/>
                 <w:szCs w:val="19"/>
               </w:rPr>
-              <w:t xml:space="preserve">Ler alertas; decidir se pode fazer testes físicos</w:t>
+              <w:t xml:space="preserve">Ler alertas e o quadro Para o treino; decidir se pode fazer testes físicos</w:t>
             </w:r>
           </w:p>
         </w:tc>
@@ -6182,12 +6406,12 @@
           <w:tcPr>
             <w:tcW w:type="dxa" w:w="1800"/>
             <w:tcBorders>
-              <w:top w:val="single" w:color="854F0B" w:sz="6"/>
-              <w:left w:val="single" w:color="854F0B" w:sz="6"/>
-              <w:bottom w:val="single" w:color="854F0B" w:sz="6"/>
-              <w:right w:val="single" w:color="854F0B" w:sz="6"/>
-            </w:tcBorders>
-            <w:shd w:fill="FAEEDA" w:color="auto" w:val="clear"/>
+              <w:top w:val="single" w:color="A04F00" w:sz="6"/>
+              <w:left w:val="single" w:color="A04F00" w:sz="6"/>
+              <w:bottom w:val="single" w:color="A04F00" w:sz="6"/>
+              <w:right w:val="single" w:color="A04F00" w:sz="6"/>
+            </w:tcBorders>
+            <w:shd w:fill="FDECDD" w:color="auto" w:val="clear"/>
             <w:tcMar>
               <w:top w:type="dxa" w:w="50"/>
               <w:left w:type="dxa" w:w="90"/>
@@ -6262,12 +6486,12 @@
           <w:tcPr>
             <w:tcW w:type="dxa" w:w="560"/>
             <w:tcBorders>
-              <w:top w:val="single" w:color="0F6E56" w:sz="6"/>
-              <w:left w:val="single" w:color="0F6E56" w:sz="6"/>
-              <w:bottom w:val="single" w:color="0F6E56" w:sz="6"/>
-              <w:right w:val="single" w:color="0F6E56" w:sz="6"/>
-            </w:tcBorders>
-            <w:shd w:fill="E1F5EE" w:color="auto" w:val="clear"/>
+              <w:top w:val="single" w:color="16325C" w:sz="6"/>
+              <w:left w:val="single" w:color="16325C" w:sz="6"/>
+              <w:bottom w:val="single" w:color="16325C" w:sz="6"/>
+              <w:right w:val="single" w:color="16325C" w:sz="6"/>
+            </w:tcBorders>
+            <w:shd w:fill="E8EDF6" w:color="auto" w:val="clear"/>
             <w:tcMar>
               <w:top w:type="dxa" w:w="50"/>
               <w:left w:type="dxa" w:w="90"/>
@@ -6297,12 +6521,12 @@
           <w:tcPr>
             <w:tcW w:type="dxa" w:w="3000"/>
             <w:tcBorders>
-              <w:top w:val="single" w:color="0F6E56" w:sz="6"/>
-              <w:left w:val="single" w:color="0F6E56" w:sz="6"/>
-              <w:bottom w:val="single" w:color="0F6E56" w:sz="6"/>
-              <w:right w:val="single" w:color="0F6E56" w:sz="6"/>
-            </w:tcBorders>
-            <w:shd w:fill="E1F5EE" w:color="auto" w:val="clear"/>
+              <w:top w:val="single" w:color="16325C" w:sz="6"/>
+              <w:left w:val="single" w:color="16325C" w:sz="6"/>
+              <w:bottom w:val="single" w:color="16325C" w:sz="6"/>
+              <w:right w:val="single" w:color="16325C" w:sz="6"/>
+            </w:tcBorders>
+            <w:shd w:fill="E8EDF6" w:color="auto" w:val="clear"/>
             <w:tcMar>
               <w:top w:type="dxa" w:w="50"/>
               <w:left w:type="dxa" w:w="90"/>
@@ -6345,12 +6569,12 @@
           <w:tcPr>
             <w:tcW w:type="dxa" w:w="4278"/>
             <w:tcBorders>
-              <w:top w:val="single" w:color="0F6E56" w:sz="6"/>
-              <w:left w:val="single" w:color="0F6E56" w:sz="6"/>
-              <w:bottom w:val="single" w:color="0F6E56" w:sz="6"/>
-              <w:right w:val="single" w:color="0F6E56" w:sz="6"/>
-            </w:tcBorders>
-            <w:shd w:fill="E1F5EE" w:color="auto" w:val="clear"/>
+              <w:top w:val="single" w:color="16325C" w:sz="6"/>
+              <w:left w:val="single" w:color="16325C" w:sz="6"/>
+              <w:bottom w:val="single" w:color="16325C" w:sz="6"/>
+              <w:right w:val="single" w:color="16325C" w:sz="6"/>
+            </w:tcBorders>
+            <w:shd w:fill="E8EDF6" w:color="auto" w:val="clear"/>
             <w:tcMar>
               <w:top w:type="dxa" w:w="50"/>
               <w:left w:type="dxa" w:w="90"/>
@@ -6377,12 +6601,12 @@
           <w:tcPr>
             <w:tcW w:type="dxa" w:w="1800"/>
             <w:tcBorders>
-              <w:top w:val="single" w:color="0F6E56" w:sz="6"/>
-              <w:left w:val="single" w:color="0F6E56" w:sz="6"/>
-              <w:bottom w:val="single" w:color="0F6E56" w:sz="6"/>
-              <w:right w:val="single" w:color="0F6E56" w:sz="6"/>
-            </w:tcBorders>
-            <w:shd w:fill="E1F5EE" w:color="auto" w:val="clear"/>
+              <w:top w:val="single" w:color="16325C" w:sz="6"/>
+              <w:left w:val="single" w:color="16325C" w:sz="6"/>
+              <w:bottom w:val="single" w:color="16325C" w:sz="6"/>
+              <w:right w:val="single" w:color="16325C" w:sz="6"/>
+            </w:tcBorders>
+            <w:shd w:fill="E8EDF6" w:color="auto" w:val="clear"/>
             <w:tcMar>
               <w:top w:type="dxa" w:w="50"/>
               <w:left w:type="dxa" w:w="90"/>
@@ -6457,12 +6681,12 @@
           <w:tcPr>
             <w:tcW w:type="dxa" w:w="560"/>
             <w:tcBorders>
-              <w:top w:val="single" w:color="0F6E56" w:sz="6"/>
-              <w:left w:val="single" w:color="0F6E56" w:sz="6"/>
-              <w:bottom w:val="single" w:color="0F6E56" w:sz="6"/>
-              <w:right w:val="single" w:color="0F6E56" w:sz="6"/>
-            </w:tcBorders>
-            <w:shd w:fill="E1F5EE" w:color="auto" w:val="clear"/>
+              <w:top w:val="single" w:color="16325C" w:sz="6"/>
+              <w:left w:val="single" w:color="16325C" w:sz="6"/>
+              <w:bottom w:val="single" w:color="16325C" w:sz="6"/>
+              <w:right w:val="single" w:color="16325C" w:sz="6"/>
+            </w:tcBorders>
+            <w:shd w:fill="E8EDF6" w:color="auto" w:val="clear"/>
             <w:tcMar>
               <w:top w:type="dxa" w:w="50"/>
               <w:left w:type="dxa" w:w="90"/>
@@ -6492,12 +6716,12 @@
           <w:tcPr>
             <w:tcW w:type="dxa" w:w="3000"/>
             <w:tcBorders>
-              <w:top w:val="single" w:color="0F6E56" w:sz="6"/>
-              <w:left w:val="single" w:color="0F6E56" w:sz="6"/>
-              <w:bottom w:val="single" w:color="0F6E56" w:sz="6"/>
-              <w:right w:val="single" w:color="0F6E56" w:sz="6"/>
-            </w:tcBorders>
-            <w:shd w:fill="E1F5EE" w:color="auto" w:val="clear"/>
+              <w:top w:val="single" w:color="16325C" w:sz="6"/>
+              <w:left w:val="single" w:color="16325C" w:sz="6"/>
+              <w:bottom w:val="single" w:color="16325C" w:sz="6"/>
+              <w:right w:val="single" w:color="16325C" w:sz="6"/>
+            </w:tcBorders>
+            <w:shd w:fill="E8EDF6" w:color="auto" w:val="clear"/>
             <w:tcMar>
               <w:top w:type="dxa" w:w="50"/>
               <w:left w:type="dxa" w:w="90"/>
@@ -6540,12 +6764,12 @@
           <w:tcPr>
             <w:tcW w:type="dxa" w:w="4278"/>
             <w:tcBorders>
-              <w:top w:val="single" w:color="0F6E56" w:sz="6"/>
-              <w:left w:val="single" w:color="0F6E56" w:sz="6"/>
-              <w:bottom w:val="single" w:color="0F6E56" w:sz="6"/>
-              <w:right w:val="single" w:color="0F6E56" w:sz="6"/>
-            </w:tcBorders>
-            <w:shd w:fill="E1F5EE" w:color="auto" w:val="clear"/>
+              <w:top w:val="single" w:color="16325C" w:sz="6"/>
+              <w:left w:val="single" w:color="16325C" w:sz="6"/>
+              <w:bottom w:val="single" w:color="16325C" w:sz="6"/>
+              <w:right w:val="single" w:color="16325C" w:sz="6"/>
+            </w:tcBorders>
+            <w:shd w:fill="E8EDF6" w:color="auto" w:val="clear"/>
             <w:tcMar>
               <w:top w:type="dxa" w:w="50"/>
               <w:left w:type="dxa" w:w="90"/>
@@ -6572,12 +6796,12 @@
           <w:tcPr>
             <w:tcW w:type="dxa" w:w="1800"/>
             <w:tcBorders>
-              <w:top w:val="single" w:color="0F6E56" w:sz="6"/>
-              <w:left w:val="single" w:color="0F6E56" w:sz="6"/>
-              <w:bottom w:val="single" w:color="0F6E56" w:sz="6"/>
-              <w:right w:val="single" w:color="0F6E56" w:sz="6"/>
-            </w:tcBorders>
-            <w:shd w:fill="E1F5EE" w:color="auto" w:val="clear"/>
+              <w:top w:val="single" w:color="16325C" w:sz="6"/>
+              <w:left w:val="single" w:color="16325C" w:sz="6"/>
+              <w:bottom w:val="single" w:color="16325C" w:sz="6"/>
+              <w:right w:val="single" w:color="16325C" w:sz="6"/>
+            </w:tcBorders>
+            <w:shd w:fill="E8EDF6" w:color="auto" w:val="clear"/>
             <w:tcMar>
               <w:top w:type="dxa" w:w="50"/>
               <w:left w:type="dxa" w:w="90"/>
@@ -6652,12 +6876,12 @@
           <w:tcPr>
             <w:tcW w:type="dxa" w:w="560"/>
             <w:tcBorders>
-              <w:top w:val="single" w:color="0F6E56" w:sz="6"/>
-              <w:left w:val="single" w:color="0F6E56" w:sz="6"/>
-              <w:bottom w:val="single" w:color="0F6E56" w:sz="6"/>
-              <w:right w:val="single" w:color="0F6E56" w:sz="6"/>
-            </w:tcBorders>
-            <w:shd w:fill="E1F5EE" w:color="auto" w:val="clear"/>
+              <w:top w:val="single" w:color="16325C" w:sz="6"/>
+              <w:left w:val="single" w:color="16325C" w:sz="6"/>
+              <w:bottom w:val="single" w:color="16325C" w:sz="6"/>
+              <w:right w:val="single" w:color="16325C" w:sz="6"/>
+            </w:tcBorders>
+            <w:shd w:fill="E8EDF6" w:color="auto" w:val="clear"/>
             <w:tcMar>
               <w:top w:type="dxa" w:w="50"/>
               <w:left w:type="dxa" w:w="90"/>
@@ -6687,12 +6911,12 @@
           <w:tcPr>
             <w:tcW w:type="dxa" w:w="3000"/>
             <w:tcBorders>
-              <w:top w:val="single" w:color="0F6E56" w:sz="6"/>
-              <w:left w:val="single" w:color="0F6E56" w:sz="6"/>
-              <w:bottom w:val="single" w:color="0F6E56" w:sz="6"/>
-              <w:right w:val="single" w:color="0F6E56" w:sz="6"/>
-            </w:tcBorders>
-            <w:shd w:fill="E1F5EE" w:color="auto" w:val="clear"/>
+              <w:top w:val="single" w:color="16325C" w:sz="6"/>
+              <w:left w:val="single" w:color="16325C" w:sz="6"/>
+              <w:bottom w:val="single" w:color="16325C" w:sz="6"/>
+              <w:right w:val="single" w:color="16325C" w:sz="6"/>
+            </w:tcBorders>
+            <w:shd w:fill="E8EDF6" w:color="auto" w:val="clear"/>
             <w:tcMar>
               <w:top w:type="dxa" w:w="50"/>
               <w:left w:type="dxa" w:w="90"/>
@@ -6735,12 +6959,12 @@
           <w:tcPr>
             <w:tcW w:type="dxa" w:w="4278"/>
             <w:tcBorders>
-              <w:top w:val="single" w:color="0F6E56" w:sz="6"/>
-              <w:left w:val="single" w:color="0F6E56" w:sz="6"/>
-              <w:bottom w:val="single" w:color="0F6E56" w:sz="6"/>
-              <w:right w:val="single" w:color="0F6E56" w:sz="6"/>
-            </w:tcBorders>
-            <w:shd w:fill="E1F5EE" w:color="auto" w:val="clear"/>
+              <w:top w:val="single" w:color="16325C" w:sz="6"/>
+              <w:left w:val="single" w:color="16325C" w:sz="6"/>
+              <w:bottom w:val="single" w:color="16325C" w:sz="6"/>
+              <w:right w:val="single" w:color="16325C" w:sz="6"/>
+            </w:tcBorders>
+            <w:shd w:fill="E8EDF6" w:color="auto" w:val="clear"/>
             <w:tcMar>
               <w:top w:type="dxa" w:w="50"/>
               <w:left w:type="dxa" w:w="90"/>
@@ -6767,12 +6991,12 @@
           <w:tcPr>
             <w:tcW w:type="dxa" w:w="1800"/>
             <w:tcBorders>
-              <w:top w:val="single" w:color="0F6E56" w:sz="6"/>
-              <w:left w:val="single" w:color="0F6E56" w:sz="6"/>
-              <w:bottom w:val="single" w:color="0F6E56" w:sz="6"/>
-              <w:right w:val="single" w:color="0F6E56" w:sz="6"/>
-            </w:tcBorders>
-            <w:shd w:fill="E1F5EE" w:color="auto" w:val="clear"/>
+              <w:top w:val="single" w:color="16325C" w:sz="6"/>
+              <w:left w:val="single" w:color="16325C" w:sz="6"/>
+              <w:bottom w:val="single" w:color="16325C" w:sz="6"/>
+              <w:right w:val="single" w:color="16325C" w:sz="6"/>
+            </w:tcBorders>
+            <w:shd w:fill="E8EDF6" w:color="auto" w:val="clear"/>
             <w:tcMar>
               <w:top w:type="dxa" w:w="50"/>
               <w:left w:type="dxa" w:w="90"/>
@@ -6847,12 +7071,12 @@
           <w:tcPr>
             <w:tcW w:type="dxa" w:w="560"/>
             <w:tcBorders>
-              <w:top w:val="single" w:color="0F6E56" w:sz="6"/>
-              <w:left w:val="single" w:color="0F6E56" w:sz="6"/>
-              <w:bottom w:val="single" w:color="0F6E56" w:sz="6"/>
-              <w:right w:val="single" w:color="0F6E56" w:sz="6"/>
-            </w:tcBorders>
-            <w:shd w:fill="E1F5EE" w:color="auto" w:val="clear"/>
+              <w:top w:val="single" w:color="16325C" w:sz="6"/>
+              <w:left w:val="single" w:color="16325C" w:sz="6"/>
+              <w:bottom w:val="single" w:color="16325C" w:sz="6"/>
+              <w:right w:val="single" w:color="16325C" w:sz="6"/>
+            </w:tcBorders>
+            <w:shd w:fill="E8EDF6" w:color="auto" w:val="clear"/>
             <w:tcMar>
               <w:top w:type="dxa" w:w="50"/>
               <w:left w:type="dxa" w:w="90"/>
@@ -6882,12 +7106,12 @@
           <w:tcPr>
             <w:tcW w:type="dxa" w:w="3000"/>
             <w:tcBorders>
-              <w:top w:val="single" w:color="0F6E56" w:sz="6"/>
-              <w:left w:val="single" w:color="0F6E56" w:sz="6"/>
-              <w:bottom w:val="single" w:color="0F6E56" w:sz="6"/>
-              <w:right w:val="single" w:color="0F6E56" w:sz="6"/>
-            </w:tcBorders>
-            <w:shd w:fill="E1F5EE" w:color="auto" w:val="clear"/>
+              <w:top w:val="single" w:color="16325C" w:sz="6"/>
+              <w:left w:val="single" w:color="16325C" w:sz="6"/>
+              <w:bottom w:val="single" w:color="16325C" w:sz="6"/>
+              <w:right w:val="single" w:color="16325C" w:sz="6"/>
+            </w:tcBorders>
+            <w:shd w:fill="E8EDF6" w:color="auto" w:val="clear"/>
             <w:tcMar>
               <w:top w:type="dxa" w:w="50"/>
               <w:left w:type="dxa" w:w="90"/>
@@ -6930,12 +7154,12 @@
           <w:tcPr>
             <w:tcW w:type="dxa" w:w="4278"/>
             <w:tcBorders>
-              <w:top w:val="single" w:color="0F6E56" w:sz="6"/>
-              <w:left w:val="single" w:color="0F6E56" w:sz="6"/>
-              <w:bottom w:val="single" w:color="0F6E56" w:sz="6"/>
-              <w:right w:val="single" w:color="0F6E56" w:sz="6"/>
-            </w:tcBorders>
-            <w:shd w:fill="E1F5EE" w:color="auto" w:val="clear"/>
+              <w:top w:val="single" w:color="16325C" w:sz="6"/>
+              <w:left w:val="single" w:color="16325C" w:sz="6"/>
+              <w:bottom w:val="single" w:color="16325C" w:sz="6"/>
+              <w:right w:val="single" w:color="16325C" w:sz="6"/>
+            </w:tcBorders>
+            <w:shd w:fill="E8EDF6" w:color="auto" w:val="clear"/>
             <w:tcMar>
               <w:top w:type="dxa" w:w="50"/>
               <w:left w:type="dxa" w:w="90"/>
@@ -6962,12 +7186,12 @@
           <w:tcPr>
             <w:tcW w:type="dxa" w:w="1800"/>
             <w:tcBorders>
-              <w:top w:val="single" w:color="0F6E56" w:sz="6"/>
-              <w:left w:val="single" w:color="0F6E56" w:sz="6"/>
-              <w:bottom w:val="single" w:color="0F6E56" w:sz="6"/>
-              <w:right w:val="single" w:color="0F6E56" w:sz="6"/>
-            </w:tcBorders>
-            <w:shd w:fill="E1F5EE" w:color="auto" w:val="clear"/>
+              <w:top w:val="single" w:color="16325C" w:sz="6"/>
+              <w:left w:val="single" w:color="16325C" w:sz="6"/>
+              <w:bottom w:val="single" w:color="16325C" w:sz="6"/>
+              <w:right w:val="single" w:color="16325C" w:sz="6"/>
+            </w:tcBorders>
+            <w:shd w:fill="E8EDF6" w:color="auto" w:val="clear"/>
             <w:tcMar>
               <w:top w:type="dxa" w:w="50"/>
               <w:left w:type="dxa" w:w="90"/>
@@ -7042,12 +7266,12 @@
           <w:tcPr>
             <w:tcW w:type="dxa" w:w="560"/>
             <w:tcBorders>
-              <w:top w:val="single" w:color="0F6E56" w:sz="6"/>
-              <w:left w:val="single" w:color="0F6E56" w:sz="6"/>
-              <w:bottom w:val="single" w:color="0F6E56" w:sz="6"/>
-              <w:right w:val="single" w:color="0F6E56" w:sz="6"/>
-            </w:tcBorders>
-            <w:shd w:fill="E1F5EE" w:color="auto" w:val="clear"/>
+              <w:top w:val="single" w:color="16325C" w:sz="6"/>
+              <w:left w:val="single" w:color="16325C" w:sz="6"/>
+              <w:bottom w:val="single" w:color="16325C" w:sz="6"/>
+              <w:right w:val="single" w:color="16325C" w:sz="6"/>
+            </w:tcBorders>
+            <w:shd w:fill="E8EDF6" w:color="auto" w:val="clear"/>
             <w:tcMar>
               <w:top w:type="dxa" w:w="50"/>
               <w:left w:type="dxa" w:w="90"/>
@@ -7077,12 +7301,12 @@
           <w:tcPr>
             <w:tcW w:type="dxa" w:w="3000"/>
             <w:tcBorders>
-              <w:top w:val="single" w:color="0F6E56" w:sz="6"/>
-              <w:left w:val="single" w:color="0F6E56" w:sz="6"/>
-              <w:bottom w:val="single" w:color="0F6E56" w:sz="6"/>
-              <w:right w:val="single" w:color="0F6E56" w:sz="6"/>
-            </w:tcBorders>
-            <w:shd w:fill="E1F5EE" w:color="auto" w:val="clear"/>
+              <w:top w:val="single" w:color="16325C" w:sz="6"/>
+              <w:left w:val="single" w:color="16325C" w:sz="6"/>
+              <w:bottom w:val="single" w:color="16325C" w:sz="6"/>
+              <w:right w:val="single" w:color="16325C" w:sz="6"/>
+            </w:tcBorders>
+            <w:shd w:fill="E8EDF6" w:color="auto" w:val="clear"/>
             <w:tcMar>
               <w:top w:type="dxa" w:w="50"/>
               <w:left w:type="dxa" w:w="90"/>
@@ -7125,12 +7349,12 @@
           <w:tcPr>
             <w:tcW w:type="dxa" w:w="4278"/>
             <w:tcBorders>
-              <w:top w:val="single" w:color="0F6E56" w:sz="6"/>
-              <w:left w:val="single" w:color="0F6E56" w:sz="6"/>
-              <w:bottom w:val="single" w:color="0F6E56" w:sz="6"/>
-              <w:right w:val="single" w:color="0F6E56" w:sz="6"/>
-            </w:tcBorders>
-            <w:shd w:fill="E1F5EE" w:color="auto" w:val="clear"/>
+              <w:top w:val="single" w:color="16325C" w:sz="6"/>
+              <w:left w:val="single" w:color="16325C" w:sz="6"/>
+              <w:bottom w:val="single" w:color="16325C" w:sz="6"/>
+              <w:right w:val="single" w:color="16325C" w:sz="6"/>
+            </w:tcBorders>
+            <w:shd w:fill="E8EDF6" w:color="auto" w:val="clear"/>
             <w:tcMar>
               <w:top w:type="dxa" w:w="50"/>
               <w:left w:type="dxa" w:w="90"/>
@@ -7157,12 +7381,12 @@
           <w:tcPr>
             <w:tcW w:type="dxa" w:w="1800"/>
             <w:tcBorders>
-              <w:top w:val="single" w:color="0F6E56" w:sz="6"/>
-              <w:left w:val="single" w:color="0F6E56" w:sz="6"/>
-              <w:bottom w:val="single" w:color="0F6E56" w:sz="6"/>
-              <w:right w:val="single" w:color="0F6E56" w:sz="6"/>
-            </w:tcBorders>
-            <w:shd w:fill="E1F5EE" w:color="auto" w:val="clear"/>
+              <w:top w:val="single" w:color="16325C" w:sz="6"/>
+              <w:left w:val="single" w:color="16325C" w:sz="6"/>
+              <w:bottom w:val="single" w:color="16325C" w:sz="6"/>
+              <w:right w:val="single" w:color="16325C" w:sz="6"/>
+            </w:tcBorders>
+            <w:shd w:fill="E8EDF6" w:color="auto" w:val="clear"/>
             <w:tcMar>
               <w:top w:type="dxa" w:w="50"/>
               <w:left w:type="dxa" w:w="90"/>
@@ -7237,12 +7461,12 @@
           <w:tcPr>
             <w:tcW w:type="dxa" w:w="560"/>
             <w:tcBorders>
-              <w:top w:val="single" w:color="0F6E56" w:sz="6"/>
-              <w:left w:val="single" w:color="0F6E56" w:sz="6"/>
-              <w:bottom w:val="single" w:color="0F6E56" w:sz="6"/>
-              <w:right w:val="single" w:color="0F6E56" w:sz="6"/>
-            </w:tcBorders>
-            <w:shd w:fill="E1F5EE" w:color="auto" w:val="clear"/>
+              <w:top w:val="single" w:color="16325C" w:sz="6"/>
+              <w:left w:val="single" w:color="16325C" w:sz="6"/>
+              <w:bottom w:val="single" w:color="16325C" w:sz="6"/>
+              <w:right w:val="single" w:color="16325C" w:sz="6"/>
+            </w:tcBorders>
+            <w:shd w:fill="E8EDF6" w:color="auto" w:val="clear"/>
             <w:tcMar>
               <w:top w:type="dxa" w:w="50"/>
               <w:left w:type="dxa" w:w="90"/>
@@ -7272,12 +7496,12 @@
           <w:tcPr>
             <w:tcW w:type="dxa" w:w="3000"/>
             <w:tcBorders>
-              <w:top w:val="single" w:color="0F6E56" w:sz="6"/>
-              <w:left w:val="single" w:color="0F6E56" w:sz="6"/>
-              <w:bottom w:val="single" w:color="0F6E56" w:sz="6"/>
-              <w:right w:val="single" w:color="0F6E56" w:sz="6"/>
-            </w:tcBorders>
-            <w:shd w:fill="E1F5EE" w:color="auto" w:val="clear"/>
+              <w:top w:val="single" w:color="16325C" w:sz="6"/>
+              <w:left w:val="single" w:color="16325C" w:sz="6"/>
+              <w:bottom w:val="single" w:color="16325C" w:sz="6"/>
+              <w:right w:val="single" w:color="16325C" w:sz="6"/>
+            </w:tcBorders>
+            <w:shd w:fill="E8EDF6" w:color="auto" w:val="clear"/>
             <w:tcMar>
               <w:top w:type="dxa" w:w="50"/>
               <w:left w:type="dxa" w:w="90"/>
@@ -7320,12 +7544,12 @@
           <w:tcPr>
             <w:tcW w:type="dxa" w:w="4278"/>
             <w:tcBorders>
-              <w:top w:val="single" w:color="0F6E56" w:sz="6"/>
-              <w:left w:val="single" w:color="0F6E56" w:sz="6"/>
-              <w:bottom w:val="single" w:color="0F6E56" w:sz="6"/>
-              <w:right w:val="single" w:color="0F6E56" w:sz="6"/>
-            </w:tcBorders>
-            <w:shd w:fill="E1F5EE" w:color="auto" w:val="clear"/>
+              <w:top w:val="single" w:color="16325C" w:sz="6"/>
+              <w:left w:val="single" w:color="16325C" w:sz="6"/>
+              <w:bottom w:val="single" w:color="16325C" w:sz="6"/>
+              <w:right w:val="single" w:color="16325C" w:sz="6"/>
+            </w:tcBorders>
+            <w:shd w:fill="E8EDF6" w:color="auto" w:val="clear"/>
             <w:tcMar>
               <w:top w:type="dxa" w:w="50"/>
               <w:left w:type="dxa" w:w="90"/>
@@ -7352,12 +7576,12 @@
           <w:tcPr>
             <w:tcW w:type="dxa" w:w="1800"/>
             <w:tcBorders>
-              <w:top w:val="single" w:color="0F6E56" w:sz="6"/>
-              <w:left w:val="single" w:color="0F6E56" w:sz="6"/>
-              <w:bottom w:val="single" w:color="0F6E56" w:sz="6"/>
-              <w:right w:val="single" w:color="0F6E56" w:sz="6"/>
-            </w:tcBorders>
-            <w:shd w:fill="E1F5EE" w:color="auto" w:val="clear"/>
+              <w:top w:val="single" w:color="16325C" w:sz="6"/>
+              <w:left w:val="single" w:color="16325C" w:sz="6"/>
+              <w:bottom w:val="single" w:color="16325C" w:sz="6"/>
+              <w:right w:val="single" w:color="16325C" w:sz="6"/>
+            </w:tcBorders>
+            <w:shd w:fill="E8EDF6" w:color="auto" w:val="clear"/>
             <w:tcMar>
               <w:top w:type="dxa" w:w="50"/>
               <w:left w:type="dxa" w:w="90"/>
@@ -7432,12 +7656,12 @@
           <w:tcPr>
             <w:tcW w:type="dxa" w:w="560"/>
             <w:tcBorders>
-              <w:top w:val="single" w:color="0F6E56" w:sz="6"/>
-              <w:left w:val="single" w:color="0F6E56" w:sz="6"/>
-              <w:bottom w:val="single" w:color="0F6E56" w:sz="6"/>
-              <w:right w:val="single" w:color="0F6E56" w:sz="6"/>
-            </w:tcBorders>
-            <w:shd w:fill="E1F5EE" w:color="auto" w:val="clear"/>
+              <w:top w:val="single" w:color="16325C" w:sz="6"/>
+              <w:left w:val="single" w:color="16325C" w:sz="6"/>
+              <w:bottom w:val="single" w:color="16325C" w:sz="6"/>
+              <w:right w:val="single" w:color="16325C" w:sz="6"/>
+            </w:tcBorders>
+            <w:shd w:fill="E8EDF6" w:color="auto" w:val="clear"/>
             <w:tcMar>
               <w:top w:type="dxa" w:w="50"/>
               <w:left w:type="dxa" w:w="90"/>
@@ -7467,12 +7691,12 @@
           <w:tcPr>
             <w:tcW w:type="dxa" w:w="3000"/>
             <w:tcBorders>
-              <w:top w:val="single" w:color="0F6E56" w:sz="6"/>
-              <w:left w:val="single" w:color="0F6E56" w:sz="6"/>
-              <w:bottom w:val="single" w:color="0F6E56" w:sz="6"/>
-              <w:right w:val="single" w:color="0F6E56" w:sz="6"/>
-            </w:tcBorders>
-            <w:shd w:fill="E1F5EE" w:color="auto" w:val="clear"/>
+              <w:top w:val="single" w:color="16325C" w:sz="6"/>
+              <w:left w:val="single" w:color="16325C" w:sz="6"/>
+              <w:bottom w:val="single" w:color="16325C" w:sz="6"/>
+              <w:right w:val="single" w:color="16325C" w:sz="6"/>
+            </w:tcBorders>
+            <w:shd w:fill="E8EDF6" w:color="auto" w:val="clear"/>
             <w:tcMar>
               <w:top w:type="dxa" w:w="50"/>
               <w:left w:type="dxa" w:w="90"/>
@@ -7515,12 +7739,12 @@
           <w:tcPr>
             <w:tcW w:type="dxa" w:w="4278"/>
             <w:tcBorders>
-              <w:top w:val="single" w:color="0F6E56" w:sz="6"/>
-              <w:left w:val="single" w:color="0F6E56" w:sz="6"/>
-              <w:bottom w:val="single" w:color="0F6E56" w:sz="6"/>
-              <w:right w:val="single" w:color="0F6E56" w:sz="6"/>
-            </w:tcBorders>
-            <w:shd w:fill="E1F5EE" w:color="auto" w:val="clear"/>
+              <w:top w:val="single" w:color="16325C" w:sz="6"/>
+              <w:left w:val="single" w:color="16325C" w:sz="6"/>
+              <w:bottom w:val="single" w:color="16325C" w:sz="6"/>
+              <w:right w:val="single" w:color="16325C" w:sz="6"/>
+            </w:tcBorders>
+            <w:shd w:fill="E8EDF6" w:color="auto" w:val="clear"/>
             <w:tcMar>
               <w:top w:type="dxa" w:w="50"/>
               <w:left w:type="dxa" w:w="90"/>
@@ -7547,12 +7771,12 @@
           <w:tcPr>
             <w:tcW w:type="dxa" w:w="1800"/>
             <w:tcBorders>
-              <w:top w:val="single" w:color="0F6E56" w:sz="6"/>
-              <w:left w:val="single" w:color="0F6E56" w:sz="6"/>
-              <w:bottom w:val="single" w:color="0F6E56" w:sz="6"/>
-              <w:right w:val="single" w:color="0F6E56" w:sz="6"/>
-            </w:tcBorders>
-            <w:shd w:fill="E1F5EE" w:color="auto" w:val="clear"/>
+              <w:top w:val="single" w:color="16325C" w:sz="6"/>
+              <w:left w:val="single" w:color="16325C" w:sz="6"/>
+              <w:bottom w:val="single" w:color="16325C" w:sz="6"/>
+              <w:right w:val="single" w:color="16325C" w:sz="6"/>
+            </w:tcBorders>
+            <w:shd w:fill="E8EDF6" w:color="auto" w:val="clear"/>
             <w:tcMar>
               <w:top w:type="dxa" w:w="50"/>
               <w:left w:type="dxa" w:w="90"/>
@@ -7627,12 +7851,12 @@
           <w:tcPr>
             <w:tcW w:type="dxa" w:w="560"/>
             <w:tcBorders>
-              <w:top w:val="single" w:color="854F0B" w:sz="6"/>
-              <w:left w:val="single" w:color="854F0B" w:sz="6"/>
-              <w:bottom w:val="single" w:color="854F0B" w:sz="6"/>
-              <w:right w:val="single" w:color="854F0B" w:sz="6"/>
-            </w:tcBorders>
-            <w:shd w:fill="FAEEDA" w:color="auto" w:val="clear"/>
+              <w:top w:val="single" w:color="A04F00" w:sz="6"/>
+              <w:left w:val="single" w:color="A04F00" w:sz="6"/>
+              <w:bottom w:val="single" w:color="A04F00" w:sz="6"/>
+              <w:right w:val="single" w:color="A04F00" w:sz="6"/>
+            </w:tcBorders>
+            <w:shd w:fill="FDECDD" w:color="auto" w:val="clear"/>
             <w:tcMar>
               <w:top w:type="dxa" w:w="50"/>
               <w:left w:type="dxa" w:w="90"/>
@@ -7662,12 +7886,12 @@
           <w:tcPr>
             <w:tcW w:type="dxa" w:w="3000"/>
             <w:tcBorders>
-              <w:top w:val="single" w:color="854F0B" w:sz="6"/>
-              <w:left w:val="single" w:color="854F0B" w:sz="6"/>
-              <w:bottom w:val="single" w:color="854F0B" w:sz="6"/>
-              <w:right w:val="single" w:color="854F0B" w:sz="6"/>
-            </w:tcBorders>
-            <w:shd w:fill="FAEEDA" w:color="auto" w:val="clear"/>
+              <w:top w:val="single" w:color="A04F00" w:sz="6"/>
+              <w:left w:val="single" w:color="A04F00" w:sz="6"/>
+              <w:bottom w:val="single" w:color="A04F00" w:sz="6"/>
+              <w:right w:val="single" w:color="A04F00" w:sz="6"/>
+            </w:tcBorders>
+            <w:shd w:fill="FDECDD" w:color="auto" w:val="clear"/>
             <w:tcMar>
               <w:top w:type="dxa" w:w="50"/>
               <w:left w:type="dxa" w:w="90"/>
@@ -7710,12 +7934,12 @@
           <w:tcPr>
             <w:tcW w:type="dxa" w:w="4278"/>
             <w:tcBorders>
-              <w:top w:val="single" w:color="854F0B" w:sz="6"/>
-              <w:left w:val="single" w:color="854F0B" w:sz="6"/>
-              <w:bottom w:val="single" w:color="854F0B" w:sz="6"/>
-              <w:right w:val="single" w:color="854F0B" w:sz="6"/>
-            </w:tcBorders>
-            <w:shd w:fill="FAEEDA" w:color="auto" w:val="clear"/>
+              <w:top w:val="single" w:color="A04F00" w:sz="6"/>
+              <w:left w:val="single" w:color="A04F00" w:sz="6"/>
+              <w:bottom w:val="single" w:color="A04F00" w:sz="6"/>
+              <w:right w:val="single" w:color="A04F00" w:sz="6"/>
+            </w:tcBorders>
+            <w:shd w:fill="FDECDD" w:color="auto" w:val="clear"/>
             <w:tcMar>
               <w:top w:type="dxa" w:w="50"/>
               <w:left w:type="dxa" w:w="90"/>
@@ -7742,12 +7966,12 @@
           <w:tcPr>
             <w:tcW w:type="dxa" w:w="1800"/>
             <w:tcBorders>
-              <w:top w:val="single" w:color="854F0B" w:sz="6"/>
-              <w:left w:val="single" w:color="854F0B" w:sz="6"/>
-              <w:bottom w:val="single" w:color="854F0B" w:sz="6"/>
-              <w:right w:val="single" w:color="854F0B" w:sz="6"/>
-            </w:tcBorders>
-            <w:shd w:fill="FAEEDA" w:color="auto" w:val="clear"/>
+              <w:top w:val="single" w:color="A04F00" w:sz="6"/>
+              <w:left w:val="single" w:color="A04F00" w:sz="6"/>
+              <w:bottom w:val="single" w:color="A04F00" w:sz="6"/>
+              <w:right w:val="single" w:color="A04F00" w:sz="6"/>
+            </w:tcBorders>
+            <w:shd w:fill="FDECDD" w:color="auto" w:val="clear"/>
             <w:tcMar>
               <w:top w:type="dxa" w:w="50"/>
               <w:left w:type="dxa" w:w="90"/>
@@ -7822,12 +8046,12 @@
           <w:tcPr>
             <w:tcW w:type="dxa" w:w="560"/>
             <w:tcBorders>
-              <w:top w:val="single" w:color="534AB7" w:sz="6"/>
-              <w:left w:val="single" w:color="534AB7" w:sz="6"/>
-              <w:bottom w:val="single" w:color="534AB7" w:sz="6"/>
-              <w:right w:val="single" w:color="534AB7" w:sz="6"/>
-            </w:tcBorders>
-            <w:shd w:fill="EEEDFE" w:color="auto" w:val="clear"/>
+              <w:top w:val="single" w:color="C9A24D" w:sz="6"/>
+              <w:left w:val="single" w:color="C9A24D" w:sz="6"/>
+              <w:bottom w:val="single" w:color="C9A24D" w:sz="6"/>
+              <w:right w:val="single" w:color="C9A24D" w:sz="6"/>
+            </w:tcBorders>
+            <w:shd w:fill="FBF4E3" w:color="auto" w:val="clear"/>
             <w:tcMar>
               <w:top w:type="dxa" w:w="50"/>
               <w:left w:type="dxa" w:w="90"/>
@@ -7857,12 +8081,12 @@
           <w:tcPr>
             <w:tcW w:type="dxa" w:w="3000"/>
             <w:tcBorders>
-              <w:top w:val="single" w:color="534AB7" w:sz="6"/>
-              <w:left w:val="single" w:color="534AB7" w:sz="6"/>
-              <w:bottom w:val="single" w:color="534AB7" w:sz="6"/>
-              <w:right w:val="single" w:color="534AB7" w:sz="6"/>
-            </w:tcBorders>
-            <w:shd w:fill="EEEDFE" w:color="auto" w:val="clear"/>
+              <w:top w:val="single" w:color="C9A24D" w:sz="6"/>
+              <w:left w:val="single" w:color="C9A24D" w:sz="6"/>
+              <w:bottom w:val="single" w:color="C9A24D" w:sz="6"/>
+              <w:right w:val="single" w:color="C9A24D" w:sz="6"/>
+            </w:tcBorders>
+            <w:shd w:fill="FBF4E3" w:color="auto" w:val="clear"/>
             <w:tcMar>
               <w:top w:type="dxa" w:w="50"/>
               <w:left w:type="dxa" w:w="90"/>
@@ -7905,12 +8129,12 @@
           <w:tcPr>
             <w:tcW w:type="dxa" w:w="4278"/>
             <w:tcBorders>
-              <w:top w:val="single" w:color="534AB7" w:sz="6"/>
-              <w:left w:val="single" w:color="534AB7" w:sz="6"/>
-              <w:bottom w:val="single" w:color="534AB7" w:sz="6"/>
-              <w:right w:val="single" w:color="534AB7" w:sz="6"/>
-            </w:tcBorders>
-            <w:shd w:fill="EEEDFE" w:color="auto" w:val="clear"/>
+              <w:top w:val="single" w:color="C9A24D" w:sz="6"/>
+              <w:left w:val="single" w:color="C9A24D" w:sz="6"/>
+              <w:bottom w:val="single" w:color="C9A24D" w:sz="6"/>
+              <w:right w:val="single" w:color="C9A24D" w:sz="6"/>
+            </w:tcBorders>
+            <w:shd w:fill="FBF4E3" w:color="auto" w:val="clear"/>
             <w:tcMar>
               <w:top w:type="dxa" w:w="50"/>
               <w:left w:type="dxa" w:w="90"/>
@@ -7929,7 +8153,7 @@
                 <w:sz w:val="19"/>
                 <w:szCs w:val="19"/>
               </w:rPr>
-              <w:t xml:space="preserve">Revisar e aprovar 30, 60, 90 dias e 12 meses</w:t>
+              <w:t xml:space="preserve">Reler o quadro Para o treino; revisar e aprovar 30, 60, 90 dias e 12 meses</w:t>
             </w:r>
           </w:p>
         </w:tc>
@@ -7937,12 +8161,12 @@
           <w:tcPr>
             <w:tcW w:type="dxa" w:w="1800"/>
             <w:tcBorders>
-              <w:top w:val="single" w:color="534AB7" w:sz="6"/>
-              <w:left w:val="single" w:color="534AB7" w:sz="6"/>
-              <w:bottom w:val="single" w:color="534AB7" w:sz="6"/>
-              <w:right w:val="single" w:color="534AB7" w:sz="6"/>
-            </w:tcBorders>
-            <w:shd w:fill="EEEDFE" w:color="auto" w:val="clear"/>
+              <w:top w:val="single" w:color="C9A24D" w:sz="6"/>
+              <w:left w:val="single" w:color="C9A24D" w:sz="6"/>
+              <w:bottom w:val="single" w:color="C9A24D" w:sz="6"/>
+              <w:right w:val="single" w:color="C9A24D" w:sz="6"/>
+            </w:tcBorders>
+            <w:shd w:fill="FBF4E3" w:color="auto" w:val="clear"/>
             <w:tcMar>
               <w:top w:type="dxa" w:w="50"/>
               <w:left w:type="dxa" w:w="90"/>
@@ -8017,12 +8241,12 @@
           <w:tcPr>
             <w:tcW w:type="dxa" w:w="560"/>
             <w:tcBorders>
-              <w:top w:val="single" w:color="534AB7" w:sz="6"/>
-              <w:left w:val="single" w:color="534AB7" w:sz="6"/>
-              <w:bottom w:val="single" w:color="534AB7" w:sz="6"/>
-              <w:right w:val="single" w:color="534AB7" w:sz="6"/>
-            </w:tcBorders>
-            <w:shd w:fill="EEEDFE" w:color="auto" w:val="clear"/>
+              <w:top w:val="single" w:color="C9A24D" w:sz="6"/>
+              <w:left w:val="single" w:color="C9A24D" w:sz="6"/>
+              <w:bottom w:val="single" w:color="C9A24D" w:sz="6"/>
+              <w:right w:val="single" w:color="C9A24D" w:sz="6"/>
+            </w:tcBorders>
+            <w:shd w:fill="FBF4E3" w:color="auto" w:val="clear"/>
             <w:tcMar>
               <w:top w:type="dxa" w:w="50"/>
               <w:left w:type="dxa" w:w="90"/>
@@ -8052,12 +8276,12 @@
           <w:tcPr>
             <w:tcW w:type="dxa" w:w="3000"/>
             <w:tcBorders>
-              <w:top w:val="single" w:color="534AB7" w:sz="6"/>
-              <w:left w:val="single" w:color="534AB7" w:sz="6"/>
-              <w:bottom w:val="single" w:color="534AB7" w:sz="6"/>
-              <w:right w:val="single" w:color="534AB7" w:sz="6"/>
-            </w:tcBorders>
-            <w:shd w:fill="EEEDFE" w:color="auto" w:val="clear"/>
+              <w:top w:val="single" w:color="C9A24D" w:sz="6"/>
+              <w:left w:val="single" w:color="C9A24D" w:sz="6"/>
+              <w:bottom w:val="single" w:color="C9A24D" w:sz="6"/>
+              <w:right w:val="single" w:color="C9A24D" w:sz="6"/>
+            </w:tcBorders>
+            <w:shd w:fill="FBF4E3" w:color="auto" w:val="clear"/>
             <w:tcMar>
               <w:top w:type="dxa" w:w="50"/>
               <w:left w:type="dxa" w:w="90"/>
@@ -8100,12 +8324,12 @@
           <w:tcPr>
             <w:tcW w:type="dxa" w:w="4278"/>
             <w:tcBorders>
-              <w:top w:val="single" w:color="534AB7" w:sz="6"/>
-              <w:left w:val="single" w:color="534AB7" w:sz="6"/>
-              <w:bottom w:val="single" w:color="534AB7" w:sz="6"/>
-              <w:right w:val="single" w:color="534AB7" w:sz="6"/>
-            </w:tcBorders>
-            <w:shd w:fill="EEEDFE" w:color="auto" w:val="clear"/>
+              <w:top w:val="single" w:color="C9A24D" w:sz="6"/>
+              <w:left w:val="single" w:color="C9A24D" w:sz="6"/>
+              <w:bottom w:val="single" w:color="C9A24D" w:sz="6"/>
+              <w:right w:val="single" w:color="C9A24D" w:sz="6"/>
+            </w:tcBorders>
+            <w:shd w:fill="FBF4E3" w:color="auto" w:val="clear"/>
             <w:tcMar>
               <w:top w:type="dxa" w:w="50"/>
               <w:left w:type="dxa" w:w="90"/>
@@ -8132,12 +8356,12 @@
           <w:tcPr>
             <w:tcW w:type="dxa" w:w="1800"/>
             <w:tcBorders>
-              <w:top w:val="single" w:color="534AB7" w:sz="6"/>
-              <w:left w:val="single" w:color="534AB7" w:sz="6"/>
-              <w:bottom w:val="single" w:color="534AB7" w:sz="6"/>
-              <w:right w:val="single" w:color="534AB7" w:sz="6"/>
-            </w:tcBorders>
-            <w:shd w:fill="EEEDFE" w:color="auto" w:val="clear"/>
+              <w:top w:val="single" w:color="C9A24D" w:sz="6"/>
+              <w:left w:val="single" w:color="C9A24D" w:sz="6"/>
+              <w:bottom w:val="single" w:color="C9A24D" w:sz="6"/>
+              <w:right w:val="single" w:color="C9A24D" w:sz="6"/>
+            </w:tcBorders>
+            <w:shd w:fill="FBF4E3" w:color="auto" w:val="clear"/>
             <w:tcMar>
               <w:top w:type="dxa" w:w="50"/>
               <w:left w:type="dxa" w:w="90"/>
@@ -8665,7 +8889,7 @@
         <w:sz w:val="17"/>
         <w:szCs w:val="17"/>
       </w:rPr>
-      <w:t xml:space="preserve">POP-AVI-001 · Uso da Avaliação Integrada · v1.0</w:t>
+      <w:t xml:space="preserve">POP-AVI-001 · Uso da Avaliação Integrada · v1.1</w:t>
     </w:r>
   </w:p>
 </w:hdr>
@@ -8687,7 +8911,7 @@
         <w:sz w:val="17"/>
         <w:szCs w:val="17"/>
       </w:rPr>
-      <w:t xml:space="preserve">POP-AVI-001 · Uso da Avaliação Integrada · v1.0</w:t>
+      <w:t xml:space="preserve">POP-AVI-001 · Uso da Avaliação Integrada · v1.1</w:t>
     </w:r>
   </w:p>
 </w:hdr>
@@ -9163,7 +9387,7 @@
       <w:rFonts w:ascii="Calibri" w:cs="Calibri" w:eastAsia="Calibri" w:hAnsi="Calibri"/>
       <w:b/>
       <w:bCs/>
-      <w:color w:val="0F4C5C"/>
+      <w:color w:val="16325C"/>
       <w:sz w:val="28"/>
       <w:szCs w:val="28"/>
     </w:rPr>

</xml_diff>

<commit_message>
Postura e movimento em modo simples (padrao) e modo avancado opcional; POP v1.2
- Modo simples: 3 fotos, lista curta do que o avaliador viu por vista, agachamento e flexao de tronco, parecer curto com atencoes na execucao do treino; 10 a 12 min em vez de 20 a 30
- Modo avancado atras de um botao: lateral esquerda, analise automatica das fotos, escapulas, video e os outros tres movimentos; ficha com registros avancados abre no avancado; nada foi apagado
- Relatorio tecnico e discrepancias leem os achados marcados; supervisao da Nina passa a contar Postura e movimento (lista curta e movimentos, nao so fotos)
- posturaSimples.ts como funcao pura com 32 verificacoes; todos os 22 testes OK; conferido no navegador com ficha ficticia nos dois modos
- P2 (video) passa a ser opcional; POP v1.2 e guia de desenhos com a flexao de tronco; docs 00 e 03 atualizados

Co-Authored-By: Claude Sonnet 5.5 <noreply@anthropic.com>
</commit_message>
<xml_diff>
--- a/POP-Uso-da-Avaliacao-Integrada.docx
+++ b/POP-Uso-da-Avaliacao-Integrada.docx
@@ -243,7 +243,7 @@
                 <w:sz w:val="20"/>
                 <w:szCs w:val="20"/>
               </w:rPr>
-              <w:t xml:space="preserve">1.1</w:t>
+              <w:t xml:space="preserve">1.2</w:t>
             </w:r>
           </w:p>
         </w:tc>
@@ -310,7 +310,7 @@
                 <w:sz w:val="20"/>
                 <w:szCs w:val="20"/>
               </w:rPr>
-              <w:t xml:space="preserve">25/10/2026</w:t>
+              <w:t xml:space="preserve">26/10/2026</w:t>
             </w:r>
           </w:p>
         </w:tc>
@@ -375,7 +375,7 @@
                 <w:sz w:val="20"/>
                 <w:szCs w:val="20"/>
               </w:rPr>
-              <w:t xml:space="preserve">25/10/2027 ou antes, se o sistema mudar</w:t>
+              <w:t xml:space="preserve">26/10/2027 ou antes, se o sistema mudar</w:t>
             </w:r>
           </w:p>
         </w:tc>
@@ -2942,7 +2942,7 @@
           <w:sz w:val="24"/>
           <w:szCs w:val="24"/>
         </w:rPr>
-        <w:t xml:space="preserve">Etapa 9 - Postural e movimento (Paula)</w:t>
+        <w:t xml:space="preserve">Etapa 9 - Postura e movimento (Paula)</w:t>
       </w:r>
     </w:p>
     <w:p>
@@ -2968,7 +2968,7 @@
           <w:sz w:val="20"/>
           <w:szCs w:val="20"/>
         </w:rPr>
-        <w:t xml:space="preserve">20 a 30 min</w:t>
+        <w:t xml:space="preserve">10 a 12 min no modo simples; 20 a 30 min com o modo avançado</w:t>
       </w:r>
     </w:p>
     <w:p>
@@ -2987,7 +2987,7 @@
           <w:sz w:val="22"/>
           <w:szCs w:val="22"/>
         </w:rPr>
-        <w:t xml:space="preserve">Abra a aba Postural e Biomecânica. Paciente descalço, com roupa que deixe ver os pontos de referência, e com o consentimento registrado.</w:t>
+        <w:t xml:space="preserve">Abra a aba Postural e Biomecânica. O modo simples já vem ligado: três fotos, uma lista curta do que você viu e dois testes de movimento. Aluno descalço, com roupa que deixe ver os pontos de referência, e com o consentimento registrado.</w:t>
       </w:r>
     </w:p>
     <w:p>
@@ -3006,7 +3006,7 @@
           <w:sz w:val="22"/>
           <w:szCs w:val="22"/>
         </w:rPr>
-        <w:t xml:space="preserve">Câmera no tripé, na altura aproximada do quadril, sempre na mesma distância (marque o ponto no chão com fita). Faça as 4 fotos: anterior, posterior, lateral direita e lateral esquerda.</w:t>
+        <w:t xml:space="preserve">Câmera no tripé, na altura aproximada do quadril, sempre na mesma distância (marque o ponto no chão com fita). Faça 3 fotos: de frente, de costas e de lado (lateral direita).</w:t>
       </w:r>
     </w:p>
     <w:p>
@@ -3025,7 +3025,7 @@
           <w:sz w:val="22"/>
           <w:szCs w:val="22"/>
         </w:rPr>
-        <w:t xml:space="preserve">O sistema analisa cada foto no próprio aparelho (pontos, ângulos, linha de prumo). Leia, corrija o que for preciso e edite o parecer.</w:t>
+        <w:t xml:space="preserve">Em "O que você viu nas fotos", marque só o que estiver claro, vista por vista. Se não notar nada, marque "Nada de relevante nesta vista". Assimetrias leves são comuns e, sozinhas, não indicam problema; valorize o que se repete entre as vistas e os movimentos ou vem com dor ou limitação.</w:t>
       </w:r>
     </w:p>
     <w:p>
@@ -3044,7 +3044,7 @@
           <w:sz w:val="22"/>
           <w:szCs w:val="22"/>
         </w:rPr>
-        <w:t xml:space="preserve">Se for útil, marque as escápulas na foto posterior.</w:t>
+        <w:t xml:space="preserve">Movimentos: peça o agachamento e a flexão de tronco e registre o ponto máximo em foto, de lado e de frente (ou de costas, na flexão). Marque o roteiro de cada vista e, na flexão, a distância dedos-chão.</w:t>
       </w:r>
     </w:p>
     <w:p>
@@ -3063,7 +3063,7 @@
           <w:sz w:val="22"/>
           <w:szCs w:val="22"/>
         </w:rPr>
-        <w:t xml:space="preserve">Movimentos, em foto ou vídeo, nas vistas sagital e frontal: flexão, extensão e inclinação lateral do tronco, agachamento sem carga e elevação dos braços. O vídeo pode ser anexado (até 45 MB); o sistema informa se o vídeo foi adequado para leitura e mostra a margem de erro.</w:t>
+        <w:t xml:space="preserve">Leia o parecer da Dra. Paula, que é curto: o que foi visto, os movimentos e a "Atenção na execução do treino". São pontos de observação, não prescrição nem promessa de corrigir a postura. Edite o que quiser.</w:t>
       </w:r>
     </w:p>
     <w:p>
@@ -3083,6 +3083,25 @@
           <w:szCs w:val="22"/>
         </w:rPr>
         <w:t xml:space="preserve">Nas reavaliações use exatamente a mesma distância, altura da câmera e posição: sem isso a comparação não vale.</w:t>
+      </w:r>
+    </w:p>
+    <w:p>
+      <w:pPr>
+        <w:pStyle w:val="ListParagraph"/>
+        <w:numPr>
+          <w:ilvl w:val="0"/>
+          <w:numId w:val="2"/>
+        </w:numPr>
+        <w:spacing w:after="60" w:line="264"/>
+      </w:pPr>
+      <w:r>
+        <w:rPr>
+          <w:rFonts w:ascii="Calibri" w:cs="Calibri" w:eastAsia="Calibri" w:hAnsi="Calibri"/>
+          <w:color w:val="1F2937"/>
+          <w:sz w:val="22"/>
+          <w:szCs w:val="22"/>
+        </w:rPr>
+        <w:t xml:space="preserve">Modo avançado (opcional): o botão "Mostrar modo avançado" traz a lateral esquerda, a análise automática das fotos, a marcação das escápulas, o vídeo com análise e os movimentos elevação dos braços, extensão e inclinação lateral. Use só quando houver um motivo. A ficha que já tem esses registros abre sozinha no avançado.</w:t>
       </w:r>
     </w:p>
     <w:p>
@@ -3164,7 +3183,7 @@
           <w:sz w:val="18"/>
           <w:szCs w:val="18"/>
         </w:rPr>
-        <w:t xml:space="preserve">Figura 1 - As quatro vistas padronizadas: anterior, posterior, lateral direita e lateral esquerda. Esquema ilustrativo.</w:t>
+        <w:t xml:space="preserve">Figura 1 - As vistas padronizadas. No modo simples usam-se as três primeiras (de frente, de costas e de lado, a lateral direita); a lateral esquerda é do modo avançado. Esquema ilustrativo.</w:t>
       </w:r>
     </w:p>
     <w:p>
@@ -3246,7 +3265,7 @@
           <w:sz w:val="24"/>
           <w:szCs w:val="24"/>
         </w:rPr>
-        <w:t xml:space="preserve">Como filmar os movimentos (esquemas)</w:t>
+        <w:t xml:space="preserve">Os dois movimentos do modo simples (esquemas)</w:t>
       </w:r>
     </w:p>
     <w:p>
@@ -3261,7 +3280,7 @@
           <w:sz w:val="20"/>
           <w:szCs w:val="20"/>
         </w:rPr>
-        <w:t xml:space="preserve">Vídeo de 5 a 30 segundos com o movimento inteiro: posição inicial, ponto máximo e retorno. Filme de lado e de frente (ou de costas, na elevação dos braços), com a câmera parada e o paciente dos pés à cabeça no quadro. Peça para ir só até onde conseguir manter o controle e sem dor.</w:t>
+        <w:t xml:space="preserve">Foto no ponto máximo do movimento, de lado e de frente (ou de costas, na flexão), com a câmera parada e o aluno dos pés à cabeça no quadro. Peça para ir só até onde conseguir manter o controle e sem dor.</w:t>
       </w:r>
     </w:p>
     <w:p>
@@ -3325,7 +3344,7 @@
           <w:sz w:val="18"/>
           <w:szCs w:val="18"/>
         </w:rPr>
-        <w:t xml:space="preserve">Figura 3 - Agachamento: início e ponto máximo, de lado e de frente. Esquema ilustrativo.</w:t>
+        <w:t xml:space="preserve">Figura 3 - Agachamento: início e ponto máximo, de lado e de frente (ou de costas). Esquema ilustrativo.</w:t>
       </w:r>
     </w:p>
     <w:p>
@@ -3339,7 +3358,7 @@
           <wp:inline distT="0" distB="0" distL="0" distR="0">
             <wp:extent cx="5715000" cy="2286000"/>
             <wp:effectExtent t="0" r="0" b="0" l="0"/>
-            <wp:docPr id="5" name="mov2.png" descr="Elevação dos braços" title="Elevação dos braços"/>
+            <wp:docPr id="5" name="mov2.png" descr="Flexão de tronco" title="Flexão de tronco"/>
             <wp:cNvGraphicFramePr>
               <a:graphicFrameLocks xmlns:a="http://schemas.openxmlformats.org/drawingml/2006/main" noChangeAspect="1"/>
             </wp:cNvGraphicFramePr>
@@ -3389,7 +3408,25 @@
           <w:sz w:val="18"/>
           <w:szCs w:val="18"/>
         </w:rPr>
-        <w:t xml:space="preserve">Figura 4 - Elevação dos braços: início e ponto máximo, de lado e de frente. Esquema ilustrativo.</w:t>
+        <w:t xml:space="preserve">Figura 4 - Flexão de tronco: início e ponto máximo, de lado e de frente (ou de costas). Esquema ilustrativo.</w:t>
+      </w:r>
+    </w:p>
+    <w:p>
+      <w:pPr>
+        <w:pStyle w:val="Heading2"/>
+        <w:keepNext/>
+        <w:spacing w:after="80" w:before="200"/>
+      </w:pPr>
+      <w:r>
+        <w:rPr>
+          <w:rFonts w:ascii="Calibri" w:cs="Calibri" w:eastAsia="Calibri" w:hAnsi="Calibri"/>
+          <w:b/>
+          <w:bCs/>
+          <w:color w:val="1F2937"/>
+          <w:sz w:val="24"/>
+          <w:szCs w:val="24"/>
+        </w:rPr>
+        <w:t xml:space="preserve">Movimentos do modo avançado (opcionais)</w:t>
       </w:r>
     </w:p>
     <w:p>
@@ -3403,7 +3440,7 @@
           <wp:inline distT="0" distB="0" distL="0" distR="0">
             <wp:extent cx="5715000" cy="2286000"/>
             <wp:effectExtent t="0" r="0" b="0" l="0"/>
-            <wp:docPr id="6" name="mov3.png" descr="Extensão de tronco" title="Extensão de tronco"/>
+            <wp:docPr id="6" name="mov3.png" descr="Elevação dos braços" title="Elevação dos braços"/>
             <wp:cNvGraphicFramePr>
               <a:graphicFrameLocks xmlns:a="http://schemas.openxmlformats.org/drawingml/2006/main" noChangeAspect="1"/>
             </wp:cNvGraphicFramePr>
@@ -3453,7 +3490,7 @@
           <w:sz w:val="18"/>
           <w:szCs w:val="18"/>
         </w:rPr>
-        <w:t xml:space="preserve">Figura 5 - Extensão de tronco: início e ponto máximo, de lado e de frente. Esquema ilustrativo.</w:t>
+        <w:t xml:space="preserve">Figura 5 - Elevação dos braços (modo avançado): início e ponto máximo, de lado e de frente (ou de costas). Esquema ilustrativo.</w:t>
       </w:r>
     </w:p>
     <w:p>
@@ -3467,7 +3504,7 @@
           <wp:inline distT="0" distB="0" distL="0" distR="0">
             <wp:extent cx="5715000" cy="2286000"/>
             <wp:effectExtent t="0" r="0" b="0" l="0"/>
-            <wp:docPr id="7" name="mov4.png" descr="Inclinação lateral" title="Inclinação lateral"/>
+            <wp:docPr id="7" name="mov4.png" descr="Extensão de tronco" title="Extensão de tronco"/>
             <wp:cNvGraphicFramePr>
               <a:graphicFrameLocks xmlns:a="http://schemas.openxmlformats.org/drawingml/2006/main" noChangeAspect="1"/>
             </wp:cNvGraphicFramePr>
@@ -3517,7 +3554,71 @@
           <w:sz w:val="18"/>
           <w:szCs w:val="18"/>
         </w:rPr>
-        <w:t xml:space="preserve">Figura 6 - Inclinação lateral: início e ponto máximo, de lado e de frente. Esquema ilustrativo.</w:t>
+        <w:t xml:space="preserve">Figura 6 - Extensão de tronco (modo avançado): início e ponto máximo, de lado e de frente (ou de costas). Esquema ilustrativo.</w:t>
+      </w:r>
+    </w:p>
+    <w:p>
+      <w:pPr>
+        <w:keepNext/>
+        <w:spacing w:after="40" w:before="120"/>
+        <w:jc w:val="center"/>
+      </w:pPr>
+      <w:r>
+        <w:drawing>
+          <wp:inline distT="0" distB="0" distL="0" distR="0">
+            <wp:extent cx="5715000" cy="2286000"/>
+            <wp:effectExtent t="0" r="0" b="0" l="0"/>
+            <wp:docPr id="8" name="mov5.png" descr="Inclinação lateral" title="Inclinação lateral"/>
+            <wp:cNvGraphicFramePr>
+              <a:graphicFrameLocks xmlns:a="http://schemas.openxmlformats.org/drawingml/2006/main" noChangeAspect="1"/>
+            </wp:cNvGraphicFramePr>
+            <a:graphic xmlns:a="http://schemas.openxmlformats.org/drawingml/2006/main">
+              <a:graphicData uri="http://schemas.openxmlformats.org/drawingml/2006/picture">
+                <pic:pic xmlns:pic="http://schemas.openxmlformats.org/drawingml/2006/picture">
+                  <pic:nvPicPr>
+                    <pic:cNvPr id="0" name="" descr=""/>
+                    <pic:cNvPicPr>
+                      <a:picLocks noChangeAspect="1" noChangeArrowheads="1"/>
+                    </pic:cNvPicPr>
+                  </pic:nvPicPr>
+                  <pic:blipFill>
+                    <a:blip r:embed="rId18" cstate="none"/>
+                    <a:srcRect/>
+                    <a:stretch>
+                      <a:fillRect/>
+                    </a:stretch>
+                  </pic:blipFill>
+                  <pic:spPr bwMode="auto">
+                    <a:xfrm>
+                      <a:off x="0" y="0"/>
+                      <a:ext cx="5715000" cy="2286000"/>
+                    </a:xfrm>
+                    <a:prstGeom prst="rect">
+                      <a:avLst/>
+                    </a:prstGeom>
+                  </pic:spPr>
+                </pic:pic>
+              </a:graphicData>
+            </a:graphic>
+          </wp:inline>
+        </w:drawing>
+      </w:r>
+    </w:p>
+    <w:p>
+      <w:pPr>
+        <w:spacing w:after="160"/>
+        <w:jc w:val="center"/>
+      </w:pPr>
+      <w:r>
+        <w:rPr>
+          <w:rFonts w:ascii="Calibri" w:cs="Calibri" w:eastAsia="Calibri" w:hAnsi="Calibri"/>
+          <w:i/>
+          <w:iCs/>
+          <w:color w:val="5B6472"/>
+          <w:sz w:val="18"/>
+          <w:szCs w:val="18"/>
+        </w:rPr>
+        <w:t xml:space="preserve">Figura 7 - Inclinação lateral (modo avançado): início e ponto máximo, de lado e de frente (ou de costas). Esquema ilustrativo.</w:t>
       </w:r>
     </w:p>
     <w:p>
@@ -4548,7 +4649,7 @@
                 <w:sz w:val="20"/>
                 <w:szCs w:val="20"/>
               </w:rPr>
-              <w:t xml:space="preserve">Paciente não terminou a anamnese</w:t>
+              <w:t xml:space="preserve">Aluno com dor, lesão ou assimetria marcada nas fotos</w:t>
             </w:r>
           </w:p>
         </w:tc>
@@ -4579,7 +4680,7 @@
                 <w:sz w:val="20"/>
                 <w:szCs w:val="20"/>
               </w:rPr>
-              <w:t xml:space="preserve">A coluna "Avaliação" mostra "aguarda anamnese". Reenvie o link ou conclua na clínica com o botão "Continuar a anamnese".</w:t>
+              <w:t xml:space="preserve">Não conclua que a postura causa a dor. Registre o que viu e, no movimento, onde dói e em qual momento; siga a liberação e os sinais de alerta. Dor com sinal de alerta ou limitação importante: encaminhe.</w:t>
             </w:r>
           </w:p>
         </w:tc>
@@ -4616,7 +4717,7 @@
                 <w:sz w:val="20"/>
                 <w:szCs w:val="20"/>
               </w:rPr>
-              <w:t xml:space="preserve">Confiança do perfil baixa</w:t>
+              <w:t xml:space="preserve">Paciente não terminou a anamnese</w:t>
             </w:r>
           </w:p>
         </w:tc>
@@ -4647,7 +4748,7 @@
                 <w:sz w:val="20"/>
                 <w:szCs w:val="20"/>
               </w:rPr>
-              <w:t xml:space="preserve">Faltam dados em 6 ou mais domínios. Abra o quadro na aba Perfil Integrado e complete o que ele lista. Não é sinal de que a pessoa está mal.</w:t>
+              <w:t xml:space="preserve">A coluna "Avaliação" mostra "aguarda anamnese". Reenvie o link ou conclua na clínica com o botão "Continuar a anamnese".</w:t>
             </w:r>
           </w:p>
         </w:tc>
@@ -4684,7 +4785,7 @@
                 <w:sz w:val="20"/>
                 <w:szCs w:val="20"/>
               </w:rPr>
-              <w:t xml:space="preserve">Instrumento que a clínica não tem</w:t>
+              <w:t xml:space="preserve">Confiança do perfil baixa</w:t>
             </w:r>
           </w:p>
         </w:tc>
@@ -4715,7 +4816,7 @@
                 <w:sz w:val="20"/>
                 <w:szCs w:val="20"/>
               </w:rPr>
-              <w:t xml:space="preserve">Use a alternativa prevista (por exemplo, fita na parede no lugar do estadiômetro; dobras no lugar da bioimpedância) e registre a limitação.</w:t>
+              <w:t xml:space="preserve">Faltam dados em 6 ou mais domínios. Abra o quadro na aba Perfil Integrado e complete o que ele lista. Não é sinal de que a pessoa está mal.</w:t>
             </w:r>
           </w:p>
         </w:tc>
@@ -4752,7 +4853,7 @@
                 <w:sz w:val="20"/>
                 <w:szCs w:val="20"/>
               </w:rPr>
-              <w:t xml:space="preserve">Vídeo de movimento inadequado</w:t>
+              <w:t xml:space="preserve">Instrumento que a clínica não tem</w:t>
             </w:r>
           </w:p>
         </w:tc>
@@ -4783,7 +4884,7 @@
                 <w:sz w:val="20"/>
                 <w:szCs w:val="20"/>
               </w:rPr>
-              <w:t xml:space="preserve">O sistema indica o porquê (luz, enquadramento, corpo cortado). Refaça com o mesmo enquadramento e anote a margem de erro.</w:t>
+              <w:t xml:space="preserve">Use a alternativa prevista (por exemplo, fita na parede no lugar do estadiômetro; dobras no lugar da bioimpedância) e registre a limitação.</w:t>
             </w:r>
           </w:p>
         </w:tc>
@@ -4820,7 +4921,7 @@
                 <w:sz w:val="20"/>
                 <w:szCs w:val="20"/>
               </w:rPr>
-              <w:t xml:space="preserve">Valores muito diferentes do esperado</w:t>
+              <w:t xml:space="preserve">Vídeo de movimento inadequado</w:t>
             </w:r>
           </w:p>
         </w:tc>
@@ -4851,7 +4952,7 @@
                 <w:sz w:val="20"/>
                 <w:szCs w:val="20"/>
               </w:rPr>
-              <w:t xml:space="preserve">Repita a medida. Um teste isolado não decide conduta: cruze com os outros e com a anamnese.</w:t>
+              <w:t xml:space="preserve">O sistema indica o porquê (luz, enquadramento, corpo cortado). Refaça com o mesmo enquadramento e anote a margem de erro.</w:t>
             </w:r>
           </w:p>
         </w:tc>
@@ -4888,6 +4989,74 @@
                 <w:sz w:val="20"/>
                 <w:szCs w:val="20"/>
               </w:rPr>
+              <w:t xml:space="preserve">Valores muito diferentes do esperado</w:t>
+            </w:r>
+          </w:p>
+        </w:tc>
+        <w:tc>
+          <w:tcPr>
+            <w:tcW w:type="dxa" w:w="6438"/>
+            <w:tcBorders>
+              <w:top w:val="single" w:color="BFC5CE" w:sz="4"/>
+              <w:left w:val="single" w:color="BFC5CE" w:sz="4"/>
+              <w:bottom w:val="single" w:color="BFC5CE" w:sz="4"/>
+              <w:right w:val="single" w:color="BFC5CE" w:sz="4"/>
+            </w:tcBorders>
+            <w:tcMar>
+              <w:top w:type="dxa" w:w="70"/>
+              <w:left w:type="dxa" w:w="110"/>
+              <w:bottom w:type="dxa" w:w="70"/>
+              <w:right w:type="dxa" w:w="110"/>
+            </w:tcMar>
+            <w:vAlign w:val="top"/>
+          </w:tcPr>
+          <w:p>
+            <w:pPr>
+              <w:spacing w:after="40" w:line="252"/>
+            </w:pPr>
+            <w:r>
+              <w:rPr>
+                <w:rFonts w:ascii="Calibri" w:cs="Calibri" w:eastAsia="Calibri" w:hAnsi="Calibri"/>
+                <w:sz w:val="20"/>
+                <w:szCs w:val="20"/>
+              </w:rPr>
+              <w:t xml:space="preserve">Repita a medida. Um teste isolado não decide conduta: cruze com os outros e com a anamnese.</w:t>
+            </w:r>
+          </w:p>
+        </w:tc>
+      </w:tr>
+      <w:tr>
+        <w:trPr>
+          <w:cantSplit/>
+          <w:tblHeader w:val="off"/>
+        </w:trPr>
+        <w:tc>
+          <w:tcPr>
+            <w:tcW w:type="dxa" w:w="3200"/>
+            <w:tcBorders>
+              <w:top w:val="single" w:color="BFC5CE" w:sz="4"/>
+              <w:left w:val="single" w:color="BFC5CE" w:sz="4"/>
+              <w:bottom w:val="single" w:color="BFC5CE" w:sz="4"/>
+              <w:right w:val="single" w:color="BFC5CE" w:sz="4"/>
+            </w:tcBorders>
+            <w:tcMar>
+              <w:top w:type="dxa" w:w="70"/>
+              <w:left w:type="dxa" w:w="110"/>
+              <w:bottom w:type="dxa" w:w="70"/>
+              <w:right w:type="dxa" w:w="110"/>
+            </w:tcMar>
+            <w:vAlign w:val="top"/>
+          </w:tcPr>
+          <w:p>
+            <w:pPr>
+              <w:spacing w:after="40" w:line="252"/>
+            </w:pPr>
+            <w:r>
+              <w:rPr>
+                <w:rFonts w:ascii="Calibri" w:cs="Calibri" w:eastAsia="Calibri" w:hAnsi="Calibri"/>
+                <w:sz w:val="20"/>
+                <w:szCs w:val="20"/>
+              </w:rPr>
               <w:t xml:space="preserve">Erro ou dúvida no sistema</w:t>
             </w:r>
           </w:p>
@@ -5048,7 +5217,7 @@
           <w:sz w:val="22"/>
           <w:szCs w:val="22"/>
         </w:rPr>
-        <w:t xml:space="preserve">Na clínica, sem contar a anamnese em casa e a devolutiva, as etapas de recepção e de coleta (2 e 5 a 11) somam de 1 hora e 15 minutos a 2 horas e 15 minutos, conforme os testes escolhidos. A devolutiva leva de 15 a 20 minutos. Esses números devem ser confirmados com a sua rotina nas primeiras avaliações.</w:t>
+        <w:t xml:space="preserve">Na clínica, sem contar a anamnese em casa e a devolutiva, as etapas de recepção e de coleta (2 e 5 a 11) somam de cerca de 1 hora a 2 horas, conforme os testes escolhidos e o modo da postura (simples ou avançado). A devolutiva leva de 15 a 20 minutos. Esses números devem ser confirmados com a sua rotina nas primeiras avaliações.</w:t>
       </w:r>
     </w:p>
     <w:p>
@@ -5470,6 +5639,105 @@
           </w:p>
         </w:tc>
       </w:tr>
+      <w:tr>
+        <w:trPr>
+          <w:cantSplit/>
+          <w:tblHeader w:val="off"/>
+        </w:trPr>
+        <w:tc>
+          <w:tcPr>
+            <w:tcW w:type="dxa" w:w="1300"/>
+            <w:tcBorders>
+              <w:top w:val="single" w:color="BFC5CE" w:sz="4"/>
+              <w:left w:val="single" w:color="BFC5CE" w:sz="4"/>
+              <w:bottom w:val="single" w:color="BFC5CE" w:sz="4"/>
+              <w:right w:val="single" w:color="BFC5CE" w:sz="4"/>
+            </w:tcBorders>
+            <w:tcMar>
+              <w:top w:type="dxa" w:w="70"/>
+              <w:left w:type="dxa" w:w="110"/>
+              <w:bottom w:type="dxa" w:w="70"/>
+              <w:right w:type="dxa" w:w="110"/>
+            </w:tcMar>
+            <w:vAlign w:val="top"/>
+          </w:tcPr>
+          <w:p>
+            <w:pPr>
+              <w:spacing w:after="40" w:line="252"/>
+            </w:pPr>
+            <w:r>
+              <w:rPr>
+                <w:rFonts w:ascii="Calibri" w:cs="Calibri" w:eastAsia="Calibri" w:hAnsi="Calibri"/>
+                <w:sz w:val="20"/>
+                <w:szCs w:val="20"/>
+              </w:rPr>
+              <w:t xml:space="preserve">1.2</w:t>
+            </w:r>
+          </w:p>
+        </w:tc>
+        <w:tc>
+          <w:tcPr>
+            <w:tcW w:type="dxa" w:w="2000"/>
+            <w:tcBorders>
+              <w:top w:val="single" w:color="BFC5CE" w:sz="4"/>
+              <w:left w:val="single" w:color="BFC5CE" w:sz="4"/>
+              <w:bottom w:val="single" w:color="BFC5CE" w:sz="4"/>
+              <w:right w:val="single" w:color="BFC5CE" w:sz="4"/>
+            </w:tcBorders>
+            <w:tcMar>
+              <w:top w:type="dxa" w:w="70"/>
+              <w:left w:type="dxa" w:w="110"/>
+              <w:bottom w:type="dxa" w:w="70"/>
+              <w:right w:type="dxa" w:w="110"/>
+            </w:tcMar>
+            <w:vAlign w:val="top"/>
+          </w:tcPr>
+          <w:p>
+            <w:pPr>
+              <w:spacing w:after="40" w:line="252"/>
+            </w:pPr>
+            <w:r>
+              <w:rPr>
+                <w:rFonts w:ascii="Calibri" w:cs="Calibri" w:eastAsia="Calibri" w:hAnsi="Calibri"/>
+                <w:sz w:val="20"/>
+                <w:szCs w:val="20"/>
+              </w:rPr>
+              <w:t xml:space="preserve">26/10/2026</w:t>
+            </w:r>
+          </w:p>
+        </w:tc>
+        <w:tc>
+          <w:tcPr>
+            <w:tcW w:type="dxa" w:w="6338"/>
+            <w:tcBorders>
+              <w:top w:val="single" w:color="BFC5CE" w:sz="4"/>
+              <w:left w:val="single" w:color="BFC5CE" w:sz="4"/>
+              <w:bottom w:val="single" w:color="BFC5CE" w:sz="4"/>
+              <w:right w:val="single" w:color="BFC5CE" w:sz="4"/>
+            </w:tcBorders>
+            <w:tcMar>
+              <w:top w:type="dxa" w:w="70"/>
+              <w:left w:type="dxa" w:w="110"/>
+              <w:bottom w:type="dxa" w:w="70"/>
+              <w:right w:type="dxa" w:w="110"/>
+            </w:tcMar>
+            <w:vAlign w:val="top"/>
+          </w:tcPr>
+          <w:p>
+            <w:pPr>
+              <w:spacing w:after="40" w:line="252"/>
+            </w:pPr>
+            <w:r>
+              <w:rPr>
+                <w:rFonts w:ascii="Calibri" w:cs="Calibri" w:eastAsia="Calibri" w:hAnsi="Calibri"/>
+                <w:sz w:val="20"/>
+                <w:szCs w:val="20"/>
+              </w:rPr>
+              <w:t xml:space="preserve">Postura e movimento em modo simples (3 fotos, lista curta e 2 movimentos; 10 a 12 min); modo avançado opcional; tempo total e organograma atualizados.</w:t>
+            </w:r>
+          </w:p>
+        </w:tc>
+      </w:tr>
     </w:tbl>
     <w:p>
       <w:pPr>
@@ -7327,7 +7595,7 @@
                 <w:sz w:val="19"/>
                 <w:szCs w:val="19"/>
               </w:rPr>
-              <w:t xml:space="preserve">Postural e movimento</w:t>
+              <w:t xml:space="preserve">Postura e movimento</w:t>
             </w:r>
           </w:p>
           <w:p>
@@ -7373,7 +7641,7 @@
                 <w:sz w:val="19"/>
                 <w:szCs w:val="19"/>
               </w:rPr>
-              <w:t xml:space="preserve">Fotos em 4 vistas, escápulas, movimentos em foto ou vídeo</w:t>
+              <w:t xml:space="preserve">3 fotos, lista curta do que viu, agachamento e flexão de tronco</w:t>
             </w:r>
           </w:p>
         </w:tc>
@@ -7408,7 +7676,7 @@
                 <w:sz w:val="19"/>
                 <w:szCs w:val="19"/>
               </w:rPr>
-              <w:t xml:space="preserve">20 a 30 min</w:t>
+              <w:t xml:space="preserve">10 a 12 min</w:t>
             </w:r>
           </w:p>
         </w:tc>
@@ -8889,7 +9157,7 @@
         <w:sz w:val="17"/>
         <w:szCs w:val="17"/>
       </w:rPr>
-      <w:t xml:space="preserve">POP-AVI-001 · Uso da Avaliação Integrada · v1.1</w:t>
+      <w:t xml:space="preserve">POP-AVI-001 · Uso da Avaliação Integrada · v1.2</w:t>
     </w:r>
   </w:p>
 </w:hdr>
@@ -8911,7 +9179,7 @@
         <w:sz w:val="17"/>
         <w:szCs w:val="17"/>
       </w:rPr>
-      <w:t xml:space="preserve">POP-AVI-001 · Uso da Avaliação Integrada · v1.1</w:t>
+      <w:t xml:space="preserve">POP-AVI-001 · Uso da Avaliação Integrada · v1.2</w:t>
     </w:r>
   </w:p>
 </w:hdr>

</xml_diff>

<commit_message>
Modo simples da postura: graus automaticos, marcacoes sugeridas para confirmar, video e angulo pre-marcado
- Analise automatica das fotos (graus) roda sozinha ao enviar a foto no modo simples, nas 3 vistas
- Lista curta mostra o que o sistema sugeriu a partir dos graus (selo sugerido, medida de origem, aceitar e aceitar todas); nada e gravado sem o ok
- Movimentos: video e medida de angulo de volta ao modo simples; ao enviar foto ou video o modelo de pose pre-marca o angulo (joelho no agachamento, inclinacao do tronco, braco, desvio lateral) e o cartao pede Esta certo, confirmar; so entra no parecer depois do ok
- preMarcacao.ts como funcoes puras com 24 verificacoes; todos os 23 testes OK; conferido na tela com ficha ficticia; POP v1.3; P2 volta a ser lembrete ativo; docs 00 e 03

Co-Authored-By: Claude Sonnet 5.5 <noreply@anthropic.com>
</commit_message>
<xml_diff>
--- a/POP-Uso-da-Avaliacao-Integrada.docx
+++ b/POP-Uso-da-Avaliacao-Integrada.docx
@@ -243,7 +243,7 @@
                 <w:sz w:val="20"/>
                 <w:szCs w:val="20"/>
               </w:rPr>
-              <w:t xml:space="preserve">1.2</w:t>
+              <w:t xml:space="preserve">1.3</w:t>
             </w:r>
           </w:p>
         </w:tc>
@@ -2968,7 +2968,7 @@
           <w:sz w:val="20"/>
           <w:szCs w:val="20"/>
         </w:rPr>
-        <w:t xml:space="preserve">10 a 12 min no modo simples; 20 a 30 min com o modo avançado</w:t>
+        <w:t xml:space="preserve">12 a 15 min no modo simples; 20 a 30 min com o modo avançado</w:t>
       </w:r>
     </w:p>
     <w:p>
@@ -2987,7 +2987,7 @@
           <w:sz w:val="22"/>
           <w:szCs w:val="22"/>
         </w:rPr>
-        <w:t xml:space="preserve">Abra a aba Postural e Biomecânica. O modo simples já vem ligado: três fotos, uma lista curta do que você viu e dois testes de movimento. Aluno descalço, com roupa que deixe ver os pontos de referência, e com o consentimento registrado.</w:t>
+        <w:t xml:space="preserve">Abra a aba Postural e Biomecânica. O modo simples já vem ligado: três fotos com a análise automática dos graus, uma lista curta do que você viu e dois testes de movimento (em foto ou vídeo). Aluno descalço, com roupa que deixe ver os pontos de referência, e com o consentimento registrado.</w:t>
       </w:r>
     </w:p>
     <w:p>
@@ -3025,7 +3025,7 @@
           <w:sz w:val="22"/>
           <w:szCs w:val="22"/>
         </w:rPr>
-        <w:t xml:space="preserve">Em "O que você viu nas fotos", marque só o que estiver claro, vista por vista. Se não notar nada, marque "Nada de relevante nesta vista". Assimetrias leves são comuns e, sozinhas, não indicam problema; valorize o que se repete entre as vistas e os movimentos ou vem com dor ou limitação.</w:t>
+        <w:t xml:space="preserve">Ao enviar cada foto, o sistema analisa sozinho, no seu computador (a foto não vai a nenhum serviço de IA), e mostra os graus: ombros, quadris, cabeça, tronco, joelhos e linha de prumo. Os cortes de 3° (discreta) e 6° (evidente) são referências práticas do sistema, sem validação publicada. Confira os pontos na foto.</w:t>
       </w:r>
     </w:p>
     <w:p>
@@ -3044,7 +3044,7 @@
           <w:sz w:val="22"/>
           <w:szCs w:val="22"/>
         </w:rPr>
-        <w:t xml:space="preserve">Movimentos: peça o agachamento e a flexão de tronco e registre o ponto máximo em foto, de lado e de frente (ou de costas, na flexão). Marque o roteiro de cada vista e, na flexão, a distância dedos-chão.</w:t>
+        <w:t xml:space="preserve">Em "O que você viu nas fotos", o sistema já sugere, em dourado e com o selo "sugerido", o que achou nos graus. Aceite uma a uma ou use "Aceitar todas as sugestões", e marque o que mais você viu. Se não notar nada, marque "Nada de relevante nesta vista". Nada vale sem o seu ok. Assimetrias leves são comuns e, sozinhas, não indicam problema.</w:t>
       </w:r>
     </w:p>
     <w:p>
@@ -3063,7 +3063,7 @@
           <w:sz w:val="22"/>
           <w:szCs w:val="22"/>
         </w:rPr>
-        <w:t xml:space="preserve">Leia o parecer da Dra. Paula, que é curto: o que foi visto, os movimentos e a "Atenção na execução do treino". São pontos de observação, não prescrição nem promessa de corrigir a postura. Edite o que quiser.</w:t>
+        <w:t xml:space="preserve">Movimentos: peça o agachamento e a flexão de tronco e registre o ponto máximo em foto ou em vídeo, de lado e de frente (ou de costas, na flexão). Ao enviar, o sistema pré-marca o ângulo na foto (por exemplo, o do joelho no agachamento): confirme com "Está certo, confirmar" ou refaça à mão. Enquanto não confirmar, a medida não entra no parecer. Marque o roteiro de cada vista e, na flexão, a distância dedos-chão.</w:t>
       </w:r>
     </w:p>
     <w:p>
@@ -3082,7 +3082,7 @@
           <w:sz w:val="22"/>
           <w:szCs w:val="22"/>
         </w:rPr>
-        <w:t xml:space="preserve">Nas reavaliações use exatamente a mesma distância, altura da câmera e posição: sem isso a comparação não vale.</w:t>
+        <w:t xml:space="preserve">Se usar vídeo, filme como nos desenhos (5 a 30 segundos, câmera parada, corpo inteiro no quadro). O sistema diz se o vídeo foi adequado para leitura e mostra a margem de erro dos ângulos.</w:t>
       </w:r>
     </w:p>
     <w:p>
@@ -3101,7 +3101,45 @@
           <w:sz w:val="22"/>
           <w:szCs w:val="22"/>
         </w:rPr>
-        <w:t xml:space="preserve">Modo avançado (opcional): o botão "Mostrar modo avançado" traz a lateral esquerda, a análise automática das fotos, a marcação das escápulas, o vídeo com análise e os movimentos elevação dos braços, extensão e inclinação lateral. Use só quando houver um motivo. A ficha que já tem esses registros abre sozinha no avançado.</w:t>
+        <w:t xml:space="preserve">Leia o parecer da Dra. Paula, que é curto: o que foi visto, os movimentos e a "Atenção na execução do treino". São pontos de observação, não prescrição nem promessa de corrigir a postura. Edite o que quiser.</w:t>
+      </w:r>
+    </w:p>
+    <w:p>
+      <w:pPr>
+        <w:pStyle w:val="ListParagraph"/>
+        <w:numPr>
+          <w:ilvl w:val="0"/>
+          <w:numId w:val="2"/>
+        </w:numPr>
+        <w:spacing w:after="60" w:line="264"/>
+      </w:pPr>
+      <w:r>
+        <w:rPr>
+          <w:rFonts w:ascii="Calibri" w:cs="Calibri" w:eastAsia="Calibri" w:hAnsi="Calibri"/>
+          <w:color w:val="1F2937"/>
+          <w:sz w:val="22"/>
+          <w:szCs w:val="22"/>
+        </w:rPr>
+        <w:t xml:space="preserve">Nas reavaliações use exatamente a mesma distância, altura da câmera e posição: sem isso a comparação não vale.</w:t>
+      </w:r>
+    </w:p>
+    <w:p>
+      <w:pPr>
+        <w:pStyle w:val="ListParagraph"/>
+        <w:numPr>
+          <w:ilvl w:val="0"/>
+          <w:numId w:val="2"/>
+        </w:numPr>
+        <w:spacing w:after="60" w:line="264"/>
+      </w:pPr>
+      <w:r>
+        <w:rPr>
+          <w:rFonts w:ascii="Calibri" w:cs="Calibri" w:eastAsia="Calibri" w:hAnsi="Calibri"/>
+          <w:color w:val="1F2937"/>
+          <w:sz w:val="22"/>
+          <w:szCs w:val="22"/>
+        </w:rPr>
+        <w:t xml:space="preserve">Modo avançado (opcional): o botão "Mostrar modo avançado" traz a lateral esquerda, a marcação das escápulas e os movimentos elevação dos braços, extensão e inclinação lateral. Use só quando houver um motivo. A ficha que já tem esses registros abre sozinha no avançado.</w:t>
       </w:r>
     </w:p>
     <w:p>
@@ -3280,7 +3318,7 @@
           <w:sz w:val="20"/>
           <w:szCs w:val="20"/>
         </w:rPr>
-        <w:t xml:space="preserve">Foto no ponto máximo do movimento, de lado e de frente (ou de costas, na flexão), com a câmera parada e o aluno dos pés à cabeça no quadro. Peça para ir só até onde conseguir manter o controle e sem dor.</w:t>
+        <w:t xml:space="preserve">Foto ou vídeo no ponto máximo do movimento, de lado e de frente (ou de costas, na flexão), com a câmera parada e o aluno dos pés à cabeça no quadro. Peça para ir só até onde conseguir manter o controle e sem dor.</w:t>
       </w:r>
     </w:p>
     <w:p>
@@ -5738,6 +5776,105 @@
           </w:p>
         </w:tc>
       </w:tr>
+      <w:tr>
+        <w:trPr>
+          <w:cantSplit/>
+          <w:tblHeader w:val="off"/>
+        </w:trPr>
+        <w:tc>
+          <w:tcPr>
+            <w:tcW w:type="dxa" w:w="1300"/>
+            <w:tcBorders>
+              <w:top w:val="single" w:color="BFC5CE" w:sz="4"/>
+              <w:left w:val="single" w:color="BFC5CE" w:sz="4"/>
+              <w:bottom w:val="single" w:color="BFC5CE" w:sz="4"/>
+              <w:right w:val="single" w:color="BFC5CE" w:sz="4"/>
+            </w:tcBorders>
+            <w:tcMar>
+              <w:top w:type="dxa" w:w="70"/>
+              <w:left w:type="dxa" w:w="110"/>
+              <w:bottom w:type="dxa" w:w="70"/>
+              <w:right w:type="dxa" w:w="110"/>
+            </w:tcMar>
+            <w:vAlign w:val="top"/>
+          </w:tcPr>
+          <w:p>
+            <w:pPr>
+              <w:spacing w:after="40" w:line="252"/>
+            </w:pPr>
+            <w:r>
+              <w:rPr>
+                <w:rFonts w:ascii="Calibri" w:cs="Calibri" w:eastAsia="Calibri" w:hAnsi="Calibri"/>
+                <w:sz w:val="20"/>
+                <w:szCs w:val="20"/>
+              </w:rPr>
+              <w:t xml:space="preserve">1.3</w:t>
+            </w:r>
+          </w:p>
+        </w:tc>
+        <w:tc>
+          <w:tcPr>
+            <w:tcW w:type="dxa" w:w="2000"/>
+            <w:tcBorders>
+              <w:top w:val="single" w:color="BFC5CE" w:sz="4"/>
+              <w:left w:val="single" w:color="BFC5CE" w:sz="4"/>
+              <w:bottom w:val="single" w:color="BFC5CE" w:sz="4"/>
+              <w:right w:val="single" w:color="BFC5CE" w:sz="4"/>
+            </w:tcBorders>
+            <w:tcMar>
+              <w:top w:type="dxa" w:w="70"/>
+              <w:left w:type="dxa" w:w="110"/>
+              <w:bottom w:type="dxa" w:w="70"/>
+              <w:right w:type="dxa" w:w="110"/>
+            </w:tcMar>
+            <w:vAlign w:val="top"/>
+          </w:tcPr>
+          <w:p>
+            <w:pPr>
+              <w:spacing w:after="40" w:line="252"/>
+            </w:pPr>
+            <w:r>
+              <w:rPr>
+                <w:rFonts w:ascii="Calibri" w:cs="Calibri" w:eastAsia="Calibri" w:hAnsi="Calibri"/>
+                <w:sz w:val="20"/>
+                <w:szCs w:val="20"/>
+              </w:rPr>
+              <w:t xml:space="preserve">26/10/2026</w:t>
+            </w:r>
+          </w:p>
+        </w:tc>
+        <w:tc>
+          <w:tcPr>
+            <w:tcW w:type="dxa" w:w="6338"/>
+            <w:tcBorders>
+              <w:top w:val="single" w:color="BFC5CE" w:sz="4"/>
+              <w:left w:val="single" w:color="BFC5CE" w:sz="4"/>
+              <w:bottom w:val="single" w:color="BFC5CE" w:sz="4"/>
+              <w:right w:val="single" w:color="BFC5CE" w:sz="4"/>
+            </w:tcBorders>
+            <w:tcMar>
+              <w:top w:type="dxa" w:w="70"/>
+              <w:left w:type="dxa" w:w="110"/>
+              <w:bottom w:type="dxa" w:w="70"/>
+              <w:right w:type="dxa" w:w="110"/>
+            </w:tcMar>
+            <w:vAlign w:val="top"/>
+          </w:tcPr>
+          <w:p>
+            <w:pPr>
+              <w:spacing w:after="40" w:line="252"/>
+            </w:pPr>
+            <w:r>
+              <w:rPr>
+                <w:rFonts w:ascii="Calibri" w:cs="Calibri" w:eastAsia="Calibri" w:hAnsi="Calibri"/>
+                <w:sz w:val="20"/>
+                <w:szCs w:val="20"/>
+              </w:rPr>
+              <w:t xml:space="preserve">Modo simples da postura passa a ter a análise automática dos graus, marcações sugeridas para confirmar, vídeo e ângulo pré-marcado nos movimentos (12 a 15 min).</w:t>
+            </w:r>
+          </w:p>
+        </w:tc>
+      </w:tr>
     </w:tbl>
     <w:p>
       <w:pPr>
@@ -7641,7 +7778,7 @@
                 <w:sz w:val="19"/>
                 <w:szCs w:val="19"/>
               </w:rPr>
-              <w:t xml:space="preserve">3 fotos, lista curta do que viu, agachamento e flexão de tronco</w:t>
+              <w:t xml:space="preserve">3 fotos com graus automáticos, marcações sugeridas, agachamento e flexão (foto ou vídeo)</w:t>
             </w:r>
           </w:p>
         </w:tc>
@@ -7676,7 +7813,7 @@
                 <w:sz w:val="19"/>
                 <w:szCs w:val="19"/>
               </w:rPr>
-              <w:t xml:space="preserve">10 a 12 min</w:t>
+              <w:t xml:space="preserve">12 a 15 min</w:t>
             </w:r>
           </w:p>
         </w:tc>
@@ -9157,7 +9294,7 @@
         <w:sz w:val="17"/>
         <w:szCs w:val="17"/>
       </w:rPr>
-      <w:t xml:space="preserve">POP-AVI-001 · Uso da Avaliação Integrada · v1.2</w:t>
+      <w:t xml:space="preserve">POP-AVI-001 · Uso da Avaliação Integrada · v1.3</w:t>
     </w:r>
   </w:p>
 </w:hdr>
@@ -9179,7 +9316,7 @@
         <w:sz w:val="17"/>
         <w:szCs w:val="17"/>
       </w:rPr>
-      <w:t xml:space="preserve">POP-AVI-001 · Uso da Avaliação Integrada · v1.2</w:t>
+      <w:t xml:space="preserve">POP-AVI-001 · Uso da Avaliação Integrada · v1.3</w:t>
     </w:r>
   </w:p>
 </w:hdr>

</xml_diff>

<commit_message>
Gravar o movimento direto no aplicativo: botao Gravar agora com camera ao vivo, contagem, limite de 30 s e tirar foto
- GravadorVideo: tela cheia com a camera (traseira por padrao, trocar camera), contagem de 5 s, cronometro, parada automatica aos 30 s e tirar foto; mensagens para camera negada, ausente ou em uso
- Gravacao entra no mesmo caminho do video enviado (analise no aparelho, quadro do ponto maximo, angulo pre-marcado, guarda ate 45 MB)
- videoPose: video WebM gravado pelo navegador vem sem duracao; tratado antes da analise
- gravacao.ts como funcoes puras com 32 verificacoes; todos os 24 testes OK; conferido com camera simulada; POP v1.4; docs 00 e 03

Co-Authored-By: Claude Sonnet 5.5 <noreply@anthropic.com>
</commit_message>
<xml_diff>
--- a/POP-Uso-da-Avaliacao-Integrada.docx
+++ b/POP-Uso-da-Avaliacao-Integrada.docx
@@ -243,7 +243,7 @@
                 <w:sz w:val="20"/>
                 <w:szCs w:val="20"/>
               </w:rPr>
-              <w:t xml:space="preserve">1.3</w:t>
+              <w:t xml:space="preserve">1.4</w:t>
             </w:r>
           </w:p>
         </w:tc>
@@ -3082,7 +3082,7 @@
           <w:sz w:val="22"/>
           <w:szCs w:val="22"/>
         </w:rPr>
-        <w:t xml:space="preserve">Se usar vídeo, filme como nos desenhos (5 a 30 segundos, câmera parada, corpo inteiro no quadro). O sistema diz se o vídeo foi adequado para leitura e mostra a margem de erro dos ângulos.</w:t>
+        <w:t xml:space="preserve">Se usar vídeo, toque em "Gravar agora": a câmera abre dentro do aplicativo (use a traseira, com o aparelho apoiado ou no tripé), há uma contagem de 5 segundos para o aluno se posicionar e a gravação para sozinha aos 30 segundos. Filme como nos desenhos (5 a 30 segundos, câmera parada, corpo inteiro no quadro). Também dá para "Tirar foto" na mesma tela ou enviar um vídeo já gravado. O sistema analisa no próprio aparelho, diz se o vídeo foi adequado para leitura e mostra a margem de erro dos ângulos. Na primeira vez, o navegador pede licença para usar a câmera: toque em permitir.</w:t>
       </w:r>
     </w:p>
     <w:p>
@@ -5871,6 +5871,105 @@
                 <w:szCs w:val="20"/>
               </w:rPr>
               <w:t xml:space="preserve">Modo simples da postura passa a ter a análise automática dos graus, marcações sugeridas para confirmar, vídeo e ângulo pré-marcado nos movimentos (12 a 15 min).</w:t>
+            </w:r>
+          </w:p>
+        </w:tc>
+      </w:tr>
+      <w:tr>
+        <w:trPr>
+          <w:cantSplit/>
+          <w:tblHeader w:val="off"/>
+        </w:trPr>
+        <w:tc>
+          <w:tcPr>
+            <w:tcW w:type="dxa" w:w="1300"/>
+            <w:tcBorders>
+              <w:top w:val="single" w:color="BFC5CE" w:sz="4"/>
+              <w:left w:val="single" w:color="BFC5CE" w:sz="4"/>
+              <w:bottom w:val="single" w:color="BFC5CE" w:sz="4"/>
+              <w:right w:val="single" w:color="BFC5CE" w:sz="4"/>
+            </w:tcBorders>
+            <w:tcMar>
+              <w:top w:type="dxa" w:w="70"/>
+              <w:left w:type="dxa" w:w="110"/>
+              <w:bottom w:type="dxa" w:w="70"/>
+              <w:right w:type="dxa" w:w="110"/>
+            </w:tcMar>
+            <w:vAlign w:val="top"/>
+          </w:tcPr>
+          <w:p>
+            <w:pPr>
+              <w:spacing w:after="40" w:line="252"/>
+            </w:pPr>
+            <w:r>
+              <w:rPr>
+                <w:rFonts w:ascii="Calibri" w:cs="Calibri" w:eastAsia="Calibri" w:hAnsi="Calibri"/>
+                <w:sz w:val="20"/>
+                <w:szCs w:val="20"/>
+              </w:rPr>
+              <w:t xml:space="preserve">1.4</w:t>
+            </w:r>
+          </w:p>
+        </w:tc>
+        <w:tc>
+          <w:tcPr>
+            <w:tcW w:type="dxa" w:w="2000"/>
+            <w:tcBorders>
+              <w:top w:val="single" w:color="BFC5CE" w:sz="4"/>
+              <w:left w:val="single" w:color="BFC5CE" w:sz="4"/>
+              <w:bottom w:val="single" w:color="BFC5CE" w:sz="4"/>
+              <w:right w:val="single" w:color="BFC5CE" w:sz="4"/>
+            </w:tcBorders>
+            <w:tcMar>
+              <w:top w:type="dxa" w:w="70"/>
+              <w:left w:type="dxa" w:w="110"/>
+              <w:bottom w:type="dxa" w:w="70"/>
+              <w:right w:type="dxa" w:w="110"/>
+            </w:tcMar>
+            <w:vAlign w:val="top"/>
+          </w:tcPr>
+          <w:p>
+            <w:pPr>
+              <w:spacing w:after="40" w:line="252"/>
+            </w:pPr>
+            <w:r>
+              <w:rPr>
+                <w:rFonts w:ascii="Calibri" w:cs="Calibri" w:eastAsia="Calibri" w:hAnsi="Calibri"/>
+                <w:sz w:val="20"/>
+                <w:szCs w:val="20"/>
+              </w:rPr>
+              <w:t xml:space="preserve">26/10/2026</w:t>
+            </w:r>
+          </w:p>
+        </w:tc>
+        <w:tc>
+          <w:tcPr>
+            <w:tcW w:type="dxa" w:w="6338"/>
+            <w:tcBorders>
+              <w:top w:val="single" w:color="BFC5CE" w:sz="4"/>
+              <w:left w:val="single" w:color="BFC5CE" w:sz="4"/>
+              <w:bottom w:val="single" w:color="BFC5CE" w:sz="4"/>
+              <w:right w:val="single" w:color="BFC5CE" w:sz="4"/>
+            </w:tcBorders>
+            <w:tcMar>
+              <w:top w:type="dxa" w:w="70"/>
+              <w:left w:type="dxa" w:w="110"/>
+              <w:bottom w:type="dxa" w:w="70"/>
+              <w:right w:type="dxa" w:w="110"/>
+            </w:tcMar>
+            <w:vAlign w:val="top"/>
+          </w:tcPr>
+          <w:p>
+            <w:pPr>
+              <w:spacing w:after="40" w:line="252"/>
+            </w:pPr>
+            <w:r>
+              <w:rPr>
+                <w:rFonts w:ascii="Calibri" w:cs="Calibri" w:eastAsia="Calibri" w:hAnsi="Calibri"/>
+                <w:sz w:val="20"/>
+                <w:szCs w:val="20"/>
+              </w:rPr>
+              <w:t xml:space="preserve">Gravação do movimento direto no aplicativo (botão Gravar agora, com contagem de 5 s, limite de 30 s e opção de tirar foto), além de enviar um vídeo já gravado.</w:t>
             </w:r>
           </w:p>
         </w:tc>
@@ -9294,7 +9393,7 @@
         <w:sz w:val="17"/>
         <w:szCs w:val="17"/>
       </w:rPr>
-      <w:t xml:space="preserve">POP-AVI-001 · Uso da Avaliação Integrada · v1.3</w:t>
+      <w:t xml:space="preserve">POP-AVI-001 · Uso da Avaliação Integrada · v1.4</w:t>
     </w:r>
   </w:p>
 </w:hdr>
@@ -9316,7 +9415,7 @@
         <w:sz w:val="17"/>
         <w:szCs w:val="17"/>
       </w:rPr>
-      <w:t xml:space="preserve">POP-AVI-001 · Uso da Avaliação Integrada · v1.3</w:t>
+      <w:t xml:space="preserve">POP-AVI-001 · Uso da Avaliação Integrada · v1.4</w:t>
     </w:r>
   </w:p>
 </w:hdr>

</xml_diff>

<commit_message>
Postura: foto por camera ou video curto, sugestoes do sistema nos movimentos e botao Tudo dentro do padrao
- Cada vista da postura ganha Camera: tira a foto no aplicativo ou grava video curto com o aluno parado; o sistema escolhe o melhor quadro (corpo inteiro, menos movimento) como foto
- Movimentos: sugestoes do sistema pelos pontos do corpo (amplitude do agachamento, joelho para dentro, desvio do tronco, joelhos que flexionam e maos acima dos joelhos na flexao, elevacao dos bracos), com selo sugerido, aceitar e aceitar todas; nada vale sem o ok
- Opcao Sem alteracoes (dentro do padrao) em cada vista de movimento e botao Tudo dentro do padrao: preenche so o que esta em branco, bloqueado com sugestoes pendentes; parecer com linha unica quando as tres vistas estao no padrao
- 41 verificacoes novas, todos os 25 testes OK; conferido na tela com banco simulado; POP v1.5; docs 00 e 03; P2 ampliada

Co-Authored-By: Claude Sonnet 5.5 <noreply@anthropic.com>
</commit_message>
<xml_diff>
--- a/POP-Uso-da-Avaliacao-Integrada.docx
+++ b/POP-Uso-da-Avaliacao-Integrada.docx
@@ -243,7 +243,7 @@
                 <w:sz w:val="20"/>
                 <w:szCs w:val="20"/>
               </w:rPr>
-              <w:t xml:space="preserve">1.4</w:t>
+              <w:t xml:space="preserve">1.5</w:t>
             </w:r>
           </w:p>
         </w:tc>
@@ -3006,7 +3006,7 @@
           <w:sz w:val="22"/>
           <w:szCs w:val="22"/>
         </w:rPr>
-        <w:t xml:space="preserve">Câmera no tripé, na altura aproximada do quadril, sempre na mesma distância (marque o ponto no chão com fita). Faça 3 fotos: de frente, de costas e de lado (lateral direita).</w:t>
+        <w:t xml:space="preserve">Câmera no tripé, na altura aproximada do quadril, sempre na mesma distância (marque o ponto no chão com fita). Faça 3 fotos: de frente, de costas e de lado (lateral direita). Em cada vista, toque em "Câmera" para fotografar dentro do aplicativo (com contagem de 5 segundos, se quiser) ou para gravar um vídeo curto com o aluno parado: o sistema escolhe sozinho o melhor quadro, com o corpo inteiro e menos movimento. Também dá para enviar uma foto já tirada.</w:t>
       </w:r>
     </w:p>
     <w:p>
@@ -3063,7 +3063,7 @@
           <w:sz w:val="22"/>
           <w:szCs w:val="22"/>
         </w:rPr>
-        <w:t xml:space="preserve">Movimentos: peça o agachamento e a flexão de tronco e registre o ponto máximo em foto ou em vídeo, de lado e de frente (ou de costas, na flexão). Ao enviar, o sistema pré-marca o ângulo na foto (por exemplo, o do joelho no agachamento): confirme com "Está certo, confirmar" ou refaça à mão. Enquanto não confirmar, a medida não entra no parecer. Marque o roteiro de cada vista e, na flexão, a distância dedos-chão.</w:t>
+        <w:t xml:space="preserve">Movimentos: peça o agachamento e a flexão de tronco e registre o ponto máximo em foto ou em vídeo, de lado e de frente (ou de costas, na flexão). Ao enviar ou gravar, o sistema pré-marca o ângulo na foto (por exemplo, o do joelho no agachamento) e sugere, em dourado, o que viu nos pontos do corpo (por exemplo, joelho para dentro no agachamento de frente, ou mãos que não passaram dos joelhos na flexão): aceite uma a uma ou use "Aceitar todas", e confirme o ângulo com "Está certo, confirmar" ou refaça à mão. Enquanto não confirmar, a medida não entra no parecer. Marque o roteiro de cada vista e, na flexão, a distância dedos-chão.</w:t>
       </w:r>
     </w:p>
     <w:p>
@@ -3083,6 +3083,25 @@
           <w:szCs w:val="22"/>
         </w:rPr>
         <w:t xml:space="preserve">Se usar vídeo, toque em "Gravar agora": a câmera abre dentro do aplicativo (use a traseira, com o aparelho apoiado ou no tripé), há uma contagem de 5 segundos para o aluno se posicionar e a gravação para sozinha aos 30 segundos. Filme como nos desenhos (5 a 30 segundos, câmera parada, corpo inteiro no quadro). Também dá para "Tirar foto" na mesma tela ou enviar um vídeo já gravado. O sistema analisa no próprio aparelho, diz se o vídeo foi adequado para leitura e mostra a margem de erro dos ângulos. Na primeira vez, o navegador pede licença para usar a câmera: toque em permitir.</w:t>
+      </w:r>
+    </w:p>
+    <w:p>
+      <w:pPr>
+        <w:pStyle w:val="ListParagraph"/>
+        <w:numPr>
+          <w:ilvl w:val="0"/>
+          <w:numId w:val="2"/>
+        </w:numPr>
+        <w:spacing w:after="60" w:line="264"/>
+      </w:pPr>
+      <w:r>
+        <w:rPr>
+          <w:rFonts w:ascii="Calibri" w:cs="Calibri" w:eastAsia="Calibri" w:hAnsi="Calibri"/>
+          <w:color w:val="1F2937"/>
+          <w:sz w:val="22"/>
+          <w:szCs w:val="22"/>
+        </w:rPr>
+        <w:t xml:space="preserve">Se você olhou tudo e nada ficou fora do padrão, use "Tudo dentro do padrão" (abaixo dos movimentos): ele marca "nada de relevante" nas três vistas e "dentro do padrão" nos dois movimentos, só onde ainda está em branco, e o parecer passa a dizer que a postura está dentro do padrão. O botão só libera depois que você decidir as sugestões do sistema. Qualquer marcação sua depois disso continua valendo.</w:t>
       </w:r>
     </w:p>
     <w:p>
@@ -5970,6 +5989,105 @@
                 <w:szCs w:val="20"/>
               </w:rPr>
               <w:t xml:space="preserve">Gravação do movimento direto no aplicativo (botão Gravar agora, com contagem de 5 s, limite de 30 s e opção de tirar foto), além de enviar um vídeo já gravado.</w:t>
+            </w:r>
+          </w:p>
+        </w:tc>
+      </w:tr>
+      <w:tr>
+        <w:trPr>
+          <w:cantSplit/>
+          <w:tblHeader w:val="off"/>
+        </w:trPr>
+        <w:tc>
+          <w:tcPr>
+            <w:tcW w:type="dxa" w:w="1300"/>
+            <w:tcBorders>
+              <w:top w:val="single" w:color="BFC5CE" w:sz="4"/>
+              <w:left w:val="single" w:color="BFC5CE" w:sz="4"/>
+              <w:bottom w:val="single" w:color="BFC5CE" w:sz="4"/>
+              <w:right w:val="single" w:color="BFC5CE" w:sz="4"/>
+            </w:tcBorders>
+            <w:tcMar>
+              <w:top w:type="dxa" w:w="70"/>
+              <w:left w:type="dxa" w:w="110"/>
+              <w:bottom w:type="dxa" w:w="70"/>
+              <w:right w:type="dxa" w:w="110"/>
+            </w:tcMar>
+            <w:vAlign w:val="top"/>
+          </w:tcPr>
+          <w:p>
+            <w:pPr>
+              <w:spacing w:after="40" w:line="252"/>
+            </w:pPr>
+            <w:r>
+              <w:rPr>
+                <w:rFonts w:ascii="Calibri" w:cs="Calibri" w:eastAsia="Calibri" w:hAnsi="Calibri"/>
+                <w:sz w:val="20"/>
+                <w:szCs w:val="20"/>
+              </w:rPr>
+              <w:t xml:space="preserve">1.5</w:t>
+            </w:r>
+          </w:p>
+        </w:tc>
+        <w:tc>
+          <w:tcPr>
+            <w:tcW w:type="dxa" w:w="2000"/>
+            <w:tcBorders>
+              <w:top w:val="single" w:color="BFC5CE" w:sz="4"/>
+              <w:left w:val="single" w:color="BFC5CE" w:sz="4"/>
+              <w:bottom w:val="single" w:color="BFC5CE" w:sz="4"/>
+              <w:right w:val="single" w:color="BFC5CE" w:sz="4"/>
+            </w:tcBorders>
+            <w:tcMar>
+              <w:top w:type="dxa" w:w="70"/>
+              <w:left w:type="dxa" w:w="110"/>
+              <w:bottom w:type="dxa" w:w="70"/>
+              <w:right w:type="dxa" w:w="110"/>
+            </w:tcMar>
+            <w:vAlign w:val="top"/>
+          </w:tcPr>
+          <w:p>
+            <w:pPr>
+              <w:spacing w:after="40" w:line="252"/>
+            </w:pPr>
+            <w:r>
+              <w:rPr>
+                <w:rFonts w:ascii="Calibri" w:cs="Calibri" w:eastAsia="Calibri" w:hAnsi="Calibri"/>
+                <w:sz w:val="20"/>
+                <w:szCs w:val="20"/>
+              </w:rPr>
+              <w:t xml:space="preserve">26/10/2026</w:t>
+            </w:r>
+          </w:p>
+        </w:tc>
+        <w:tc>
+          <w:tcPr>
+            <w:tcW w:type="dxa" w:w="6338"/>
+            <w:tcBorders>
+              <w:top w:val="single" w:color="BFC5CE" w:sz="4"/>
+              <w:left w:val="single" w:color="BFC5CE" w:sz="4"/>
+              <w:bottom w:val="single" w:color="BFC5CE" w:sz="4"/>
+              <w:right w:val="single" w:color="BFC5CE" w:sz="4"/>
+            </w:tcBorders>
+            <w:tcMar>
+              <w:top w:type="dxa" w:w="70"/>
+              <w:left w:type="dxa" w:w="110"/>
+              <w:bottom w:type="dxa" w:w="70"/>
+              <w:right w:type="dxa" w:w="110"/>
+            </w:tcMar>
+            <w:vAlign w:val="top"/>
+          </w:tcPr>
+          <w:p>
+            <w:pPr>
+              <w:spacing w:after="40" w:line="252"/>
+            </w:pPr>
+            <w:r>
+              <w:rPr>
+                <w:rFonts w:ascii="Calibri" w:cs="Calibri" w:eastAsia="Calibri" w:hAnsi="Calibri"/>
+                <w:sz w:val="20"/>
+                <w:szCs w:val="20"/>
+              </w:rPr>
+              <w:t xml:space="preserve">Fotos da postura pela câmera do aplicativo ou por vídeo curto (melhor quadro escolhido pelo sistema); sugestões do sistema também nos movimentos; botão Tudo dentro do padrão.</w:t>
             </w:r>
           </w:p>
         </w:tc>
@@ -9393,7 +9511,7 @@
         <w:sz w:val="17"/>
         <w:szCs w:val="17"/>
       </w:rPr>
-      <w:t xml:space="preserve">POP-AVI-001 · Uso da Avaliação Integrada · v1.4</w:t>
+      <w:t xml:space="preserve">POP-AVI-001 · Uso da Avaliação Integrada · v1.5</w:t>
     </w:r>
   </w:p>
 </w:hdr>
@@ -9415,7 +9533,7 @@
         <w:sz w:val="17"/>
         <w:szCs w:val="17"/>
       </w:rPr>
-      <w:t xml:space="preserve">POP-AVI-001 · Uso da Avaliação Integrada · v1.4</w:t>
+      <w:t xml:space="preserve">POP-AVI-001 · Uso da Avaliação Integrada · v1.5</w:t>
     </w:r>
   </w:p>
 </w:hdr>

</xml_diff>

<commit_message>
Plano: servicos da clinica por quadro (areas da fisioterapia, por onde comecar, o que cada profissao faz) sem prescrever exercicio
- Servicos = psicologia, medicina chinesa, fisioterapia e areas, musculacao e Pilates; RPG vira area da fisioterapia e massoterapia deixa de ser sugerida
- Areas da fisioterapia (ortopedica, coluna e postura, geriatrica e quedas, neurofuncional, cardiorrespiratoria, pelvica), Comecar agora / Entra depois, em que ajuda neste quadro e quem atua
- Dor alta e humor alterado: fisioterapia e psicologia primeiro; musculacao como apoio com referencia conferida (Noetel, BMJ 2024, PMID 38355154); MTC sem referencia inventada
- Etapas sem frequencia, carga ou intensidade; sugestoes ainda nao decididas sao atualizadas ao sugerir de novo
- 31 verificacoes novas, 28 testes OK; docs 06 e POP v1.6

Co-Authored-By: Claude Sonnet 5.5 <noreply@anthropic.com>
</commit_message>
<xml_diff>
--- a/POP-Uso-da-Avaliacao-Integrada.docx
+++ b/POP-Uso-da-Avaliacao-Integrada.docx
@@ -243,7 +243,7 @@
                 <w:sz w:val="20"/>
                 <w:szCs w:val="20"/>
               </w:rPr>
-              <w:t xml:space="preserve">1.5</w:t>
+              <w:t xml:space="preserve">1.6</w:t>
             </w:r>
           </w:p>
         </w:tc>
@@ -4136,6 +4136,25 @@
           <w:sz w:val="22"/>
           <w:szCs w:val="22"/>
         </w:rPr>
+        <w:t xml:space="preserve">No quadro "Serviços da clínica", o sistema indica quais serviços combinam com o quadro atual (psicologia, medicina chinesa, fisioterapia e suas áreas, musculação e Pilates), por onde começar ("Começar agora" ou "Entra depois"), em que cada serviço ajuda neste caso e o que a profissão faz (abra "Quem atua e o que faz"). Na fisioterapia aparecem as áreas indicadas (ortopédica, coluna e postura, geriátrica e prevenção de quedas, neurofuncional, cardiorrespiratória e pélvica). O sistema não indica o exercício (tipo, carga ou frequência): isso é do profissional de cada serviço. Aprove só o que fizer sentido para o aluno e confirme na avaliação o que o sistema leu do texto da anamnese.</w:t>
+      </w:r>
+    </w:p>
+    <w:p>
+      <w:pPr>
+        <w:pStyle w:val="ListParagraph"/>
+        <w:numPr>
+          <w:ilvl w:val="0"/>
+          <w:numId w:val="2"/>
+        </w:numPr>
+        <w:spacing w:after="60" w:line="264"/>
+      </w:pPr>
+      <w:r>
+        <w:rPr>
+          <w:rFonts w:ascii="Calibri" w:cs="Calibri" w:eastAsia="Calibri" w:hAnsi="Calibri"/>
+          <w:color w:val="1F2937"/>
+          <w:sz w:val="22"/>
+          <w:szCs w:val="22"/>
+        </w:rPr>
         <w:t xml:space="preserve">Antes de aprovar, releia o quadro "Para o treino": o plano precisa caber no tempo disponível, considerar o que atrapalha o aluno, a dor e as lesões, e partir da experiência de treino que ele já tem.</w:t>
       </w:r>
     </w:p>
@@ -6088,6 +6107,105 @@
                 <w:szCs w:val="20"/>
               </w:rPr>
               <w:t xml:space="preserve">Fotos da postura pela câmera do aplicativo ou por vídeo curto (melhor quadro escolhido pelo sistema); sugestões do sistema também nos movimentos; botão Tudo dentro do padrão.</w:t>
+            </w:r>
+          </w:p>
+        </w:tc>
+      </w:tr>
+      <w:tr>
+        <w:trPr>
+          <w:cantSplit/>
+          <w:tblHeader w:val="off"/>
+        </w:trPr>
+        <w:tc>
+          <w:tcPr>
+            <w:tcW w:type="dxa" w:w="1300"/>
+            <w:tcBorders>
+              <w:top w:val="single" w:color="BFC5CE" w:sz="4"/>
+              <w:left w:val="single" w:color="BFC5CE" w:sz="4"/>
+              <w:bottom w:val="single" w:color="BFC5CE" w:sz="4"/>
+              <w:right w:val="single" w:color="BFC5CE" w:sz="4"/>
+            </w:tcBorders>
+            <w:tcMar>
+              <w:top w:type="dxa" w:w="70"/>
+              <w:left w:type="dxa" w:w="110"/>
+              <w:bottom w:type="dxa" w:w="70"/>
+              <w:right w:type="dxa" w:w="110"/>
+            </w:tcMar>
+            <w:vAlign w:val="top"/>
+          </w:tcPr>
+          <w:p>
+            <w:pPr>
+              <w:spacing w:after="40" w:line="252"/>
+            </w:pPr>
+            <w:r>
+              <w:rPr>
+                <w:rFonts w:ascii="Calibri" w:cs="Calibri" w:eastAsia="Calibri" w:hAnsi="Calibri"/>
+                <w:sz w:val="20"/>
+                <w:szCs w:val="20"/>
+              </w:rPr>
+              <w:t xml:space="preserve">1.6</w:t>
+            </w:r>
+          </w:p>
+        </w:tc>
+        <w:tc>
+          <w:tcPr>
+            <w:tcW w:type="dxa" w:w="2000"/>
+            <w:tcBorders>
+              <w:top w:val="single" w:color="BFC5CE" w:sz="4"/>
+              <w:left w:val="single" w:color="BFC5CE" w:sz="4"/>
+              <w:bottom w:val="single" w:color="BFC5CE" w:sz="4"/>
+              <w:right w:val="single" w:color="BFC5CE" w:sz="4"/>
+            </w:tcBorders>
+            <w:tcMar>
+              <w:top w:type="dxa" w:w="70"/>
+              <w:left w:type="dxa" w:w="110"/>
+              <w:bottom w:type="dxa" w:w="70"/>
+              <w:right w:type="dxa" w:w="110"/>
+            </w:tcMar>
+            <w:vAlign w:val="top"/>
+          </w:tcPr>
+          <w:p>
+            <w:pPr>
+              <w:spacing w:after="40" w:line="252"/>
+            </w:pPr>
+            <w:r>
+              <w:rPr>
+                <w:rFonts w:ascii="Calibri" w:cs="Calibri" w:eastAsia="Calibri" w:hAnsi="Calibri"/>
+                <w:sz w:val="20"/>
+                <w:szCs w:val="20"/>
+              </w:rPr>
+              <w:t xml:space="preserve">30/10/2026</w:t>
+            </w:r>
+          </w:p>
+        </w:tc>
+        <w:tc>
+          <w:tcPr>
+            <w:tcW w:type="dxa" w:w="6338"/>
+            <w:tcBorders>
+              <w:top w:val="single" w:color="BFC5CE" w:sz="4"/>
+              <w:left w:val="single" w:color="BFC5CE" w:sz="4"/>
+              <w:bottom w:val="single" w:color="BFC5CE" w:sz="4"/>
+              <w:right w:val="single" w:color="BFC5CE" w:sz="4"/>
+            </w:tcBorders>
+            <w:tcMar>
+              <w:top w:type="dxa" w:w="70"/>
+              <w:left w:type="dxa" w:w="110"/>
+              <w:bottom w:type="dxa" w:w="70"/>
+              <w:right w:type="dxa" w:w="110"/>
+            </w:tcMar>
+            <w:vAlign w:val="top"/>
+          </w:tcPr>
+          <w:p>
+            <w:pPr>
+              <w:spacing w:after="40" w:line="252"/>
+            </w:pPr>
+            <w:r>
+              <w:rPr>
+                <w:rFonts w:ascii="Calibri" w:cs="Calibri" w:eastAsia="Calibri" w:hAnsi="Calibri"/>
+                <w:sz w:val="20"/>
+                <w:szCs w:val="20"/>
+              </w:rPr>
+              <w:t xml:space="preserve">Plano de ação: serviços da clínica com as áreas da fisioterapia, por onde começar e o que cada profissão faz e em que ajuda neste caso; sem prescrição de exercício.</w:t>
             </w:r>
           </w:p>
         </w:tc>
@@ -9511,7 +9629,7 @@
         <w:sz w:val="17"/>
         <w:szCs w:val="17"/>
       </w:rPr>
-      <w:t xml:space="preserve">POP-AVI-001 · Uso da Avaliação Integrada · v1.5</w:t>
+      <w:t xml:space="preserve">POP-AVI-001 · Uso da Avaliação Integrada · v1.6</w:t>
     </w:r>
   </w:p>
 </w:hdr>
@@ -9533,7 +9651,7 @@
         <w:sz w:val="17"/>
         <w:szCs w:val="17"/>
       </w:rPr>
-      <w:t xml:space="preserve">POP-AVI-001 · Uso da Avaliação Integrada · v1.5</w:t>
+      <w:t xml:space="preserve">POP-AVI-001 · Uso da Avaliação Integrada · v1.6</w:t>
     </w:r>
   </w:p>
 </w:hdr>

</xml_diff>

<commit_message>
Plano provisorio com poucos dados: faixa na aba Plano, pendencias acionaveis, servico de partida e item na supervisao da Nina
- Plano gerado mesmo com poucos dados e marcado como provisorio, com o que coletar e em que aba (por dominio sem dado)
- Item de pendencias acompanha os dados (atualiza ou some se ainda a revisar; decidido nao muda)
- Sem achado, so a musculacao entra como opcao de partida (OMS); psicologia, fisioterapia e MTC so com achado
- Supervisao da Nina ganha o item Plano de intervencao e mantem cobertura e dominios sem dado; relatorio tecnico avisa plano provisorio
- 22 verificacoes novas, 28 testes OK; doc 06 e POP v1.7

Co-Authored-By: Claude Sonnet 5.5 <noreply@anthropic.com>
</commit_message>
<xml_diff>
--- a/POP-Uso-da-Avaliacao-Integrada.docx
+++ b/POP-Uso-da-Avaliacao-Integrada.docx
@@ -243,7 +243,7 @@
                 <w:sz w:val="20"/>
                 <w:szCs w:val="20"/>
               </w:rPr>
-              <w:t xml:space="preserve">1.6</w:t>
+              <w:t xml:space="preserve">1.7</w:t>
             </w:r>
           </w:p>
         </w:tc>
@@ -4155,6 +4155,25 @@
           <w:sz w:val="22"/>
           <w:szCs w:val="22"/>
         </w:rPr>
+        <w:t xml:space="preserve">Mesmo com poucos dados, o plano pode ser gerado: ele aparece como "Plano provisório", com a lista do que coletar e em que aba, e continua sendo atualizado quando você clica de novo em "Sugerir a partir dos resultados" (o que você já decidiu não muda). A Dra. Nina continua mostrando as lacunas na Supervisão. Sem achado que o justifique, o sistema não sugere psicologia, fisioterapia nem medicina chinesa; só a musculação aparece como opção de partida.</w:t>
+      </w:r>
+    </w:p>
+    <w:p>
+      <w:pPr>
+        <w:pStyle w:val="ListParagraph"/>
+        <w:numPr>
+          <w:ilvl w:val="0"/>
+          <w:numId w:val="2"/>
+        </w:numPr>
+        <w:spacing w:after="60" w:line="264"/>
+      </w:pPr>
+      <w:r>
+        <w:rPr>
+          <w:rFonts w:ascii="Calibri" w:cs="Calibri" w:eastAsia="Calibri" w:hAnsi="Calibri"/>
+          <w:color w:val="1F2937"/>
+          <w:sz w:val="22"/>
+          <w:szCs w:val="22"/>
+        </w:rPr>
         <w:t xml:space="preserve">Antes de aprovar, releia o quadro "Para o treino": o plano precisa caber no tempo disponível, considerar o que atrapalha o aluno, a dor e as lesões, e partir da experiência de treino que ele já tem.</w:t>
       </w:r>
     </w:p>
@@ -6206,6 +6225,105 @@
                 <w:szCs w:val="20"/>
               </w:rPr>
               <w:t xml:space="preserve">Plano de ação: serviços da clínica com as áreas da fisioterapia, por onde começar e o que cada profissão faz e em que ajuda neste caso; sem prescrição de exercício.</w:t>
+            </w:r>
+          </w:p>
+        </w:tc>
+      </w:tr>
+      <w:tr>
+        <w:trPr>
+          <w:cantSplit/>
+          <w:tblHeader w:val="off"/>
+        </w:trPr>
+        <w:tc>
+          <w:tcPr>
+            <w:tcW w:type="dxa" w:w="1300"/>
+            <w:tcBorders>
+              <w:top w:val="single" w:color="BFC5CE" w:sz="4"/>
+              <w:left w:val="single" w:color="BFC5CE" w:sz="4"/>
+              <w:bottom w:val="single" w:color="BFC5CE" w:sz="4"/>
+              <w:right w:val="single" w:color="BFC5CE" w:sz="4"/>
+            </w:tcBorders>
+            <w:tcMar>
+              <w:top w:type="dxa" w:w="70"/>
+              <w:left w:type="dxa" w:w="110"/>
+              <w:bottom w:type="dxa" w:w="70"/>
+              <w:right w:type="dxa" w:w="110"/>
+            </w:tcMar>
+            <w:vAlign w:val="top"/>
+          </w:tcPr>
+          <w:p>
+            <w:pPr>
+              <w:spacing w:after="40" w:line="252"/>
+            </w:pPr>
+            <w:r>
+              <w:rPr>
+                <w:rFonts w:ascii="Calibri" w:cs="Calibri" w:eastAsia="Calibri" w:hAnsi="Calibri"/>
+                <w:sz w:val="20"/>
+                <w:szCs w:val="20"/>
+              </w:rPr>
+              <w:t xml:space="preserve">1.7</w:t>
+            </w:r>
+          </w:p>
+        </w:tc>
+        <w:tc>
+          <w:tcPr>
+            <w:tcW w:type="dxa" w:w="2000"/>
+            <w:tcBorders>
+              <w:top w:val="single" w:color="BFC5CE" w:sz="4"/>
+              <w:left w:val="single" w:color="BFC5CE" w:sz="4"/>
+              <w:bottom w:val="single" w:color="BFC5CE" w:sz="4"/>
+              <w:right w:val="single" w:color="BFC5CE" w:sz="4"/>
+            </w:tcBorders>
+            <w:tcMar>
+              <w:top w:type="dxa" w:w="70"/>
+              <w:left w:type="dxa" w:w="110"/>
+              <w:bottom w:type="dxa" w:w="70"/>
+              <w:right w:type="dxa" w:w="110"/>
+            </w:tcMar>
+            <w:vAlign w:val="top"/>
+          </w:tcPr>
+          <w:p>
+            <w:pPr>
+              <w:spacing w:after="40" w:line="252"/>
+            </w:pPr>
+            <w:r>
+              <w:rPr>
+                <w:rFonts w:ascii="Calibri" w:cs="Calibri" w:eastAsia="Calibri" w:hAnsi="Calibri"/>
+                <w:sz w:val="20"/>
+                <w:szCs w:val="20"/>
+              </w:rPr>
+              <w:t xml:space="preserve">30/10/2026</w:t>
+            </w:r>
+          </w:p>
+        </w:tc>
+        <w:tc>
+          <w:tcPr>
+            <w:tcW w:type="dxa" w:w="6338"/>
+            <w:tcBorders>
+              <w:top w:val="single" w:color="BFC5CE" w:sz="4"/>
+              <w:left w:val="single" w:color="BFC5CE" w:sz="4"/>
+              <w:bottom w:val="single" w:color="BFC5CE" w:sz="4"/>
+              <w:right w:val="single" w:color="BFC5CE" w:sz="4"/>
+            </w:tcBorders>
+            <w:tcMar>
+              <w:top w:type="dxa" w:w="70"/>
+              <w:left w:type="dxa" w:w="110"/>
+              <w:bottom w:type="dxa" w:w="70"/>
+              <w:right w:type="dxa" w:w="110"/>
+            </w:tcMar>
+            <w:vAlign w:val="top"/>
+          </w:tcPr>
+          <w:p>
+            <w:pPr>
+              <w:spacing w:after="40" w:line="252"/>
+            </w:pPr>
+            <w:r>
+              <w:rPr>
+                <w:rFonts w:ascii="Calibri" w:cs="Calibri" w:eastAsia="Calibri" w:hAnsi="Calibri"/>
+                <w:sz w:val="20"/>
+                <w:szCs w:val="20"/>
+              </w:rPr>
+              <w:t xml:space="preserve">Plano de ação gerado mesmo com poucos dados (plano provisório, com o que coletar e onde); a supervisão da Dra. Nina continua mostrando as lacunas.</w:t>
             </w:r>
           </w:p>
         </w:tc>
@@ -9629,7 +9747,7 @@
         <w:sz w:val="17"/>
         <w:szCs w:val="17"/>
       </w:rPr>
-      <w:t xml:space="preserve">POP-AVI-001 · Uso da Avaliação Integrada · v1.6</w:t>
+      <w:t xml:space="preserve">POP-AVI-001 · Uso da Avaliação Integrada · v1.7</w:t>
     </w:r>
   </w:p>
 </w:hdr>
@@ -9651,7 +9769,7 @@
         <w:sz w:val="17"/>
         <w:szCs w:val="17"/>
       </w:rPr>
-      <w:t xml:space="preserve">POP-AVI-001 · Uso da Avaliação Integrada · v1.6</w:t>
+      <w:t xml:space="preserve">POP-AVI-001 · Uso da Avaliação Integrada · v1.7</w:t>
     </w:r>
   </w:p>
 </w:hdr>

</xml_diff>

<commit_message>
Plano provisorio: fisioterapia, medicina chinesa e musculacao consciente como ponto de partida; Recovery fica de fora
- Com poucos dados, os tres servicos entram como opcionais, comecar agora e provisorios; fisioterapia e MTC sem evidencia inventada
- Psicologia e Pilates continuam so com achado; servico Musculacao passa a se chamar Musculacao consciente
- 6 verificacoes novas, 28 testes OK; doc 06 e POP v1.8

Co-Authored-By: Claude Sonnet 5.5 <noreply@anthropic.com>
</commit_message>
<xml_diff>
--- a/POP-Uso-da-Avaliacao-Integrada.docx
+++ b/POP-Uso-da-Avaliacao-Integrada.docx
@@ -243,7 +243,7 @@
                 <w:sz w:val="20"/>
                 <w:szCs w:val="20"/>
               </w:rPr>
-              <w:t xml:space="preserve">1.7</w:t>
+              <w:t xml:space="preserve">1.8</w:t>
             </w:r>
           </w:p>
         </w:tc>
@@ -4155,7 +4155,7 @@
           <w:sz w:val="22"/>
           <w:szCs w:val="22"/>
         </w:rPr>
-        <w:t xml:space="preserve">Mesmo com poucos dados, o plano pode ser gerado: ele aparece como "Plano provisório", com a lista do que coletar e em que aba, e continua sendo atualizado quando você clica de novo em "Sugerir a partir dos resultados" (o que você já decidiu não muda). A Dra. Nina continua mostrando as lacunas na Supervisão. Sem achado que o justifique, o sistema não sugere psicologia, fisioterapia nem medicina chinesa; só a musculação aparece como opção de partida.</w:t>
+        <w:t xml:space="preserve">Mesmo com poucos dados, o plano pode ser gerado: ele aparece como "Plano provisório", com a lista do que coletar e em que aba, e continua sendo atualizado quando você clica de novo em "Sugerir a partir dos resultados" (o que você já decidiu não muda). A Dra. Nina continua mostrando as lacunas na Supervisão. Sem achado específico, o plano provisório traz como ponto de partida, sempre opcionais, a fisioterapia (avaliação inicial), a medicina chinesa (apoio, se o aluno quiser) e a musculação consciente; psicologia e Pilates só aparecem quando há achado que as justifique.</w:t>
       </w:r>
     </w:p>
     <w:p>
@@ -6324,6 +6324,105 @@
                 <w:szCs w:val="20"/>
               </w:rPr>
               <w:t xml:space="preserve">Plano de ação gerado mesmo com poucos dados (plano provisório, com o que coletar e onde); a supervisão da Dra. Nina continua mostrando as lacunas.</w:t>
+            </w:r>
+          </w:p>
+        </w:tc>
+      </w:tr>
+      <w:tr>
+        <w:trPr>
+          <w:cantSplit/>
+          <w:tblHeader w:val="off"/>
+        </w:trPr>
+        <w:tc>
+          <w:tcPr>
+            <w:tcW w:type="dxa" w:w="1300"/>
+            <w:tcBorders>
+              <w:top w:val="single" w:color="BFC5CE" w:sz="4"/>
+              <w:left w:val="single" w:color="BFC5CE" w:sz="4"/>
+              <w:bottom w:val="single" w:color="BFC5CE" w:sz="4"/>
+              <w:right w:val="single" w:color="BFC5CE" w:sz="4"/>
+            </w:tcBorders>
+            <w:tcMar>
+              <w:top w:type="dxa" w:w="70"/>
+              <w:left w:type="dxa" w:w="110"/>
+              <w:bottom w:type="dxa" w:w="70"/>
+              <w:right w:type="dxa" w:w="110"/>
+            </w:tcMar>
+            <w:vAlign w:val="top"/>
+          </w:tcPr>
+          <w:p>
+            <w:pPr>
+              <w:spacing w:after="40" w:line="252"/>
+            </w:pPr>
+            <w:r>
+              <w:rPr>
+                <w:rFonts w:ascii="Calibri" w:cs="Calibri" w:eastAsia="Calibri" w:hAnsi="Calibri"/>
+                <w:sz w:val="20"/>
+                <w:szCs w:val="20"/>
+              </w:rPr>
+              <w:t xml:space="preserve">1.8</w:t>
+            </w:r>
+          </w:p>
+        </w:tc>
+        <w:tc>
+          <w:tcPr>
+            <w:tcW w:type="dxa" w:w="2000"/>
+            <w:tcBorders>
+              <w:top w:val="single" w:color="BFC5CE" w:sz="4"/>
+              <w:left w:val="single" w:color="BFC5CE" w:sz="4"/>
+              <w:bottom w:val="single" w:color="BFC5CE" w:sz="4"/>
+              <w:right w:val="single" w:color="BFC5CE" w:sz="4"/>
+            </w:tcBorders>
+            <w:tcMar>
+              <w:top w:type="dxa" w:w="70"/>
+              <w:left w:type="dxa" w:w="110"/>
+              <w:bottom w:type="dxa" w:w="70"/>
+              <w:right w:type="dxa" w:w="110"/>
+            </w:tcMar>
+            <w:vAlign w:val="top"/>
+          </w:tcPr>
+          <w:p>
+            <w:pPr>
+              <w:spacing w:after="40" w:line="252"/>
+            </w:pPr>
+            <w:r>
+              <w:rPr>
+                <w:rFonts w:ascii="Calibri" w:cs="Calibri" w:eastAsia="Calibri" w:hAnsi="Calibri"/>
+                <w:sz w:val="20"/>
+                <w:szCs w:val="20"/>
+              </w:rPr>
+              <w:t xml:space="preserve">31/10/2026</w:t>
+            </w:r>
+          </w:p>
+        </w:tc>
+        <w:tc>
+          <w:tcPr>
+            <w:tcW w:type="dxa" w:w="6338"/>
+            <w:tcBorders>
+              <w:top w:val="single" w:color="BFC5CE" w:sz="4"/>
+              <w:left w:val="single" w:color="BFC5CE" w:sz="4"/>
+              <w:bottom w:val="single" w:color="BFC5CE" w:sz="4"/>
+              <w:right w:val="single" w:color="BFC5CE" w:sz="4"/>
+            </w:tcBorders>
+            <w:tcMar>
+              <w:top w:type="dxa" w:w="70"/>
+              <w:left w:type="dxa" w:w="110"/>
+              <w:bottom w:type="dxa" w:w="70"/>
+              <w:right w:type="dxa" w:w="110"/>
+            </w:tcMar>
+            <w:vAlign w:val="top"/>
+          </w:tcPr>
+          <w:p>
+            <w:pPr>
+              <w:spacing w:after="40" w:line="252"/>
+            </w:pPr>
+            <w:r>
+              <w:rPr>
+                <w:rFonts w:ascii="Calibri" w:cs="Calibri" w:eastAsia="Calibri" w:hAnsi="Calibri"/>
+                <w:sz w:val="20"/>
+                <w:szCs w:val="20"/>
+              </w:rPr>
+              <w:t xml:space="preserve">Plano provisório com fisioterapia, medicina chinesa e musculação consciente como ponto de partida; serviço Musculação passa a se chamar Musculação consciente; Recovery ainda não incluído.</w:t>
             </w:r>
           </w:p>
         </w:tc>
@@ -9747,7 +9846,7 @@
         <w:sz w:val="17"/>
         <w:szCs w:val="17"/>
       </w:rPr>
-      <w:t xml:space="preserve">POP-AVI-001 · Uso da Avaliação Integrada · v1.7</w:t>
+      <w:t xml:space="preserve">POP-AVI-001 · Uso da Avaliação Integrada · v1.8</w:t>
     </w:r>
   </w:p>
 </w:hdr>
@@ -9769,7 +9868,7 @@
         <w:sz w:val="17"/>
         <w:szCs w:val="17"/>
       </w:rPr>
-      <w:t xml:space="preserve">POP-AVI-001 · Uso da Avaliação Integrada · v1.7</w:t>
+      <w:t xml:space="preserve">POP-AVI-001 · Uso da Avaliação Integrada · v1.8</w:t>
     </w:r>
   </w:p>
 </w:hdr>

</xml_diff>

<commit_message>
Pilates tambem com dor nas costas (dorsal) e alteracao postural; musculacao consciente = musculacao com protecao articular
- Pilates entra com dor dorsal e com alteracoes posturais marcadas (sem puxar com nada de relevante); segue opcional
- Musculacao consciente descrita como musculacao comum com protecao das articulacoes; com dor ou lesao articular o cartao cita o motivo
- 9 verificacoes novas, 28 testes OK; doc 06 e POP v1.9

Co-Authored-By: Claude Sonnet 5.5 <noreply@anthropic.com>
</commit_message>
<xml_diff>
--- a/POP-Uso-da-Avaliacao-Integrada.docx
+++ b/POP-Uso-da-Avaliacao-Integrada.docx
@@ -243,7 +243,7 @@
                 <w:sz w:val="20"/>
                 <w:szCs w:val="20"/>
               </w:rPr>
-              <w:t xml:space="preserve">1.8</w:t>
+              <w:t xml:space="preserve">1.9</w:t>
             </w:r>
           </w:p>
         </w:tc>
@@ -4155,7 +4155,7 @@
           <w:sz w:val="22"/>
           <w:szCs w:val="22"/>
         </w:rPr>
-        <w:t xml:space="preserve">Mesmo com poucos dados, o plano pode ser gerado: ele aparece como "Plano provisório", com a lista do que coletar e em que aba, e continua sendo atualizado quando você clica de novo em "Sugerir a partir dos resultados" (o que você já decidiu não muda). A Dra. Nina continua mostrando as lacunas na Supervisão. Sem achado específico, o plano provisório traz como ponto de partida, sempre opcionais, a fisioterapia (avaliação inicial), a medicina chinesa (apoio, se o aluno quiser) e a musculação consciente; psicologia e Pilates só aparecem quando há achado que as justifique.</w:t>
+        <w:t xml:space="preserve">Mesmo com poucos dados, o plano pode ser gerado: ele aparece como "Plano provisório", com a lista do que coletar e em que aba, e continua sendo atualizado quando você clica de novo em "Sugerir a partir dos resultados" (o que você já decidiu não muda). A Dra. Nina continua mostrando as lacunas na Supervisão. Sem achado específico, o plano provisório traz como ponto de partida, sempre opcionais, a fisioterapia (avaliação inicial), a medicina chinesa (apoio, se o aluno quiser) e a musculação consciente (musculação comum com proteção das articulações); psicologia e Pilates só aparecem quando há achado que as justifique (o Pilates, por exemplo, com dor lombar, dor nas costas ou alteração postural marcada).</w:t>
       </w:r>
     </w:p>
     <w:p>
@@ -6423,6 +6423,105 @@
                 <w:szCs w:val="20"/>
               </w:rPr>
               <w:t xml:space="preserve">Plano provisório com fisioterapia, medicina chinesa e musculação consciente como ponto de partida; serviço Musculação passa a se chamar Musculação consciente; Recovery ainda não incluído.</w:t>
+            </w:r>
+          </w:p>
+        </w:tc>
+      </w:tr>
+      <w:tr>
+        <w:trPr>
+          <w:cantSplit/>
+          <w:tblHeader w:val="off"/>
+        </w:trPr>
+        <w:tc>
+          <w:tcPr>
+            <w:tcW w:type="dxa" w:w="1300"/>
+            <w:tcBorders>
+              <w:top w:val="single" w:color="BFC5CE" w:sz="4"/>
+              <w:left w:val="single" w:color="BFC5CE" w:sz="4"/>
+              <w:bottom w:val="single" w:color="BFC5CE" w:sz="4"/>
+              <w:right w:val="single" w:color="BFC5CE" w:sz="4"/>
+            </w:tcBorders>
+            <w:tcMar>
+              <w:top w:type="dxa" w:w="70"/>
+              <w:left w:type="dxa" w:w="110"/>
+              <w:bottom w:type="dxa" w:w="70"/>
+              <w:right w:type="dxa" w:w="110"/>
+            </w:tcMar>
+            <w:vAlign w:val="top"/>
+          </w:tcPr>
+          <w:p>
+            <w:pPr>
+              <w:spacing w:after="40" w:line="252"/>
+            </w:pPr>
+            <w:r>
+              <w:rPr>
+                <w:rFonts w:ascii="Calibri" w:cs="Calibri" w:eastAsia="Calibri" w:hAnsi="Calibri"/>
+                <w:sz w:val="20"/>
+                <w:szCs w:val="20"/>
+              </w:rPr>
+              <w:t xml:space="preserve">1.9</w:t>
+            </w:r>
+          </w:p>
+        </w:tc>
+        <w:tc>
+          <w:tcPr>
+            <w:tcW w:type="dxa" w:w="2000"/>
+            <w:tcBorders>
+              <w:top w:val="single" w:color="BFC5CE" w:sz="4"/>
+              <w:left w:val="single" w:color="BFC5CE" w:sz="4"/>
+              <w:bottom w:val="single" w:color="BFC5CE" w:sz="4"/>
+              <w:right w:val="single" w:color="BFC5CE" w:sz="4"/>
+            </w:tcBorders>
+            <w:tcMar>
+              <w:top w:type="dxa" w:w="70"/>
+              <w:left w:type="dxa" w:w="110"/>
+              <w:bottom w:type="dxa" w:w="70"/>
+              <w:right w:type="dxa" w:w="110"/>
+            </w:tcMar>
+            <w:vAlign w:val="top"/>
+          </w:tcPr>
+          <w:p>
+            <w:pPr>
+              <w:spacing w:after="40" w:line="252"/>
+            </w:pPr>
+            <w:r>
+              <w:rPr>
+                <w:rFonts w:ascii="Calibri" w:cs="Calibri" w:eastAsia="Calibri" w:hAnsi="Calibri"/>
+                <w:sz w:val="20"/>
+                <w:szCs w:val="20"/>
+              </w:rPr>
+              <w:t xml:space="preserve">31/10/2026</w:t>
+            </w:r>
+          </w:p>
+        </w:tc>
+        <w:tc>
+          <w:tcPr>
+            <w:tcW w:type="dxa" w:w="6338"/>
+            <w:tcBorders>
+              <w:top w:val="single" w:color="BFC5CE" w:sz="4"/>
+              <w:left w:val="single" w:color="BFC5CE" w:sz="4"/>
+              <w:bottom w:val="single" w:color="BFC5CE" w:sz="4"/>
+              <w:right w:val="single" w:color="BFC5CE" w:sz="4"/>
+            </w:tcBorders>
+            <w:tcMar>
+              <w:top w:type="dxa" w:w="70"/>
+              <w:left w:type="dxa" w:w="110"/>
+              <w:bottom w:type="dxa" w:w="70"/>
+              <w:right w:type="dxa" w:w="110"/>
+            </w:tcMar>
+            <w:vAlign w:val="top"/>
+          </w:tcPr>
+          <w:p>
+            <w:pPr>
+              <w:spacing w:after="40" w:line="252"/>
+            </w:pPr>
+            <w:r>
+              <w:rPr>
+                <w:rFonts w:ascii="Calibri" w:cs="Calibri" w:eastAsia="Calibri" w:hAnsi="Calibri"/>
+                <w:sz w:val="20"/>
+                <w:szCs w:val="20"/>
+              </w:rPr>
+              <w:t xml:space="preserve">Pilates também com dor nas costas (dorsal) e alteração postural marcada; musculação consciente definida como musculação comum com proteção articular.</w:t>
             </w:r>
           </w:p>
         </w:tc>
@@ -9846,7 +9945,7 @@
         <w:sz w:val="17"/>
         <w:szCs w:val="17"/>
       </w:rPr>
-      <w:t xml:space="preserve">POP-AVI-001 · Uso da Avaliação Integrada · v1.8</w:t>
+      <w:t xml:space="preserve">POP-AVI-001 · Uso da Avaliação Integrada · v1.9</w:t>
     </w:r>
   </w:p>
 </w:hdr>
@@ -9868,7 +9967,7 @@
         <w:sz w:val="17"/>
         <w:szCs w:val="17"/>
       </w:rPr>
-      <w:t xml:space="preserve">POP-AVI-001 · Uso da Avaliação Integrada · v1.8</w:t>
+      <w:t xml:space="preserve">POP-AVI-001 · Uso da Avaliação Integrada · v1.9</w:t>
     </w:r>
   </w:p>
 </w:hdr>

</xml_diff>

<commit_message>
Carencia muscular com a formula do profissional e alvo escolhido (inicio do saudavel ao fim do ideal)
- calcularCarenciaMuscular: ((% massa magra ideal - % encontrada) x massa magra kg) / 100; zero quando ja esta no alvo
- Novo campo % de massa magra ideal (alvo) com atalhos nos limites da tabela (homens 81, 87, 92; mulheres 77, 83, 88); em branco usa o inicio do ideal
- Tela mostra a conta aberta e os kg ate cada limite; parecer e relatorio tecnico usam o novo valor
- 28 verificacoes novas, 28 testes OK; doc 02 e POP v2.0

Co-Authored-By: Claude Sonnet 5.5 <noreply@anthropic.com>
</commit_message>
<xml_diff>
--- a/POP-Uso-da-Avaliacao-Integrada.docx
+++ b/POP-Uso-da-Avaliacao-Integrada.docx
@@ -243,7 +243,7 @@
                 <w:sz w:val="20"/>
                 <w:szCs w:val="20"/>
               </w:rPr>
-              <w:t xml:space="preserve">1.9</w:t>
+              <w:t xml:space="preserve">2.0</w:t>
             </w:r>
           </w:p>
         </w:tc>
@@ -2924,7 +2924,7 @@
           <w:sz w:val="22"/>
           <w:szCs w:val="22"/>
         </w:rPr>
-        <w:t xml:space="preserve">O sistema calcula %G, gordura excedente, massa magra e a meta de recomposição muscular.</w:t>
+        <w:t xml:space="preserve">O sistema calcula %G, gordura excedente, massa magra e a carência muscular (quanto falta de massa magra para o alvo). O alvo é a % de massa magra ideal que você digitar; há atalhos para o início do saudável, o início do ideal e o fim do ideal da tabela, e a tela mostra quantos kg faltam até cada um.</w:t>
       </w:r>
     </w:p>
     <w:p>
@@ -6522,6 +6522,105 @@
                 <w:szCs w:val="20"/>
               </w:rPr>
               <w:t xml:space="preserve">Pilates também com dor nas costas (dorsal) e alteração postural marcada; musculação consciente definida como musculação comum com proteção articular.</w:t>
+            </w:r>
+          </w:p>
+        </w:tc>
+      </w:tr>
+      <w:tr>
+        <w:trPr>
+          <w:cantSplit/>
+          <w:tblHeader w:val="off"/>
+        </w:trPr>
+        <w:tc>
+          <w:tcPr>
+            <w:tcW w:type="dxa" w:w="1300"/>
+            <w:tcBorders>
+              <w:top w:val="single" w:color="BFC5CE" w:sz="4"/>
+              <w:left w:val="single" w:color="BFC5CE" w:sz="4"/>
+              <w:bottom w:val="single" w:color="BFC5CE" w:sz="4"/>
+              <w:right w:val="single" w:color="BFC5CE" w:sz="4"/>
+            </w:tcBorders>
+            <w:tcMar>
+              <w:top w:type="dxa" w:w="70"/>
+              <w:left w:type="dxa" w:w="110"/>
+              <w:bottom w:type="dxa" w:w="70"/>
+              <w:right w:type="dxa" w:w="110"/>
+            </w:tcMar>
+            <w:vAlign w:val="top"/>
+          </w:tcPr>
+          <w:p>
+            <w:pPr>
+              <w:spacing w:after="40" w:line="252"/>
+            </w:pPr>
+            <w:r>
+              <w:rPr>
+                <w:rFonts w:ascii="Calibri" w:cs="Calibri" w:eastAsia="Calibri" w:hAnsi="Calibri"/>
+                <w:sz w:val="20"/>
+                <w:szCs w:val="20"/>
+              </w:rPr>
+              <w:t xml:space="preserve">2.0</w:t>
+            </w:r>
+          </w:p>
+        </w:tc>
+        <w:tc>
+          <w:tcPr>
+            <w:tcW w:type="dxa" w:w="2000"/>
+            <w:tcBorders>
+              <w:top w:val="single" w:color="BFC5CE" w:sz="4"/>
+              <w:left w:val="single" w:color="BFC5CE" w:sz="4"/>
+              <w:bottom w:val="single" w:color="BFC5CE" w:sz="4"/>
+              <w:right w:val="single" w:color="BFC5CE" w:sz="4"/>
+            </w:tcBorders>
+            <w:tcMar>
+              <w:top w:type="dxa" w:w="70"/>
+              <w:left w:type="dxa" w:w="110"/>
+              <w:bottom w:type="dxa" w:w="70"/>
+              <w:right w:type="dxa" w:w="110"/>
+            </w:tcMar>
+            <w:vAlign w:val="top"/>
+          </w:tcPr>
+          <w:p>
+            <w:pPr>
+              <w:spacing w:after="40" w:line="252"/>
+            </w:pPr>
+            <w:r>
+              <w:rPr>
+                <w:rFonts w:ascii="Calibri" w:cs="Calibri" w:eastAsia="Calibri" w:hAnsi="Calibri"/>
+                <w:sz w:val="20"/>
+                <w:szCs w:val="20"/>
+              </w:rPr>
+              <w:t xml:space="preserve">31/10/2026</w:t>
+            </w:r>
+          </w:p>
+        </w:tc>
+        <w:tc>
+          <w:tcPr>
+            <w:tcW w:type="dxa" w:w="6338"/>
+            <w:tcBorders>
+              <w:top w:val="single" w:color="BFC5CE" w:sz="4"/>
+              <w:left w:val="single" w:color="BFC5CE" w:sz="4"/>
+              <w:bottom w:val="single" w:color="BFC5CE" w:sz="4"/>
+              <w:right w:val="single" w:color="BFC5CE" w:sz="4"/>
+            </w:tcBorders>
+            <w:tcMar>
+              <w:top w:type="dxa" w:w="70"/>
+              <w:left w:type="dxa" w:w="110"/>
+              <w:bottom w:type="dxa" w:w="70"/>
+              <w:right w:type="dxa" w:w="110"/>
+            </w:tcMar>
+            <w:vAlign w:val="top"/>
+          </w:tcPr>
+          <w:p>
+            <w:pPr>
+              <w:spacing w:after="40" w:line="252"/>
+            </w:pPr>
+            <w:r>
+              <w:rPr>
+                <w:rFonts w:ascii="Calibri" w:cs="Calibri" w:eastAsia="Calibri" w:hAnsi="Calibri"/>
+                <w:sz w:val="20"/>
+                <w:szCs w:val="20"/>
+              </w:rPr>
+              <w:t xml:space="preserve">Carência muscular com a fórmula do profissional: ((% de massa magra ideal - % encontrada) x massa magra em kg) / 100.</w:t>
             </w:r>
           </w:p>
         </w:tc>
@@ -9945,7 +10044,7 @@
         <w:sz w:val="17"/>
         <w:szCs w:val="17"/>
       </w:rPr>
-      <w:t xml:space="preserve">POP-AVI-001 · Uso da Avaliação Integrada · v1.9</w:t>
+      <w:t xml:space="preserve">POP-AVI-001 · Uso da Avaliação Integrada · v2.0</w:t>
     </w:r>
   </w:p>
 </w:hdr>
@@ -9967,7 +10066,7 @@
         <w:sz w:val="17"/>
         <w:szCs w:val="17"/>
       </w:rPr>
-      <w:t xml:space="preserve">POP-AVI-001 · Uso da Avaliação Integrada · v1.9</w:t>
+      <w:t xml:space="preserve">POP-AVI-001 · Uso da Avaliação Integrada · v2.0</w:t>
     </w:r>
   </w:p>
 </w:hdr>

</xml_diff>

<commit_message>
POP v2.1: alvo de massa magra no relatorio do aluno (corrige gerador)
Co-Authored-By: Claude Sonnet 5.5 <noreply@anthropic.com>
</commit_message>
<xml_diff>
--- a/POP-Uso-da-Avaliacao-Integrada.docx
+++ b/POP-Uso-da-Avaliacao-Integrada.docx
@@ -243,7 +243,7 @@
                 <w:sz w:val="20"/>
                 <w:szCs w:val="20"/>
               </w:rPr>
-              <w:t xml:space="preserve">2.0</w:t>
+              <w:t xml:space="preserve">2.1</w:t>
             </w:r>
           </w:p>
         </w:tc>
@@ -4313,7 +4313,7 @@
           <w:sz w:val="22"/>
           <w:szCs w:val="22"/>
         </w:rPr>
-        <w:t xml:space="preserve">Faça a devolutiva conversando: como a pessoa está hoje, o que vamos fazer e o próximo passo. Combine a data de início.</w:t>
+        <w:t xml:space="preserve">Se você registrou o alvo de massa magra na aba Física, ele aparece para o aluno em linguagem simples (na versão para o paciente e nos slides), sem o termo técnico "carência". Faça a devolutiva conversando: como a pessoa está hoje, o que vamos fazer e o próximo passo. Combine a data de início.</w:t>
       </w:r>
     </w:p>
     <w:p>
@@ -6621,6 +6621,105 @@
                 <w:szCs w:val="20"/>
               </w:rPr>
               <w:t xml:space="preserve">Carência muscular com a fórmula do profissional: ((% de massa magra ideal - % encontrada) x massa magra em kg) / 100.</w:t>
+            </w:r>
+          </w:p>
+        </w:tc>
+      </w:tr>
+      <w:tr>
+        <w:trPr>
+          <w:cantSplit/>
+          <w:tblHeader w:val="off"/>
+        </w:trPr>
+        <w:tc>
+          <w:tcPr>
+            <w:tcW w:type="dxa" w:w="1300"/>
+            <w:tcBorders>
+              <w:top w:val="single" w:color="BFC5CE" w:sz="4"/>
+              <w:left w:val="single" w:color="BFC5CE" w:sz="4"/>
+              <w:bottom w:val="single" w:color="BFC5CE" w:sz="4"/>
+              <w:right w:val="single" w:color="BFC5CE" w:sz="4"/>
+            </w:tcBorders>
+            <w:tcMar>
+              <w:top w:type="dxa" w:w="70"/>
+              <w:left w:type="dxa" w:w="110"/>
+              <w:bottom w:type="dxa" w:w="70"/>
+              <w:right w:type="dxa" w:w="110"/>
+            </w:tcMar>
+            <w:vAlign w:val="top"/>
+          </w:tcPr>
+          <w:p>
+            <w:pPr>
+              <w:spacing w:after="40" w:line="252"/>
+            </w:pPr>
+            <w:r>
+              <w:rPr>
+                <w:rFonts w:ascii="Calibri" w:cs="Calibri" w:eastAsia="Calibri" w:hAnsi="Calibri"/>
+                <w:sz w:val="20"/>
+                <w:szCs w:val="20"/>
+              </w:rPr>
+              <w:t xml:space="preserve">2.1</w:t>
+            </w:r>
+          </w:p>
+        </w:tc>
+        <w:tc>
+          <w:tcPr>
+            <w:tcW w:type="dxa" w:w="2000"/>
+            <w:tcBorders>
+              <w:top w:val="single" w:color="BFC5CE" w:sz="4"/>
+              <w:left w:val="single" w:color="BFC5CE" w:sz="4"/>
+              <w:bottom w:val="single" w:color="BFC5CE" w:sz="4"/>
+              <w:right w:val="single" w:color="BFC5CE" w:sz="4"/>
+            </w:tcBorders>
+            <w:tcMar>
+              <w:top w:type="dxa" w:w="70"/>
+              <w:left w:type="dxa" w:w="110"/>
+              <w:bottom w:type="dxa" w:w="70"/>
+              <w:right w:type="dxa" w:w="110"/>
+            </w:tcMar>
+            <w:vAlign w:val="top"/>
+          </w:tcPr>
+          <w:p>
+            <w:pPr>
+              <w:spacing w:after="40" w:line="252"/>
+            </w:pPr>
+            <w:r>
+              <w:rPr>
+                <w:rFonts w:ascii="Calibri" w:cs="Calibri" w:eastAsia="Calibri" w:hAnsi="Calibri"/>
+                <w:sz w:val="20"/>
+                <w:szCs w:val="20"/>
+              </w:rPr>
+              <w:t xml:space="preserve">31/10/2026</w:t>
+            </w:r>
+          </w:p>
+        </w:tc>
+        <w:tc>
+          <w:tcPr>
+            <w:tcW w:type="dxa" w:w="6338"/>
+            <w:tcBorders>
+              <w:top w:val="single" w:color="BFC5CE" w:sz="4"/>
+              <w:left w:val="single" w:color="BFC5CE" w:sz="4"/>
+              <w:bottom w:val="single" w:color="BFC5CE" w:sz="4"/>
+              <w:right w:val="single" w:color="BFC5CE" w:sz="4"/>
+            </w:tcBorders>
+            <w:tcMar>
+              <w:top w:type="dxa" w:w="70"/>
+              <w:left w:type="dxa" w:w="110"/>
+              <w:bottom w:type="dxa" w:w="70"/>
+              <w:right w:type="dxa" w:w="110"/>
+            </w:tcMar>
+            <w:vAlign w:val="top"/>
+          </w:tcPr>
+          <w:p>
+            <w:pPr>
+              <w:spacing w:after="40" w:line="252"/>
+            </w:pPr>
+            <w:r>
+              <w:rPr>
+                <w:rFonts w:ascii="Calibri" w:cs="Calibri" w:eastAsia="Calibri" w:hAnsi="Calibri"/>
+                <w:sz w:val="20"/>
+                <w:szCs w:val="20"/>
+              </w:rPr>
+              <w:t xml:space="preserve">Alvo de massa magra registrado para o aluno (versão para o paciente e slides), em linguagem simples.</w:t>
             </w:r>
           </w:p>
         </w:tc>
@@ -10044,7 +10143,7 @@
         <w:sz w:val="17"/>
         <w:szCs w:val="17"/>
       </w:rPr>
-      <w:t xml:space="preserve">POP-AVI-001 · Uso da Avaliação Integrada · v2.0</w:t>
+      <w:t xml:space="preserve">POP-AVI-001 · Uso da Avaliação Integrada · v2.1</w:t>
     </w:r>
   </w:p>
 </w:hdr>
@@ -10066,7 +10165,7 @@
         <w:sz w:val="17"/>
         <w:szCs w:val="17"/>
       </w:rPr>
-      <w:t xml:space="preserve">POP-AVI-001 · Uso da Avaliação Integrada · v2.0</w:t>
+      <w:t xml:space="preserve">POP-AVI-001 · Uso da Avaliação Integrada · v2.1</w:t>
     </w:r>
   </w:p>
 </w:hdr>

</xml_diff>